<commit_message>
Agregacion y actualiza archivos de documentación
Incorporacion de nuevos archivos y realiza modificaciones en la documentación, recursos visuales y README del proyecto VitalMind AI.
</commit_message>
<xml_diff>
--- a/docs/11-tiempo/Gestion_Tiempo_VitalMindAI.docx
+++ b/docs/11-tiempo/Gestion_Tiempo_VitalMindAI.docx
@@ -2,25 +2,403 @@
 <file path=word/document.xml><?xml version="1.0" encoding="utf-8"?>
 <w:document xmlns:wpc="http://schemas.microsoft.com/office/word/2010/wordprocessingCanvas" xmlns:mo="http://schemas.microsoft.com/office/mac/office/2008/main" xmlns:mc="http://schemas.openxmlformats.org/markup-compatibility/2006" xmlns:mv="urn:schemas-microsoft-com:mac:vml" xmlns:o="urn:schemas-microsoft-com:office:office" xmlns:r="http://schemas.openxmlformats.org/officeDocument/2006/relationships" xmlns:m="http://schemas.openxmlformats.org/officeDocument/2006/math" xmlns:v="urn:schemas-microsoft-com:vml" xmlns:wp14="http://schemas.microsoft.com/office/word/2010/wordprocessingDrawing" xmlns:wp="http://schemas.openxmlformats.org/drawingml/2006/wordprocessingDrawing" xmlns:w10="urn:schemas-microsoft-com:office:word" xmlns:w="http://schemas.openxmlformats.org/wordprocessingml/2006/main" xmlns:w14="http://schemas.microsoft.com/office/word/2010/wordml" xmlns:wpg="http://schemas.microsoft.com/office/word/2010/wordprocessingGroup" xmlns:wpi="http://schemas.microsoft.com/office/word/2010/wordprocessingInk" xmlns:wne="http://schemas.microsoft.com/office/word/2006/wordml" xmlns:wps="http://schemas.microsoft.com/office/word/2010/wordprocessingShape" mc:Ignorable="w14 wp14">
   <w:body>
+    <w:tbl>
+      <w:tblPr>
+        <w:tblW w:type="auto" w:w="0"/>
+        <w:jc w:val="center"/>
+        <w:tblLayout w:type="fixed"/>
+        <w:tblLook w:firstColumn="1" w:firstRow="1" w:lastColumn="0" w:lastRow="0" w:noHBand="0" w:noVBand="1" w:val="04A0"/>
+      </w:tblPr>
+      <w:tblGrid>
+        <w:gridCol w:w="4706"/>
+        <w:gridCol w:w="4706"/>
+      </w:tblGrid>
+      <w:tr>
+        <w:tc>
+          <w:tcPr>
+            <w:tcW w:type="dxa" w:w="4706"/>
+            <w:tcBorders>
+              <w:top w:val="single" w:sz="0" w:space="0" w:color="FFFFFF"/>
+              <w:left w:val="single" w:sz="0" w:space="0" w:color="FFFFFF"/>
+              <w:bottom w:val="single" w:sz="0" w:space="0" w:color="FFFFFF"/>
+              <w:right w:val="single" w:sz="0" w:space="0" w:color="FFFFFF"/>
+              <w:insideH w:val="single" w:sz="0" w:space="0" w:color="FFFFFF"/>
+              <w:insideV w:val="single" w:sz="0" w:space="0" w:color="FFFFFF"/>
+            </w:tcBorders>
+          </w:tcPr>
+          <w:p>
+            <w:pPr>
+              <w:jc w:val="left"/>
+            </w:pPr>
+            <w:r/>
+          </w:p>
+        </w:tc>
+        <w:tc>
+          <w:tcPr>
+            <w:tcW w:type="dxa" w:w="4706"/>
+            <w:tcBorders>
+              <w:top w:val="single" w:sz="0" w:space="0" w:color="FFFFFF"/>
+              <w:left w:val="single" w:sz="0" w:space="0" w:color="FFFFFF"/>
+              <w:bottom w:val="single" w:sz="0" w:space="0" w:color="FFFFFF"/>
+              <w:right w:val="single" w:sz="0" w:space="0" w:color="FFFFFF"/>
+              <w:insideH w:val="single" w:sz="0" w:space="0" w:color="FFFFFF"/>
+              <w:insideV w:val="single" w:sz="0" w:space="0" w:color="FFFFFF"/>
+            </w:tcBorders>
+          </w:tcPr>
+          <w:p>
+            <w:pPr>
+              <w:jc w:val="right"/>
+            </w:pPr>
+            <w:r/>
+          </w:p>
+        </w:tc>
+      </w:tr>
+    </w:tbl>
     <w:p>
       <w:pPr>
-        <w:pStyle w:val="Title"/>
         <w:jc w:val="center"/>
       </w:pPr>
       <w:r>
         <w:rPr>
+          <w:rFonts w:ascii="Arial" w:hAnsi="Arial" w:eastAsia="Arial"/>
           <w:b/>
+          <w:color w:val="0B1F5E"/>
+          <w:sz w:val="44"/>
         </w:rPr>
-        <w:t>Gestión del Tiempo - VitalMind AI</w:t>
+        <w:t>Gestión del tiempo - VitalMind AI</w:t>
+      </w:r>
+    </w:p>
+    <w:p>
+      <w:pPr>
+        <w:jc w:val="center"/>
+      </w:pPr>
+      <w:r>
+        <w:rPr>
+          <w:rFonts w:ascii="Arial" w:hAnsi="Arial" w:eastAsia="Arial"/>
+          <w:color w:val="5B6472"/>
+          <w:sz w:val="22"/>
+        </w:rPr>
+        <w:t>Cronograma académico mayo-agosto de 2026</w:t>
+      </w:r>
+    </w:p>
+    <w:p>
+      <w:pPr>
+        <w:jc w:val="center"/>
+      </w:pPr>
+      <w:r>
+        <w:rPr>
+          <w:rFonts w:ascii="Arial" w:hAnsi="Arial" w:eastAsia="Arial"/>
+          <w:i/>
+          <w:color w:val="1746A2"/>
+          <w:sz w:val="20"/>
+        </w:rPr>
+        <w:t>Proyecto universitario de Ingeniería en Desarrollo y Gestión de Software</w:t>
       </w:r>
     </w:p>
     <w:p/>
+    <w:tbl>
+      <w:tblPr>
+        <w:tblW w:type="auto" w:w="0"/>
+        <w:jc w:val="center"/>
+        <w:tblLayout w:type="fixed"/>
+        <w:tblLook w:firstColumn="1" w:firstRow="1" w:lastColumn="0" w:lastRow="0" w:noHBand="0" w:noVBand="1" w:val="04A0"/>
+      </w:tblPr>
+      <w:tblGrid>
+        <w:gridCol w:w="4706"/>
+        <w:gridCol w:w="4706"/>
+      </w:tblGrid>
+      <w:tr>
+        <w:tc>
+          <w:tcPr>
+            <w:tcW w:type="dxa" w:w="4706"/>
+            <w:shd w:fill="EEF3FA"/>
+            <w:tcBorders>
+              <w:top w:val="single" w:sz="4" w:space="0" w:color="CBD5E1"/>
+              <w:left w:val="single" w:sz="4" w:space="0" w:color="CBD5E1"/>
+              <w:bottom w:val="single" w:sz="4" w:space="0" w:color="CBD5E1"/>
+              <w:right w:val="single" w:sz="4" w:space="0" w:color="CBD5E1"/>
+              <w:insideH w:val="single" w:sz="4" w:space="0" w:color="CBD5E1"/>
+              <w:insideV w:val="single" w:sz="4" w:space="0" w:color="CBD5E1"/>
+            </w:tcBorders>
+            <w:vAlign w:val="center"/>
+          </w:tcPr>
+          <w:p>
+            <w:r>
+              <w:rPr>
+                <w:rFonts w:ascii="Arial" w:hAnsi="Arial" w:eastAsia="Arial"/>
+                <w:b/>
+                <w:color w:val="0B1F5E"/>
+                <w:sz w:val="18"/>
+              </w:rPr>
+              <w:t>Universidad</w:t>
+            </w:r>
+          </w:p>
+        </w:tc>
+        <w:tc>
+          <w:tcPr>
+            <w:tcW w:type="dxa" w:w="4706"/>
+            <w:tcBorders>
+              <w:top w:val="single" w:sz="4" w:space="0" w:color="CBD5E1"/>
+              <w:left w:val="single" w:sz="4" w:space="0" w:color="CBD5E1"/>
+              <w:bottom w:val="single" w:sz="4" w:space="0" w:color="CBD5E1"/>
+              <w:right w:val="single" w:sz="4" w:space="0" w:color="CBD5E1"/>
+              <w:insideH w:val="single" w:sz="4" w:space="0" w:color="CBD5E1"/>
+              <w:insideV w:val="single" w:sz="4" w:space="0" w:color="CBD5E1"/>
+            </w:tcBorders>
+            <w:vAlign w:val="center"/>
+          </w:tcPr>
+          <w:p>
+            <w:r>
+              <w:rPr>
+                <w:rFonts w:ascii="Arial" w:hAnsi="Arial" w:eastAsia="Arial"/>
+                <w:b w:val="0"/>
+                <w:color w:val="172033"/>
+                <w:sz w:val="18"/>
+              </w:rPr>
+              <w:t>Universidad Tecnológica de Xicotepec de Juárez</w:t>
+            </w:r>
+          </w:p>
+        </w:tc>
+      </w:tr>
+      <w:tr>
+        <w:tc>
+          <w:tcPr>
+            <w:tcW w:type="dxa" w:w="4706"/>
+            <w:shd w:fill="EEF3FA"/>
+            <w:tcBorders>
+              <w:top w:val="single" w:sz="4" w:space="0" w:color="CBD5E1"/>
+              <w:left w:val="single" w:sz="4" w:space="0" w:color="CBD5E1"/>
+              <w:bottom w:val="single" w:sz="4" w:space="0" w:color="CBD5E1"/>
+              <w:right w:val="single" w:sz="4" w:space="0" w:color="CBD5E1"/>
+              <w:insideH w:val="single" w:sz="4" w:space="0" w:color="CBD5E1"/>
+              <w:insideV w:val="single" w:sz="4" w:space="0" w:color="CBD5E1"/>
+            </w:tcBorders>
+            <w:vAlign w:val="center"/>
+          </w:tcPr>
+          <w:p>
+            <w:r>
+              <w:rPr>
+                <w:rFonts w:ascii="Arial" w:hAnsi="Arial" w:eastAsia="Arial"/>
+                <w:b/>
+                <w:color w:val="0B1F5E"/>
+                <w:sz w:val="18"/>
+              </w:rPr>
+              <w:t>Carrera</w:t>
+            </w:r>
+          </w:p>
+        </w:tc>
+        <w:tc>
+          <w:tcPr>
+            <w:tcW w:type="dxa" w:w="4706"/>
+            <w:tcBorders>
+              <w:top w:val="single" w:sz="4" w:space="0" w:color="CBD5E1"/>
+              <w:left w:val="single" w:sz="4" w:space="0" w:color="CBD5E1"/>
+              <w:bottom w:val="single" w:sz="4" w:space="0" w:color="CBD5E1"/>
+              <w:right w:val="single" w:sz="4" w:space="0" w:color="CBD5E1"/>
+              <w:insideH w:val="single" w:sz="4" w:space="0" w:color="CBD5E1"/>
+              <w:insideV w:val="single" w:sz="4" w:space="0" w:color="CBD5E1"/>
+            </w:tcBorders>
+            <w:vAlign w:val="center"/>
+          </w:tcPr>
+          <w:p>
+            <w:r>
+              <w:rPr>
+                <w:rFonts w:ascii="Arial" w:hAnsi="Arial" w:eastAsia="Arial"/>
+                <w:b w:val="0"/>
+                <w:color w:val="172033"/>
+                <w:sz w:val="18"/>
+              </w:rPr>
+              <w:t>Ingeniería en Desarrollo y Gestión de Software</w:t>
+            </w:r>
+          </w:p>
+        </w:tc>
+      </w:tr>
+      <w:tr>
+        <w:tc>
+          <w:tcPr>
+            <w:tcW w:type="dxa" w:w="4706"/>
+            <w:shd w:fill="EEF3FA"/>
+            <w:tcBorders>
+              <w:top w:val="single" w:sz="4" w:space="0" w:color="CBD5E1"/>
+              <w:left w:val="single" w:sz="4" w:space="0" w:color="CBD5E1"/>
+              <w:bottom w:val="single" w:sz="4" w:space="0" w:color="CBD5E1"/>
+              <w:right w:val="single" w:sz="4" w:space="0" w:color="CBD5E1"/>
+              <w:insideH w:val="single" w:sz="4" w:space="0" w:color="CBD5E1"/>
+              <w:insideV w:val="single" w:sz="4" w:space="0" w:color="CBD5E1"/>
+            </w:tcBorders>
+            <w:vAlign w:val="center"/>
+          </w:tcPr>
+          <w:p>
+            <w:r>
+              <w:rPr>
+                <w:rFonts w:ascii="Arial" w:hAnsi="Arial" w:eastAsia="Arial"/>
+                <w:b/>
+                <w:color w:val="0B1F5E"/>
+                <w:sz w:val="18"/>
+              </w:rPr>
+              <w:t>Grupo</w:t>
+            </w:r>
+          </w:p>
+        </w:tc>
+        <w:tc>
+          <w:tcPr>
+            <w:tcW w:type="dxa" w:w="4706"/>
+            <w:tcBorders>
+              <w:top w:val="single" w:sz="4" w:space="0" w:color="CBD5E1"/>
+              <w:left w:val="single" w:sz="4" w:space="0" w:color="CBD5E1"/>
+              <w:bottom w:val="single" w:sz="4" w:space="0" w:color="CBD5E1"/>
+              <w:right w:val="single" w:sz="4" w:space="0" w:color="CBD5E1"/>
+              <w:insideH w:val="single" w:sz="4" w:space="0" w:color="CBD5E1"/>
+              <w:insideV w:val="single" w:sz="4" w:space="0" w:color="CBD5E1"/>
+            </w:tcBorders>
+            <w:vAlign w:val="center"/>
+          </w:tcPr>
+          <w:p>
+            <w:r>
+              <w:rPr>
+                <w:rFonts w:ascii="Arial" w:hAnsi="Arial" w:eastAsia="Arial"/>
+                <w:b w:val="0"/>
+                <w:color w:val="172033"/>
+                <w:sz w:val="18"/>
+              </w:rPr>
+              <w:t>7A</w:t>
+            </w:r>
+          </w:p>
+        </w:tc>
+      </w:tr>
+      <w:tr>
+        <w:tc>
+          <w:tcPr>
+            <w:tcW w:type="dxa" w:w="4706"/>
+            <w:shd w:fill="EEF3FA"/>
+            <w:tcBorders>
+              <w:top w:val="single" w:sz="4" w:space="0" w:color="CBD5E1"/>
+              <w:left w:val="single" w:sz="4" w:space="0" w:color="CBD5E1"/>
+              <w:bottom w:val="single" w:sz="4" w:space="0" w:color="CBD5E1"/>
+              <w:right w:val="single" w:sz="4" w:space="0" w:color="CBD5E1"/>
+              <w:insideH w:val="single" w:sz="4" w:space="0" w:color="CBD5E1"/>
+              <w:insideV w:val="single" w:sz="4" w:space="0" w:color="CBD5E1"/>
+            </w:tcBorders>
+            <w:vAlign w:val="center"/>
+          </w:tcPr>
+          <w:p>
+            <w:r>
+              <w:rPr>
+                <w:rFonts w:ascii="Arial" w:hAnsi="Arial" w:eastAsia="Arial"/>
+                <w:b/>
+                <w:color w:val="0B1F5E"/>
+                <w:sz w:val="18"/>
+              </w:rPr>
+              <w:t>Periodo</w:t>
+            </w:r>
+          </w:p>
+        </w:tc>
+        <w:tc>
+          <w:tcPr>
+            <w:tcW w:type="dxa" w:w="4706"/>
+            <w:tcBorders>
+              <w:top w:val="single" w:sz="4" w:space="0" w:color="CBD5E1"/>
+              <w:left w:val="single" w:sz="4" w:space="0" w:color="CBD5E1"/>
+              <w:bottom w:val="single" w:sz="4" w:space="0" w:color="CBD5E1"/>
+              <w:right w:val="single" w:sz="4" w:space="0" w:color="CBD5E1"/>
+              <w:insideH w:val="single" w:sz="4" w:space="0" w:color="CBD5E1"/>
+              <w:insideV w:val="single" w:sz="4" w:space="0" w:color="CBD5E1"/>
+            </w:tcBorders>
+            <w:vAlign w:val="center"/>
+          </w:tcPr>
+          <w:p>
+            <w:r>
+              <w:rPr>
+                <w:rFonts w:ascii="Arial" w:hAnsi="Arial" w:eastAsia="Arial"/>
+                <w:b w:val="0"/>
+                <w:color w:val="172033"/>
+                <w:sz w:val="18"/>
+              </w:rPr>
+              <w:t>mayo-agosto de 2026</w:t>
+            </w:r>
+          </w:p>
+        </w:tc>
+      </w:tr>
+      <w:tr>
+        <w:tc>
+          <w:tcPr>
+            <w:tcW w:type="dxa" w:w="4706"/>
+            <w:shd w:fill="EEF3FA"/>
+            <w:tcBorders>
+              <w:top w:val="single" w:sz="4" w:space="0" w:color="CBD5E1"/>
+              <w:left w:val="single" w:sz="4" w:space="0" w:color="CBD5E1"/>
+              <w:bottom w:val="single" w:sz="4" w:space="0" w:color="CBD5E1"/>
+              <w:right w:val="single" w:sz="4" w:space="0" w:color="CBD5E1"/>
+              <w:insideH w:val="single" w:sz="4" w:space="0" w:color="CBD5E1"/>
+              <w:insideV w:val="single" w:sz="4" w:space="0" w:color="CBD5E1"/>
+            </w:tcBorders>
+            <w:vAlign w:val="center"/>
+          </w:tcPr>
+          <w:p>
+            <w:r>
+              <w:rPr>
+                <w:rFonts w:ascii="Arial" w:hAnsi="Arial" w:eastAsia="Arial"/>
+                <w:b/>
+                <w:color w:val="0B1F5E"/>
+                <w:sz w:val="18"/>
+              </w:rPr>
+              <w:t>Docente</w:t>
+            </w:r>
+          </w:p>
+        </w:tc>
+        <w:tc>
+          <w:tcPr>
+            <w:tcW w:type="dxa" w:w="4706"/>
+            <w:tcBorders>
+              <w:top w:val="single" w:sz="4" w:space="0" w:color="CBD5E1"/>
+              <w:left w:val="single" w:sz="4" w:space="0" w:color="CBD5E1"/>
+              <w:bottom w:val="single" w:sz="4" w:space="0" w:color="CBD5E1"/>
+              <w:right w:val="single" w:sz="4" w:space="0" w:color="CBD5E1"/>
+              <w:insideH w:val="single" w:sz="4" w:space="0" w:color="CBD5E1"/>
+              <w:insideV w:val="single" w:sz="4" w:space="0" w:color="CBD5E1"/>
+            </w:tcBorders>
+            <w:vAlign w:val="center"/>
+          </w:tcPr>
+          <w:p>
+            <w:r>
+              <w:rPr>
+                <w:rFonts w:ascii="Arial" w:hAnsi="Arial" w:eastAsia="Arial"/>
+                <w:b w:val="0"/>
+                <w:color w:val="172033"/>
+                <w:sz w:val="18"/>
+              </w:rPr>
+              <w:t>Pendiente de confirmar</w:t>
+            </w:r>
+          </w:p>
+        </w:tc>
+      </w:tr>
+    </w:tbl>
+    <w:p/>
+    <w:p>
+      <w:pPr>
+        <w:jc w:val="center"/>
+      </w:pPr>
+      <w:r>
+        <w:rPr>
+          <w:rFonts w:ascii="Arial" w:hAnsi="Arial" w:eastAsia="Arial"/>
+          <w:b/>
+          <w:color w:val="5A19D6"/>
+          <w:sz w:val="18"/>
+        </w:rPr>
+        <w:t>Empresa ficticia: NeuroviaLabs</w:t>
+      </w:r>
+    </w:p>
+    <w:p>
+      <w:r>
+        <w:br w:type="page"/>
+      </w:r>
+    </w:p>
     <w:p>
       <w:pPr>
         <w:pStyle w:val="Heading1"/>
       </w:pPr>
       <w:r>
-        <w:t>Introducción</w:t>
+        <w:t>1. Enfoque de planeación</w:t>
       </w:r>
     </w:p>
     <w:p>
@@ -28,180 +406,4086 @@
         <w:jc w:val="both"/>
       </w:pPr>
       <w:r>
-        <w:t>La gestión del tiempo define la distribución de actividades para completar el proyecto dentro de un periodo aproximado de tres meses.</w:t>
-      </w:r>
-    </w:p>
-    <w:p>
-      <w:pPr>
-        <w:pStyle w:val="Heading1"/>
-      </w:pPr>
-      <w:r>
-        <w:t>Cronograma general</w:t>
+        <w:rPr>
+          <w:rFonts w:ascii="Arial" w:hAnsi="Arial" w:eastAsia="Arial"/>
+          <w:i w:val="0"/>
+          <w:color w:val="172033"/>
+          <w:sz w:val="20"/>
+        </w:rPr>
+        <w:t>El cronograma organiza el trabajo dentro del periodo mayo-agosto de 2026. Las fechas que aparecen en esta versión se manejan como planificación académica y no como prueba automática de que cada actividad técnica haya sido concluida. El estado debe actualizarse únicamente cuando exista evidencia del entregable correspondiente.</w:t>
       </w:r>
     </w:p>
     <w:tbl>
       <w:tblPr>
-        <w:tblStyle w:val="TableGrid"/>
         <w:tblW w:type="auto" w:w="0"/>
         <w:jc w:val="center"/>
+        <w:tblLayout w:type="fixed"/>
         <w:tblLook w:firstColumn="1" w:firstRow="1" w:lastColumn="0" w:lastRow="0" w:noHBand="0" w:noVBand="1" w:val="04A0"/>
       </w:tblPr>
       <w:tblGrid>
-        <w:gridCol w:w="5112"/>
-        <w:gridCol w:w="5112"/>
+        <w:gridCol w:w="1176"/>
+        <w:gridCol w:w="1176"/>
+        <w:gridCol w:w="1176"/>
+        <w:gridCol w:w="1176"/>
+        <w:gridCol w:w="1176"/>
+        <w:gridCol w:w="1176"/>
+        <w:gridCol w:w="1176"/>
+        <w:gridCol w:w="1176"/>
       </w:tblGrid>
       <w:tr>
+        <w:trPr>
+          <w:tblHeader w:val="true"/>
+        </w:trPr>
         <w:tc>
           <w:tcPr>
-            <w:tcW w:type="dxa" w:w="5112"/>
-            <w:shd w:fill="0F766E"/>
+            <w:tcW w:type="dxa" w:w="567"/>
+            <w:shd w:fill="0B1F5E"/>
+            <w:tcBorders>
+              <w:top w:val="single" w:sz="4" w:space="0" w:color="9AA8C2"/>
+              <w:left w:val="single" w:sz="4" w:space="0" w:color="9AA8C2"/>
+              <w:bottom w:val="single" w:sz="4" w:space="0" w:color="9AA8C2"/>
+              <w:right w:val="single" w:sz="4" w:space="0" w:color="9AA8C2"/>
+              <w:insideH w:val="single" w:sz="4" w:space="0" w:color="9AA8C2"/>
+              <w:insideV w:val="single" w:sz="4" w:space="0" w:color="9AA8C2"/>
+            </w:tcBorders>
             <w:vAlign w:val="center"/>
           </w:tcPr>
           <w:p>
             <w:pPr>
-              <w:spacing w:after="0"/>
+              <w:jc w:val="center"/>
             </w:pPr>
-            <w:r/>
             <w:r>
               <w:rPr>
+                <w:rFonts w:ascii="Arial" w:hAnsi="Arial" w:eastAsia="Arial"/>
                 <w:b/>
                 <w:color w:val="FFFFFF"/>
+                <w:sz w:val="13"/>
               </w:rPr>
-              <w:t>Periodo</w:t>
+              <w:t>ID</w:t>
             </w:r>
           </w:p>
         </w:tc>
         <w:tc>
           <w:tcPr>
-            <w:tcW w:type="dxa" w:w="5112"/>
-            <w:shd w:fill="0F766E"/>
+            <w:tcW w:type="dxa" w:w="2098"/>
+            <w:shd w:fill="0B1F5E"/>
+            <w:tcBorders>
+              <w:top w:val="single" w:sz="4" w:space="0" w:color="9AA8C2"/>
+              <w:left w:val="single" w:sz="4" w:space="0" w:color="9AA8C2"/>
+              <w:bottom w:val="single" w:sz="4" w:space="0" w:color="9AA8C2"/>
+              <w:right w:val="single" w:sz="4" w:space="0" w:color="9AA8C2"/>
+              <w:insideH w:val="single" w:sz="4" w:space="0" w:color="9AA8C2"/>
+              <w:insideV w:val="single" w:sz="4" w:space="0" w:color="9AA8C2"/>
+            </w:tcBorders>
             <w:vAlign w:val="center"/>
           </w:tcPr>
           <w:p>
             <w:pPr>
-              <w:spacing w:after="0"/>
+              <w:jc w:val="center"/>
             </w:pPr>
-            <w:r/>
             <w:r>
               <w:rPr>
+                <w:rFonts w:ascii="Arial" w:hAnsi="Arial" w:eastAsia="Arial"/>
                 <w:b/>
                 <w:color w:val="FFFFFF"/>
+                <w:sz w:val="13"/>
               </w:rPr>
-              <w:t>Actividades principales</w:t>
+              <w:t>Actividad</w:t>
+            </w:r>
+          </w:p>
+        </w:tc>
+        <w:tc>
+          <w:tcPr>
+            <w:tcW w:type="dxa" w:w="2098"/>
+            <w:shd w:fill="0B1F5E"/>
+            <w:tcBorders>
+              <w:top w:val="single" w:sz="4" w:space="0" w:color="9AA8C2"/>
+              <w:left w:val="single" w:sz="4" w:space="0" w:color="9AA8C2"/>
+              <w:bottom w:val="single" w:sz="4" w:space="0" w:color="9AA8C2"/>
+              <w:right w:val="single" w:sz="4" w:space="0" w:color="9AA8C2"/>
+              <w:insideH w:val="single" w:sz="4" w:space="0" w:color="9AA8C2"/>
+              <w:insideV w:val="single" w:sz="4" w:space="0" w:color="9AA8C2"/>
+            </w:tcBorders>
+            <w:vAlign w:val="center"/>
+          </w:tcPr>
+          <w:p>
+            <w:pPr>
+              <w:jc w:val="center"/>
+            </w:pPr>
+            <w:r>
+              <w:rPr>
+                <w:rFonts w:ascii="Arial" w:hAnsi="Arial" w:eastAsia="Arial"/>
+                <w:b/>
+                <w:color w:val="FFFFFF"/>
+                <w:sz w:val="13"/>
+              </w:rPr>
+              <w:t>Responsable</w:t>
+            </w:r>
+          </w:p>
+        </w:tc>
+        <w:tc>
+          <w:tcPr>
+            <w:tcW w:type="dxa" w:w="1077"/>
+            <w:shd w:fill="0B1F5E"/>
+            <w:tcBorders>
+              <w:top w:val="single" w:sz="4" w:space="0" w:color="9AA8C2"/>
+              <w:left w:val="single" w:sz="4" w:space="0" w:color="9AA8C2"/>
+              <w:bottom w:val="single" w:sz="4" w:space="0" w:color="9AA8C2"/>
+              <w:right w:val="single" w:sz="4" w:space="0" w:color="9AA8C2"/>
+              <w:insideH w:val="single" w:sz="4" w:space="0" w:color="9AA8C2"/>
+              <w:insideV w:val="single" w:sz="4" w:space="0" w:color="9AA8C2"/>
+            </w:tcBorders>
+            <w:vAlign w:val="center"/>
+          </w:tcPr>
+          <w:p>
+            <w:pPr>
+              <w:jc w:val="center"/>
+            </w:pPr>
+            <w:r>
+              <w:rPr>
+                <w:rFonts w:ascii="Arial" w:hAnsi="Arial" w:eastAsia="Arial"/>
+                <w:b/>
+                <w:color w:val="FFFFFF"/>
+                <w:sz w:val="13"/>
+              </w:rPr>
+              <w:t>Inicio</w:t>
+            </w:r>
+          </w:p>
+        </w:tc>
+        <w:tc>
+          <w:tcPr>
+            <w:tcW w:type="dxa" w:w="1077"/>
+            <w:shd w:fill="0B1F5E"/>
+            <w:tcBorders>
+              <w:top w:val="single" w:sz="4" w:space="0" w:color="9AA8C2"/>
+              <w:left w:val="single" w:sz="4" w:space="0" w:color="9AA8C2"/>
+              <w:bottom w:val="single" w:sz="4" w:space="0" w:color="9AA8C2"/>
+              <w:right w:val="single" w:sz="4" w:space="0" w:color="9AA8C2"/>
+              <w:insideH w:val="single" w:sz="4" w:space="0" w:color="9AA8C2"/>
+              <w:insideV w:val="single" w:sz="4" w:space="0" w:color="9AA8C2"/>
+            </w:tcBorders>
+            <w:vAlign w:val="center"/>
+          </w:tcPr>
+          <w:p>
+            <w:pPr>
+              <w:jc w:val="center"/>
+            </w:pPr>
+            <w:r>
+              <w:rPr>
+                <w:rFonts w:ascii="Arial" w:hAnsi="Arial" w:eastAsia="Arial"/>
+                <w:b/>
+                <w:color w:val="FFFFFF"/>
+                <w:sz w:val="13"/>
+              </w:rPr>
+              <w:t>Fin</w:t>
+            </w:r>
+          </w:p>
+        </w:tc>
+        <w:tc>
+          <w:tcPr>
+            <w:tcW w:type="dxa" w:w="567"/>
+            <w:shd w:fill="0B1F5E"/>
+            <w:tcBorders>
+              <w:top w:val="single" w:sz="4" w:space="0" w:color="9AA8C2"/>
+              <w:left w:val="single" w:sz="4" w:space="0" w:color="9AA8C2"/>
+              <w:bottom w:val="single" w:sz="4" w:space="0" w:color="9AA8C2"/>
+              <w:right w:val="single" w:sz="4" w:space="0" w:color="9AA8C2"/>
+              <w:insideH w:val="single" w:sz="4" w:space="0" w:color="9AA8C2"/>
+              <w:insideV w:val="single" w:sz="4" w:space="0" w:color="9AA8C2"/>
+            </w:tcBorders>
+            <w:vAlign w:val="center"/>
+          </w:tcPr>
+          <w:p>
+            <w:pPr>
+              <w:jc w:val="center"/>
+            </w:pPr>
+            <w:r>
+              <w:rPr>
+                <w:rFonts w:ascii="Arial" w:hAnsi="Arial" w:eastAsia="Arial"/>
+                <w:b/>
+                <w:color w:val="FFFFFF"/>
+                <w:sz w:val="13"/>
+              </w:rPr>
+              <w:t>Días</w:t>
+            </w:r>
+          </w:p>
+        </w:tc>
+        <w:tc>
+          <w:tcPr>
+            <w:tcW w:type="dxa" w:w="1361"/>
+            <w:shd w:fill="0B1F5E"/>
+            <w:tcBorders>
+              <w:top w:val="single" w:sz="4" w:space="0" w:color="9AA8C2"/>
+              <w:left w:val="single" w:sz="4" w:space="0" w:color="9AA8C2"/>
+              <w:bottom w:val="single" w:sz="4" w:space="0" w:color="9AA8C2"/>
+              <w:right w:val="single" w:sz="4" w:space="0" w:color="9AA8C2"/>
+              <w:insideH w:val="single" w:sz="4" w:space="0" w:color="9AA8C2"/>
+              <w:insideV w:val="single" w:sz="4" w:space="0" w:color="9AA8C2"/>
+            </w:tcBorders>
+            <w:vAlign w:val="center"/>
+          </w:tcPr>
+          <w:p>
+            <w:pPr>
+              <w:jc w:val="center"/>
+            </w:pPr>
+            <w:r>
+              <w:rPr>
+                <w:rFonts w:ascii="Arial" w:hAnsi="Arial" w:eastAsia="Arial"/>
+                <w:b/>
+                <w:color w:val="FFFFFF"/>
+                <w:sz w:val="13"/>
+              </w:rPr>
+              <w:t>Dependencia</w:t>
+            </w:r>
+          </w:p>
+        </w:tc>
+        <w:tc>
+          <w:tcPr>
+            <w:tcW w:type="dxa" w:w="1644"/>
+            <w:shd w:fill="0B1F5E"/>
+            <w:tcBorders>
+              <w:top w:val="single" w:sz="4" w:space="0" w:color="9AA8C2"/>
+              <w:left w:val="single" w:sz="4" w:space="0" w:color="9AA8C2"/>
+              <w:bottom w:val="single" w:sz="4" w:space="0" w:color="9AA8C2"/>
+              <w:right w:val="single" w:sz="4" w:space="0" w:color="9AA8C2"/>
+              <w:insideH w:val="single" w:sz="4" w:space="0" w:color="9AA8C2"/>
+              <w:insideV w:val="single" w:sz="4" w:space="0" w:color="9AA8C2"/>
+            </w:tcBorders>
+            <w:vAlign w:val="center"/>
+          </w:tcPr>
+          <w:p>
+            <w:pPr>
+              <w:jc w:val="center"/>
+            </w:pPr>
+            <w:r>
+              <w:rPr>
+                <w:rFonts w:ascii="Arial" w:hAnsi="Arial" w:eastAsia="Arial"/>
+                <w:b/>
+                <w:color w:val="FFFFFF"/>
+                <w:sz w:val="13"/>
+              </w:rPr>
+              <w:t>Estado</w:t>
             </w:r>
           </w:p>
         </w:tc>
       </w:tr>
       <w:tr>
+        <w:trPr>
+          <w:cantSplit/>
+        </w:trPr>
         <w:tc>
           <w:tcPr>
-            <w:tcW w:type="dxa" w:w="5112"/>
+            <w:tcW w:type="dxa" w:w="567"/>
+            <w:tcBorders>
+              <w:top w:val="single" w:sz="4" w:space="0" w:color="CBD5E1"/>
+              <w:left w:val="single" w:sz="4" w:space="0" w:color="CBD5E1"/>
+              <w:bottom w:val="single" w:sz="4" w:space="0" w:color="CBD5E1"/>
+              <w:right w:val="single" w:sz="4" w:space="0" w:color="CBD5E1"/>
+              <w:insideH w:val="single" w:sz="4" w:space="0" w:color="CBD5E1"/>
+              <w:insideV w:val="single" w:sz="4" w:space="0" w:color="CBD5E1"/>
+            </w:tcBorders>
             <w:vAlign w:val="center"/>
           </w:tcPr>
           <w:p>
             <w:pPr>
-              <w:spacing w:after="0"/>
+              <w:spacing w:before="20" w:after="20"/>
             </w:pPr>
-            <w:r/>
             <w:r>
               <w:rPr>
-                <w:b w:val="0"/>
+                <w:rFonts w:ascii="Arial" w:hAnsi="Arial" w:eastAsia="Arial"/>
+                <w:color w:val="172033"/>
+                <w:sz w:val="13"/>
               </w:rPr>
-              <w:t>Mes 1</w:t>
+              <w:t>T01</w:t>
             </w:r>
           </w:p>
         </w:tc>
         <w:tc>
           <w:tcPr>
-            <w:tcW w:type="dxa" w:w="5112"/>
+            <w:tcW w:type="dxa" w:w="2098"/>
+            <w:tcBorders>
+              <w:top w:val="single" w:sz="4" w:space="0" w:color="CBD5E1"/>
+              <w:left w:val="single" w:sz="4" w:space="0" w:color="CBD5E1"/>
+              <w:bottom w:val="single" w:sz="4" w:space="0" w:color="CBD5E1"/>
+              <w:right w:val="single" w:sz="4" w:space="0" w:color="CBD5E1"/>
+              <w:insideH w:val="single" w:sz="4" w:space="0" w:color="CBD5E1"/>
+              <w:insideV w:val="single" w:sz="4" w:space="0" w:color="CBD5E1"/>
+            </w:tcBorders>
             <w:vAlign w:val="center"/>
           </w:tcPr>
           <w:p>
             <w:pPr>
-              <w:spacing w:after="0"/>
+              <w:spacing w:before="20" w:after="20"/>
             </w:pPr>
-            <w:r/>
             <w:r>
               <w:rPr>
-                <w:b w:val="0"/>
+                <w:rFonts w:ascii="Arial" w:hAnsi="Arial" w:eastAsia="Arial"/>
+                <w:color w:val="172033"/>
+                <w:sz w:val="13"/>
               </w:rPr>
-              <w:t>Investigación, empatía, definición de objetivos, alcance, requerimientos y primeros mockups.</w:t>
+              <w:t>Planeación del proyecto</w:t>
+            </w:r>
+          </w:p>
+        </w:tc>
+        <w:tc>
+          <w:tcPr>
+            <w:tcW w:type="dxa" w:w="2098"/>
+            <w:tcBorders>
+              <w:top w:val="single" w:sz="4" w:space="0" w:color="CBD5E1"/>
+              <w:left w:val="single" w:sz="4" w:space="0" w:color="CBD5E1"/>
+              <w:bottom w:val="single" w:sz="4" w:space="0" w:color="CBD5E1"/>
+              <w:right w:val="single" w:sz="4" w:space="0" w:color="CBD5E1"/>
+              <w:insideH w:val="single" w:sz="4" w:space="0" w:color="CBD5E1"/>
+              <w:insideV w:val="single" w:sz="4" w:space="0" w:color="CBD5E1"/>
+            </w:tcBorders>
+            <w:vAlign w:val="center"/>
+          </w:tcPr>
+          <w:p>
+            <w:pPr>
+              <w:spacing w:before="20" w:after="20"/>
+            </w:pPr>
+            <w:r>
+              <w:rPr>
+                <w:rFonts w:ascii="Arial" w:hAnsi="Arial" w:eastAsia="Arial"/>
+                <w:color w:val="172033"/>
+                <w:sz w:val="13"/>
+              </w:rPr>
+              <w:t>Yazmin Gutierrez Hernandez</w:t>
+            </w:r>
+          </w:p>
+        </w:tc>
+        <w:tc>
+          <w:tcPr>
+            <w:tcW w:type="dxa" w:w="1077"/>
+            <w:tcBorders>
+              <w:top w:val="single" w:sz="4" w:space="0" w:color="CBD5E1"/>
+              <w:left w:val="single" w:sz="4" w:space="0" w:color="CBD5E1"/>
+              <w:bottom w:val="single" w:sz="4" w:space="0" w:color="CBD5E1"/>
+              <w:right w:val="single" w:sz="4" w:space="0" w:color="CBD5E1"/>
+              <w:insideH w:val="single" w:sz="4" w:space="0" w:color="CBD5E1"/>
+              <w:insideV w:val="single" w:sz="4" w:space="0" w:color="CBD5E1"/>
+            </w:tcBorders>
+            <w:vAlign w:val="center"/>
+          </w:tcPr>
+          <w:p>
+            <w:pPr>
+              <w:spacing w:before="20" w:after="20"/>
+            </w:pPr>
+            <w:r>
+              <w:rPr>
+                <w:rFonts w:ascii="Arial" w:hAnsi="Arial" w:eastAsia="Arial"/>
+                <w:color w:val="172033"/>
+                <w:sz w:val="13"/>
+              </w:rPr>
+              <w:t>20/05/2026</w:t>
+            </w:r>
+          </w:p>
+        </w:tc>
+        <w:tc>
+          <w:tcPr>
+            <w:tcW w:type="dxa" w:w="1077"/>
+            <w:tcBorders>
+              <w:top w:val="single" w:sz="4" w:space="0" w:color="CBD5E1"/>
+              <w:left w:val="single" w:sz="4" w:space="0" w:color="CBD5E1"/>
+              <w:bottom w:val="single" w:sz="4" w:space="0" w:color="CBD5E1"/>
+              <w:right w:val="single" w:sz="4" w:space="0" w:color="CBD5E1"/>
+              <w:insideH w:val="single" w:sz="4" w:space="0" w:color="CBD5E1"/>
+              <w:insideV w:val="single" w:sz="4" w:space="0" w:color="CBD5E1"/>
+            </w:tcBorders>
+            <w:vAlign w:val="center"/>
+          </w:tcPr>
+          <w:p>
+            <w:pPr>
+              <w:spacing w:before="20" w:after="20"/>
+            </w:pPr>
+            <w:r>
+              <w:rPr>
+                <w:rFonts w:ascii="Arial" w:hAnsi="Arial" w:eastAsia="Arial"/>
+                <w:color w:val="172033"/>
+                <w:sz w:val="13"/>
+              </w:rPr>
+              <w:t>29/05/2026</w:t>
+            </w:r>
+          </w:p>
+        </w:tc>
+        <w:tc>
+          <w:tcPr>
+            <w:tcW w:type="dxa" w:w="567"/>
+            <w:tcBorders>
+              <w:top w:val="single" w:sz="4" w:space="0" w:color="CBD5E1"/>
+              <w:left w:val="single" w:sz="4" w:space="0" w:color="CBD5E1"/>
+              <w:bottom w:val="single" w:sz="4" w:space="0" w:color="CBD5E1"/>
+              <w:right w:val="single" w:sz="4" w:space="0" w:color="CBD5E1"/>
+              <w:insideH w:val="single" w:sz="4" w:space="0" w:color="CBD5E1"/>
+              <w:insideV w:val="single" w:sz="4" w:space="0" w:color="CBD5E1"/>
+            </w:tcBorders>
+            <w:vAlign w:val="center"/>
+          </w:tcPr>
+          <w:p>
+            <w:pPr>
+              <w:spacing w:before="20" w:after="20"/>
+            </w:pPr>
+            <w:r>
+              <w:rPr>
+                <w:rFonts w:ascii="Arial" w:hAnsi="Arial" w:eastAsia="Arial"/>
+                <w:color w:val="172033"/>
+                <w:sz w:val="13"/>
+              </w:rPr>
+              <w:t>10</w:t>
+            </w:r>
+          </w:p>
+        </w:tc>
+        <w:tc>
+          <w:tcPr>
+            <w:tcW w:type="dxa" w:w="1361"/>
+            <w:tcBorders>
+              <w:top w:val="single" w:sz="4" w:space="0" w:color="CBD5E1"/>
+              <w:left w:val="single" w:sz="4" w:space="0" w:color="CBD5E1"/>
+              <w:bottom w:val="single" w:sz="4" w:space="0" w:color="CBD5E1"/>
+              <w:right w:val="single" w:sz="4" w:space="0" w:color="CBD5E1"/>
+              <w:insideH w:val="single" w:sz="4" w:space="0" w:color="CBD5E1"/>
+              <w:insideV w:val="single" w:sz="4" w:space="0" w:color="CBD5E1"/>
+            </w:tcBorders>
+            <w:vAlign w:val="center"/>
+          </w:tcPr>
+          <w:p>
+            <w:pPr>
+              <w:spacing w:before="20" w:after="20"/>
+            </w:pPr>
+            <w:r>
+              <w:rPr>
+                <w:rFonts w:ascii="Arial" w:hAnsi="Arial" w:eastAsia="Arial"/>
+                <w:color w:val="172033"/>
+                <w:sz w:val="13"/>
+              </w:rPr>
+              <w:t>Inicio</w:t>
+            </w:r>
+          </w:p>
+        </w:tc>
+        <w:tc>
+          <w:tcPr>
+            <w:tcW w:type="dxa" w:w="1644"/>
+            <w:tcBorders>
+              <w:top w:val="single" w:sz="4" w:space="0" w:color="CBD5E1"/>
+              <w:left w:val="single" w:sz="4" w:space="0" w:color="CBD5E1"/>
+              <w:bottom w:val="single" w:sz="4" w:space="0" w:color="CBD5E1"/>
+              <w:right w:val="single" w:sz="4" w:space="0" w:color="CBD5E1"/>
+              <w:insideH w:val="single" w:sz="4" w:space="0" w:color="CBD5E1"/>
+              <w:insideV w:val="single" w:sz="4" w:space="0" w:color="CBD5E1"/>
+            </w:tcBorders>
+            <w:vAlign w:val="center"/>
+          </w:tcPr>
+          <w:p>
+            <w:pPr>
+              <w:spacing w:before="20" w:after="20"/>
+            </w:pPr>
+            <w:r>
+              <w:rPr>
+                <w:rFonts w:ascii="Arial" w:hAnsi="Arial" w:eastAsia="Arial"/>
+                <w:color w:val="172033"/>
+                <w:sz w:val="13"/>
+              </w:rPr>
+              <w:t>Planificación académica</w:t>
             </w:r>
           </w:p>
         </w:tc>
       </w:tr>
       <w:tr>
+        <w:trPr>
+          <w:cantSplit/>
+        </w:trPr>
         <w:tc>
           <w:tcPr>
-            <w:tcW w:type="dxa" w:w="5112"/>
+            <w:tcW w:type="dxa" w:w="567"/>
+            <w:tcBorders>
+              <w:top w:val="single" w:sz="4" w:space="0" w:color="CBD5E1"/>
+              <w:left w:val="single" w:sz="4" w:space="0" w:color="CBD5E1"/>
+              <w:bottom w:val="single" w:sz="4" w:space="0" w:color="CBD5E1"/>
+              <w:right w:val="single" w:sz="4" w:space="0" w:color="CBD5E1"/>
+              <w:insideH w:val="single" w:sz="4" w:space="0" w:color="CBD5E1"/>
+              <w:insideV w:val="single" w:sz="4" w:space="0" w:color="CBD5E1"/>
+            </w:tcBorders>
             <w:vAlign w:val="center"/>
+            <w:shd w:fill="F8FAFC"/>
           </w:tcPr>
           <w:p>
             <w:pPr>
-              <w:spacing w:after="0"/>
+              <w:spacing w:before="20" w:after="20"/>
             </w:pPr>
-            <w:r/>
             <w:r>
               <w:rPr>
-                <w:b w:val="0"/>
+                <w:rFonts w:ascii="Arial" w:hAnsi="Arial" w:eastAsia="Arial"/>
+                <w:color w:val="172033"/>
+                <w:sz w:val="13"/>
               </w:rPr>
-              <w:t>Mes 2</w:t>
+              <w:t>T02</w:t>
             </w:r>
           </w:p>
         </w:tc>
         <w:tc>
           <w:tcPr>
-            <w:tcW w:type="dxa" w:w="5112"/>
+            <w:tcW w:type="dxa" w:w="2098"/>
+            <w:tcBorders>
+              <w:top w:val="single" w:sz="4" w:space="0" w:color="CBD5E1"/>
+              <w:left w:val="single" w:sz="4" w:space="0" w:color="CBD5E1"/>
+              <w:bottom w:val="single" w:sz="4" w:space="0" w:color="CBD5E1"/>
+              <w:right w:val="single" w:sz="4" w:space="0" w:color="CBD5E1"/>
+              <w:insideH w:val="single" w:sz="4" w:space="0" w:color="CBD5E1"/>
+              <w:insideV w:val="single" w:sz="4" w:space="0" w:color="CBD5E1"/>
+            </w:tcBorders>
             <w:vAlign w:val="center"/>
+            <w:shd w:fill="F8FAFC"/>
           </w:tcPr>
           <w:p>
             <w:pPr>
-              <w:spacing w:after="0"/>
+              <w:spacing w:before="20" w:after="20"/>
             </w:pPr>
-            <w:r/>
             <w:r>
               <w:rPr>
-                <w:b w:val="0"/>
+                <w:rFonts w:ascii="Arial" w:hAnsi="Arial" w:eastAsia="Arial"/>
+                <w:color w:val="172033"/>
+                <w:sz w:val="13"/>
               </w:rPr>
-              <w:t>Diseño de arquitectura, base de datos, prototipos UX/UI, desarrollo inicial frontend y backend.</w:t>
+              <w:t>Investigación y contexto</w:t>
+            </w:r>
+          </w:p>
+        </w:tc>
+        <w:tc>
+          <w:tcPr>
+            <w:tcW w:type="dxa" w:w="2098"/>
+            <w:tcBorders>
+              <w:top w:val="single" w:sz="4" w:space="0" w:color="CBD5E1"/>
+              <w:left w:val="single" w:sz="4" w:space="0" w:color="CBD5E1"/>
+              <w:bottom w:val="single" w:sz="4" w:space="0" w:color="CBD5E1"/>
+              <w:right w:val="single" w:sz="4" w:space="0" w:color="CBD5E1"/>
+              <w:insideH w:val="single" w:sz="4" w:space="0" w:color="CBD5E1"/>
+              <w:insideV w:val="single" w:sz="4" w:space="0" w:color="CBD5E1"/>
+            </w:tcBorders>
+            <w:vAlign w:val="center"/>
+            <w:shd w:fill="F8FAFC"/>
+          </w:tcPr>
+          <w:p>
+            <w:pPr>
+              <w:spacing w:before="20" w:after="20"/>
+            </w:pPr>
+            <w:r>
+              <w:rPr>
+                <w:rFonts w:ascii="Arial" w:hAnsi="Arial" w:eastAsia="Arial"/>
+                <w:color w:val="172033"/>
+                <w:sz w:val="13"/>
+              </w:rPr>
+              <w:t>Obed Guzmán Flores</w:t>
+            </w:r>
+          </w:p>
+        </w:tc>
+        <w:tc>
+          <w:tcPr>
+            <w:tcW w:type="dxa" w:w="1077"/>
+            <w:tcBorders>
+              <w:top w:val="single" w:sz="4" w:space="0" w:color="CBD5E1"/>
+              <w:left w:val="single" w:sz="4" w:space="0" w:color="CBD5E1"/>
+              <w:bottom w:val="single" w:sz="4" w:space="0" w:color="CBD5E1"/>
+              <w:right w:val="single" w:sz="4" w:space="0" w:color="CBD5E1"/>
+              <w:insideH w:val="single" w:sz="4" w:space="0" w:color="CBD5E1"/>
+              <w:insideV w:val="single" w:sz="4" w:space="0" w:color="CBD5E1"/>
+            </w:tcBorders>
+            <w:vAlign w:val="center"/>
+            <w:shd w:fill="F8FAFC"/>
+          </w:tcPr>
+          <w:p>
+            <w:pPr>
+              <w:spacing w:before="20" w:after="20"/>
+            </w:pPr>
+            <w:r>
+              <w:rPr>
+                <w:rFonts w:ascii="Arial" w:hAnsi="Arial" w:eastAsia="Arial"/>
+                <w:color w:val="172033"/>
+                <w:sz w:val="13"/>
+              </w:rPr>
+              <w:t>25/05/2026</w:t>
+            </w:r>
+          </w:p>
+        </w:tc>
+        <w:tc>
+          <w:tcPr>
+            <w:tcW w:type="dxa" w:w="1077"/>
+            <w:tcBorders>
+              <w:top w:val="single" w:sz="4" w:space="0" w:color="CBD5E1"/>
+              <w:left w:val="single" w:sz="4" w:space="0" w:color="CBD5E1"/>
+              <w:bottom w:val="single" w:sz="4" w:space="0" w:color="CBD5E1"/>
+              <w:right w:val="single" w:sz="4" w:space="0" w:color="CBD5E1"/>
+              <w:insideH w:val="single" w:sz="4" w:space="0" w:color="CBD5E1"/>
+              <w:insideV w:val="single" w:sz="4" w:space="0" w:color="CBD5E1"/>
+            </w:tcBorders>
+            <w:vAlign w:val="center"/>
+            <w:shd w:fill="F8FAFC"/>
+          </w:tcPr>
+          <w:p>
+            <w:pPr>
+              <w:spacing w:before="20" w:after="20"/>
+            </w:pPr>
+            <w:r>
+              <w:rPr>
+                <w:rFonts w:ascii="Arial" w:hAnsi="Arial" w:eastAsia="Arial"/>
+                <w:color w:val="172033"/>
+                <w:sz w:val="13"/>
+              </w:rPr>
+              <w:t>05/06/2026</w:t>
+            </w:r>
+          </w:p>
+        </w:tc>
+        <w:tc>
+          <w:tcPr>
+            <w:tcW w:type="dxa" w:w="567"/>
+            <w:tcBorders>
+              <w:top w:val="single" w:sz="4" w:space="0" w:color="CBD5E1"/>
+              <w:left w:val="single" w:sz="4" w:space="0" w:color="CBD5E1"/>
+              <w:bottom w:val="single" w:sz="4" w:space="0" w:color="CBD5E1"/>
+              <w:right w:val="single" w:sz="4" w:space="0" w:color="CBD5E1"/>
+              <w:insideH w:val="single" w:sz="4" w:space="0" w:color="CBD5E1"/>
+              <w:insideV w:val="single" w:sz="4" w:space="0" w:color="CBD5E1"/>
+            </w:tcBorders>
+            <w:vAlign w:val="center"/>
+            <w:shd w:fill="F8FAFC"/>
+          </w:tcPr>
+          <w:p>
+            <w:pPr>
+              <w:spacing w:before="20" w:after="20"/>
+            </w:pPr>
+            <w:r>
+              <w:rPr>
+                <w:rFonts w:ascii="Arial" w:hAnsi="Arial" w:eastAsia="Arial"/>
+                <w:color w:val="172033"/>
+                <w:sz w:val="13"/>
+              </w:rPr>
+              <w:t>12</w:t>
+            </w:r>
+          </w:p>
+        </w:tc>
+        <w:tc>
+          <w:tcPr>
+            <w:tcW w:type="dxa" w:w="1361"/>
+            <w:tcBorders>
+              <w:top w:val="single" w:sz="4" w:space="0" w:color="CBD5E1"/>
+              <w:left w:val="single" w:sz="4" w:space="0" w:color="CBD5E1"/>
+              <w:bottom w:val="single" w:sz="4" w:space="0" w:color="CBD5E1"/>
+              <w:right w:val="single" w:sz="4" w:space="0" w:color="CBD5E1"/>
+              <w:insideH w:val="single" w:sz="4" w:space="0" w:color="CBD5E1"/>
+              <w:insideV w:val="single" w:sz="4" w:space="0" w:color="CBD5E1"/>
+            </w:tcBorders>
+            <w:vAlign w:val="center"/>
+            <w:shd w:fill="F8FAFC"/>
+          </w:tcPr>
+          <w:p>
+            <w:pPr>
+              <w:spacing w:before="20" w:after="20"/>
+            </w:pPr>
+            <w:r>
+              <w:rPr>
+                <w:rFonts w:ascii="Arial" w:hAnsi="Arial" w:eastAsia="Arial"/>
+                <w:color w:val="172033"/>
+                <w:sz w:val="13"/>
+              </w:rPr>
+              <w:t>Planeación</w:t>
+            </w:r>
+          </w:p>
+        </w:tc>
+        <w:tc>
+          <w:tcPr>
+            <w:tcW w:type="dxa" w:w="1644"/>
+            <w:tcBorders>
+              <w:top w:val="single" w:sz="4" w:space="0" w:color="CBD5E1"/>
+              <w:left w:val="single" w:sz="4" w:space="0" w:color="CBD5E1"/>
+              <w:bottom w:val="single" w:sz="4" w:space="0" w:color="CBD5E1"/>
+              <w:right w:val="single" w:sz="4" w:space="0" w:color="CBD5E1"/>
+              <w:insideH w:val="single" w:sz="4" w:space="0" w:color="CBD5E1"/>
+              <w:insideV w:val="single" w:sz="4" w:space="0" w:color="CBD5E1"/>
+            </w:tcBorders>
+            <w:vAlign w:val="center"/>
+            <w:shd w:fill="F8FAFC"/>
+          </w:tcPr>
+          <w:p>
+            <w:pPr>
+              <w:spacing w:before="20" w:after="20"/>
+            </w:pPr>
+            <w:r>
+              <w:rPr>
+                <w:rFonts w:ascii="Arial" w:hAnsi="Arial" w:eastAsia="Arial"/>
+                <w:color w:val="172033"/>
+                <w:sz w:val="13"/>
+              </w:rPr>
+              <w:t>Planificación académica</w:t>
             </w:r>
           </w:p>
         </w:tc>
       </w:tr>
       <w:tr>
+        <w:trPr>
+          <w:cantSplit/>
+        </w:trPr>
         <w:tc>
           <w:tcPr>
-            <w:tcW w:type="dxa" w:w="5112"/>
+            <w:tcW w:type="dxa" w:w="567"/>
+            <w:tcBorders>
+              <w:top w:val="single" w:sz="4" w:space="0" w:color="CBD5E1"/>
+              <w:left w:val="single" w:sz="4" w:space="0" w:color="CBD5E1"/>
+              <w:bottom w:val="single" w:sz="4" w:space="0" w:color="CBD5E1"/>
+              <w:right w:val="single" w:sz="4" w:space="0" w:color="CBD5E1"/>
+              <w:insideH w:val="single" w:sz="4" w:space="0" w:color="CBD5E1"/>
+              <w:insideV w:val="single" w:sz="4" w:space="0" w:color="CBD5E1"/>
+            </w:tcBorders>
             <w:vAlign w:val="center"/>
           </w:tcPr>
           <w:p>
             <w:pPr>
-              <w:spacing w:after="0"/>
+              <w:spacing w:before="20" w:after="20"/>
             </w:pPr>
-            <w:r/>
             <w:r>
               <w:rPr>
-                <w:b w:val="0"/>
+                <w:rFonts w:ascii="Arial" w:hAnsi="Arial" w:eastAsia="Arial"/>
+                <w:color w:val="172033"/>
+                <w:sz w:val="13"/>
               </w:rPr>
-              <w:t>Mes 3</w:t>
+              <w:t>T03</w:t>
             </w:r>
           </w:p>
         </w:tc>
         <w:tc>
           <w:tcPr>
-            <w:tcW w:type="dxa" w:w="5112"/>
+            <w:tcW w:type="dxa" w:w="2098"/>
+            <w:tcBorders>
+              <w:top w:val="single" w:sz="4" w:space="0" w:color="CBD5E1"/>
+              <w:left w:val="single" w:sz="4" w:space="0" w:color="CBD5E1"/>
+              <w:bottom w:val="single" w:sz="4" w:space="0" w:color="CBD5E1"/>
+              <w:right w:val="single" w:sz="4" w:space="0" w:color="CBD5E1"/>
+              <w:insideH w:val="single" w:sz="4" w:space="0" w:color="CBD5E1"/>
+              <w:insideV w:val="single" w:sz="4" w:space="0" w:color="CBD5E1"/>
+            </w:tcBorders>
             <w:vAlign w:val="center"/>
           </w:tcPr>
           <w:p>
             <w:pPr>
-              <w:spacing w:after="0"/>
+              <w:spacing w:before="20" w:after="20"/>
             </w:pPr>
-            <w:r/>
             <w:r>
               <w:rPr>
-                <w:b w:val="0"/>
+                <w:rFonts w:ascii="Arial" w:hAnsi="Arial" w:eastAsia="Arial"/>
+                <w:color w:val="172033"/>
+                <w:sz w:val="13"/>
               </w:rPr>
-              <w:t>Integración de IA, chatbot, notificaciones, pruebas, correcciones, documentación y cierre.</w:t>
+              <w:t>Definición de requerimientos</w:t>
+            </w:r>
+          </w:p>
+        </w:tc>
+        <w:tc>
+          <w:tcPr>
+            <w:tcW w:type="dxa" w:w="2098"/>
+            <w:tcBorders>
+              <w:top w:val="single" w:sz="4" w:space="0" w:color="CBD5E1"/>
+              <w:left w:val="single" w:sz="4" w:space="0" w:color="CBD5E1"/>
+              <w:bottom w:val="single" w:sz="4" w:space="0" w:color="CBD5E1"/>
+              <w:right w:val="single" w:sz="4" w:space="0" w:color="CBD5E1"/>
+              <w:insideH w:val="single" w:sz="4" w:space="0" w:color="CBD5E1"/>
+              <w:insideV w:val="single" w:sz="4" w:space="0" w:color="CBD5E1"/>
+            </w:tcBorders>
+            <w:vAlign w:val="center"/>
+          </w:tcPr>
+          <w:p>
+            <w:pPr>
+              <w:spacing w:before="20" w:after="20"/>
+            </w:pPr>
+            <w:r>
+              <w:rPr>
+                <w:rFonts w:ascii="Arial" w:hAnsi="Arial" w:eastAsia="Arial"/>
+                <w:color w:val="172033"/>
+                <w:sz w:val="13"/>
+              </w:rPr>
+              <w:t>Obed Guzmán Flores</w:t>
+            </w:r>
+          </w:p>
+        </w:tc>
+        <w:tc>
+          <w:tcPr>
+            <w:tcW w:type="dxa" w:w="1077"/>
+            <w:tcBorders>
+              <w:top w:val="single" w:sz="4" w:space="0" w:color="CBD5E1"/>
+              <w:left w:val="single" w:sz="4" w:space="0" w:color="CBD5E1"/>
+              <w:bottom w:val="single" w:sz="4" w:space="0" w:color="CBD5E1"/>
+              <w:right w:val="single" w:sz="4" w:space="0" w:color="CBD5E1"/>
+              <w:insideH w:val="single" w:sz="4" w:space="0" w:color="CBD5E1"/>
+              <w:insideV w:val="single" w:sz="4" w:space="0" w:color="CBD5E1"/>
+            </w:tcBorders>
+            <w:vAlign w:val="center"/>
+          </w:tcPr>
+          <w:p>
+            <w:pPr>
+              <w:spacing w:before="20" w:after="20"/>
+            </w:pPr>
+            <w:r>
+              <w:rPr>
+                <w:rFonts w:ascii="Arial" w:hAnsi="Arial" w:eastAsia="Arial"/>
+                <w:color w:val="172033"/>
+                <w:sz w:val="13"/>
+              </w:rPr>
+              <w:t>01/06/2026</w:t>
+            </w:r>
+          </w:p>
+        </w:tc>
+        <w:tc>
+          <w:tcPr>
+            <w:tcW w:type="dxa" w:w="1077"/>
+            <w:tcBorders>
+              <w:top w:val="single" w:sz="4" w:space="0" w:color="CBD5E1"/>
+              <w:left w:val="single" w:sz="4" w:space="0" w:color="CBD5E1"/>
+              <w:bottom w:val="single" w:sz="4" w:space="0" w:color="CBD5E1"/>
+              <w:right w:val="single" w:sz="4" w:space="0" w:color="CBD5E1"/>
+              <w:insideH w:val="single" w:sz="4" w:space="0" w:color="CBD5E1"/>
+              <w:insideV w:val="single" w:sz="4" w:space="0" w:color="CBD5E1"/>
+            </w:tcBorders>
+            <w:vAlign w:val="center"/>
+          </w:tcPr>
+          <w:p>
+            <w:pPr>
+              <w:spacing w:before="20" w:after="20"/>
+            </w:pPr>
+            <w:r>
+              <w:rPr>
+                <w:rFonts w:ascii="Arial" w:hAnsi="Arial" w:eastAsia="Arial"/>
+                <w:color w:val="172033"/>
+                <w:sz w:val="13"/>
+              </w:rPr>
+              <w:t>12/06/2026</w:t>
+            </w:r>
+          </w:p>
+        </w:tc>
+        <w:tc>
+          <w:tcPr>
+            <w:tcW w:type="dxa" w:w="567"/>
+            <w:tcBorders>
+              <w:top w:val="single" w:sz="4" w:space="0" w:color="CBD5E1"/>
+              <w:left w:val="single" w:sz="4" w:space="0" w:color="CBD5E1"/>
+              <w:bottom w:val="single" w:sz="4" w:space="0" w:color="CBD5E1"/>
+              <w:right w:val="single" w:sz="4" w:space="0" w:color="CBD5E1"/>
+              <w:insideH w:val="single" w:sz="4" w:space="0" w:color="CBD5E1"/>
+              <w:insideV w:val="single" w:sz="4" w:space="0" w:color="CBD5E1"/>
+            </w:tcBorders>
+            <w:vAlign w:val="center"/>
+          </w:tcPr>
+          <w:p>
+            <w:pPr>
+              <w:spacing w:before="20" w:after="20"/>
+            </w:pPr>
+            <w:r>
+              <w:rPr>
+                <w:rFonts w:ascii="Arial" w:hAnsi="Arial" w:eastAsia="Arial"/>
+                <w:color w:val="172033"/>
+                <w:sz w:val="13"/>
+              </w:rPr>
+              <w:t>12</w:t>
+            </w:r>
+          </w:p>
+        </w:tc>
+        <w:tc>
+          <w:tcPr>
+            <w:tcW w:type="dxa" w:w="1361"/>
+            <w:tcBorders>
+              <w:top w:val="single" w:sz="4" w:space="0" w:color="CBD5E1"/>
+              <w:left w:val="single" w:sz="4" w:space="0" w:color="CBD5E1"/>
+              <w:bottom w:val="single" w:sz="4" w:space="0" w:color="CBD5E1"/>
+              <w:right w:val="single" w:sz="4" w:space="0" w:color="CBD5E1"/>
+              <w:insideH w:val="single" w:sz="4" w:space="0" w:color="CBD5E1"/>
+              <w:insideV w:val="single" w:sz="4" w:space="0" w:color="CBD5E1"/>
+            </w:tcBorders>
+            <w:vAlign w:val="center"/>
+          </w:tcPr>
+          <w:p>
+            <w:pPr>
+              <w:spacing w:before="20" w:after="20"/>
+            </w:pPr>
+            <w:r>
+              <w:rPr>
+                <w:rFonts w:ascii="Arial" w:hAnsi="Arial" w:eastAsia="Arial"/>
+                <w:color w:val="172033"/>
+                <w:sz w:val="13"/>
+              </w:rPr>
+              <w:t>Investigación</w:t>
+            </w:r>
+          </w:p>
+        </w:tc>
+        <w:tc>
+          <w:tcPr>
+            <w:tcW w:type="dxa" w:w="1644"/>
+            <w:tcBorders>
+              <w:top w:val="single" w:sz="4" w:space="0" w:color="CBD5E1"/>
+              <w:left w:val="single" w:sz="4" w:space="0" w:color="CBD5E1"/>
+              <w:bottom w:val="single" w:sz="4" w:space="0" w:color="CBD5E1"/>
+              <w:right w:val="single" w:sz="4" w:space="0" w:color="CBD5E1"/>
+              <w:insideH w:val="single" w:sz="4" w:space="0" w:color="CBD5E1"/>
+              <w:insideV w:val="single" w:sz="4" w:space="0" w:color="CBD5E1"/>
+            </w:tcBorders>
+            <w:vAlign w:val="center"/>
+          </w:tcPr>
+          <w:p>
+            <w:pPr>
+              <w:spacing w:before="20" w:after="20"/>
+            </w:pPr>
+            <w:r>
+              <w:rPr>
+                <w:rFonts w:ascii="Arial" w:hAnsi="Arial" w:eastAsia="Arial"/>
+                <w:color w:val="172033"/>
+                <w:sz w:val="13"/>
+              </w:rPr>
+              <w:t>Planificación académica</w:t>
+            </w:r>
+          </w:p>
+        </w:tc>
+      </w:tr>
+      <w:tr>
+        <w:trPr>
+          <w:cantSplit/>
+        </w:trPr>
+        <w:tc>
+          <w:tcPr>
+            <w:tcW w:type="dxa" w:w="567"/>
+            <w:tcBorders>
+              <w:top w:val="single" w:sz="4" w:space="0" w:color="CBD5E1"/>
+              <w:left w:val="single" w:sz="4" w:space="0" w:color="CBD5E1"/>
+              <w:bottom w:val="single" w:sz="4" w:space="0" w:color="CBD5E1"/>
+              <w:right w:val="single" w:sz="4" w:space="0" w:color="CBD5E1"/>
+              <w:insideH w:val="single" w:sz="4" w:space="0" w:color="CBD5E1"/>
+              <w:insideV w:val="single" w:sz="4" w:space="0" w:color="CBD5E1"/>
+            </w:tcBorders>
+            <w:vAlign w:val="center"/>
+            <w:shd w:fill="F8FAFC"/>
+          </w:tcPr>
+          <w:p>
+            <w:pPr>
+              <w:spacing w:before="20" w:after="20"/>
+            </w:pPr>
+            <w:r>
+              <w:rPr>
+                <w:rFonts w:ascii="Arial" w:hAnsi="Arial" w:eastAsia="Arial"/>
+                <w:color w:val="172033"/>
+                <w:sz w:val="13"/>
+              </w:rPr>
+              <w:t>T04</w:t>
+            </w:r>
+          </w:p>
+        </w:tc>
+        <w:tc>
+          <w:tcPr>
+            <w:tcW w:type="dxa" w:w="2098"/>
+            <w:tcBorders>
+              <w:top w:val="single" w:sz="4" w:space="0" w:color="CBD5E1"/>
+              <w:left w:val="single" w:sz="4" w:space="0" w:color="CBD5E1"/>
+              <w:bottom w:val="single" w:sz="4" w:space="0" w:color="CBD5E1"/>
+              <w:right w:val="single" w:sz="4" w:space="0" w:color="CBD5E1"/>
+              <w:insideH w:val="single" w:sz="4" w:space="0" w:color="CBD5E1"/>
+              <w:insideV w:val="single" w:sz="4" w:space="0" w:color="CBD5E1"/>
+            </w:tcBorders>
+            <w:vAlign w:val="center"/>
+            <w:shd w:fill="F8FAFC"/>
+          </w:tcPr>
+          <w:p>
+            <w:pPr>
+              <w:spacing w:before="20" w:after="20"/>
+            </w:pPr>
+            <w:r>
+              <w:rPr>
+                <w:rFonts w:ascii="Arial" w:hAnsi="Arial" w:eastAsia="Arial"/>
+                <w:color w:val="172033"/>
+                <w:sz w:val="13"/>
+              </w:rPr>
+              <w:t>Diseño de la aplicación</w:t>
+            </w:r>
+          </w:p>
+        </w:tc>
+        <w:tc>
+          <w:tcPr>
+            <w:tcW w:type="dxa" w:w="2098"/>
+            <w:tcBorders>
+              <w:top w:val="single" w:sz="4" w:space="0" w:color="CBD5E1"/>
+              <w:left w:val="single" w:sz="4" w:space="0" w:color="CBD5E1"/>
+              <w:bottom w:val="single" w:sz="4" w:space="0" w:color="CBD5E1"/>
+              <w:right w:val="single" w:sz="4" w:space="0" w:color="CBD5E1"/>
+              <w:insideH w:val="single" w:sz="4" w:space="0" w:color="CBD5E1"/>
+              <w:insideV w:val="single" w:sz="4" w:space="0" w:color="CBD5E1"/>
+            </w:tcBorders>
+            <w:vAlign w:val="center"/>
+            <w:shd w:fill="F8FAFC"/>
+          </w:tcPr>
+          <w:p>
+            <w:pPr>
+              <w:spacing w:before="20" w:after="20"/>
+            </w:pPr>
+            <w:r>
+              <w:rPr>
+                <w:rFonts w:ascii="Arial" w:hAnsi="Arial" w:eastAsia="Arial"/>
+                <w:color w:val="172033"/>
+                <w:sz w:val="13"/>
+              </w:rPr>
+              <w:t>Yazmin Gutierrez Hernandez</w:t>
+            </w:r>
+          </w:p>
+        </w:tc>
+        <w:tc>
+          <w:tcPr>
+            <w:tcW w:type="dxa" w:w="1077"/>
+            <w:tcBorders>
+              <w:top w:val="single" w:sz="4" w:space="0" w:color="CBD5E1"/>
+              <w:left w:val="single" w:sz="4" w:space="0" w:color="CBD5E1"/>
+              <w:bottom w:val="single" w:sz="4" w:space="0" w:color="CBD5E1"/>
+              <w:right w:val="single" w:sz="4" w:space="0" w:color="CBD5E1"/>
+              <w:insideH w:val="single" w:sz="4" w:space="0" w:color="CBD5E1"/>
+              <w:insideV w:val="single" w:sz="4" w:space="0" w:color="CBD5E1"/>
+            </w:tcBorders>
+            <w:vAlign w:val="center"/>
+            <w:shd w:fill="F8FAFC"/>
+          </w:tcPr>
+          <w:p>
+            <w:pPr>
+              <w:spacing w:before="20" w:after="20"/>
+            </w:pPr>
+            <w:r>
+              <w:rPr>
+                <w:rFonts w:ascii="Arial" w:hAnsi="Arial" w:eastAsia="Arial"/>
+                <w:color w:val="172033"/>
+                <w:sz w:val="13"/>
+              </w:rPr>
+              <w:t>08/06/2026</w:t>
+            </w:r>
+          </w:p>
+        </w:tc>
+        <w:tc>
+          <w:tcPr>
+            <w:tcW w:type="dxa" w:w="1077"/>
+            <w:tcBorders>
+              <w:top w:val="single" w:sz="4" w:space="0" w:color="CBD5E1"/>
+              <w:left w:val="single" w:sz="4" w:space="0" w:color="CBD5E1"/>
+              <w:bottom w:val="single" w:sz="4" w:space="0" w:color="CBD5E1"/>
+              <w:right w:val="single" w:sz="4" w:space="0" w:color="CBD5E1"/>
+              <w:insideH w:val="single" w:sz="4" w:space="0" w:color="CBD5E1"/>
+              <w:insideV w:val="single" w:sz="4" w:space="0" w:color="CBD5E1"/>
+            </w:tcBorders>
+            <w:vAlign w:val="center"/>
+            <w:shd w:fill="F8FAFC"/>
+          </w:tcPr>
+          <w:p>
+            <w:pPr>
+              <w:spacing w:before="20" w:after="20"/>
+            </w:pPr>
+            <w:r>
+              <w:rPr>
+                <w:rFonts w:ascii="Arial" w:hAnsi="Arial" w:eastAsia="Arial"/>
+                <w:color w:val="172033"/>
+                <w:sz w:val="13"/>
+              </w:rPr>
+              <w:t>19/06/2026</w:t>
+            </w:r>
+          </w:p>
+        </w:tc>
+        <w:tc>
+          <w:tcPr>
+            <w:tcW w:type="dxa" w:w="567"/>
+            <w:tcBorders>
+              <w:top w:val="single" w:sz="4" w:space="0" w:color="CBD5E1"/>
+              <w:left w:val="single" w:sz="4" w:space="0" w:color="CBD5E1"/>
+              <w:bottom w:val="single" w:sz="4" w:space="0" w:color="CBD5E1"/>
+              <w:right w:val="single" w:sz="4" w:space="0" w:color="CBD5E1"/>
+              <w:insideH w:val="single" w:sz="4" w:space="0" w:color="CBD5E1"/>
+              <w:insideV w:val="single" w:sz="4" w:space="0" w:color="CBD5E1"/>
+            </w:tcBorders>
+            <w:vAlign w:val="center"/>
+            <w:shd w:fill="F8FAFC"/>
+          </w:tcPr>
+          <w:p>
+            <w:pPr>
+              <w:spacing w:before="20" w:after="20"/>
+            </w:pPr>
+            <w:r>
+              <w:rPr>
+                <w:rFonts w:ascii="Arial" w:hAnsi="Arial" w:eastAsia="Arial"/>
+                <w:color w:val="172033"/>
+                <w:sz w:val="13"/>
+              </w:rPr>
+              <w:t>12</w:t>
+            </w:r>
+          </w:p>
+        </w:tc>
+        <w:tc>
+          <w:tcPr>
+            <w:tcW w:type="dxa" w:w="1361"/>
+            <w:tcBorders>
+              <w:top w:val="single" w:sz="4" w:space="0" w:color="CBD5E1"/>
+              <w:left w:val="single" w:sz="4" w:space="0" w:color="CBD5E1"/>
+              <w:bottom w:val="single" w:sz="4" w:space="0" w:color="CBD5E1"/>
+              <w:right w:val="single" w:sz="4" w:space="0" w:color="CBD5E1"/>
+              <w:insideH w:val="single" w:sz="4" w:space="0" w:color="CBD5E1"/>
+              <w:insideV w:val="single" w:sz="4" w:space="0" w:color="CBD5E1"/>
+            </w:tcBorders>
+            <w:vAlign w:val="center"/>
+            <w:shd w:fill="F8FAFC"/>
+          </w:tcPr>
+          <w:p>
+            <w:pPr>
+              <w:spacing w:before="20" w:after="20"/>
+            </w:pPr>
+            <w:r>
+              <w:rPr>
+                <w:rFonts w:ascii="Arial" w:hAnsi="Arial" w:eastAsia="Arial"/>
+                <w:color w:val="172033"/>
+                <w:sz w:val="13"/>
+              </w:rPr>
+              <w:t>Requerimientos</w:t>
+            </w:r>
+          </w:p>
+        </w:tc>
+        <w:tc>
+          <w:tcPr>
+            <w:tcW w:type="dxa" w:w="1644"/>
+            <w:tcBorders>
+              <w:top w:val="single" w:sz="4" w:space="0" w:color="CBD5E1"/>
+              <w:left w:val="single" w:sz="4" w:space="0" w:color="CBD5E1"/>
+              <w:bottom w:val="single" w:sz="4" w:space="0" w:color="CBD5E1"/>
+              <w:right w:val="single" w:sz="4" w:space="0" w:color="CBD5E1"/>
+              <w:insideH w:val="single" w:sz="4" w:space="0" w:color="CBD5E1"/>
+              <w:insideV w:val="single" w:sz="4" w:space="0" w:color="CBD5E1"/>
+            </w:tcBorders>
+            <w:vAlign w:val="center"/>
+            <w:shd w:fill="F8FAFC"/>
+          </w:tcPr>
+          <w:p>
+            <w:pPr>
+              <w:spacing w:before="20" w:after="20"/>
+            </w:pPr>
+            <w:r>
+              <w:rPr>
+                <w:rFonts w:ascii="Arial" w:hAnsi="Arial" w:eastAsia="Arial"/>
+                <w:color w:val="172033"/>
+                <w:sz w:val="13"/>
+              </w:rPr>
+              <w:t>Planificación académica</w:t>
+            </w:r>
+          </w:p>
+        </w:tc>
+      </w:tr>
+      <w:tr>
+        <w:trPr>
+          <w:cantSplit/>
+        </w:trPr>
+        <w:tc>
+          <w:tcPr>
+            <w:tcW w:type="dxa" w:w="567"/>
+            <w:tcBorders>
+              <w:top w:val="single" w:sz="4" w:space="0" w:color="CBD5E1"/>
+              <w:left w:val="single" w:sz="4" w:space="0" w:color="CBD5E1"/>
+              <w:bottom w:val="single" w:sz="4" w:space="0" w:color="CBD5E1"/>
+              <w:right w:val="single" w:sz="4" w:space="0" w:color="CBD5E1"/>
+              <w:insideH w:val="single" w:sz="4" w:space="0" w:color="CBD5E1"/>
+              <w:insideV w:val="single" w:sz="4" w:space="0" w:color="CBD5E1"/>
+            </w:tcBorders>
+            <w:vAlign w:val="center"/>
+          </w:tcPr>
+          <w:p>
+            <w:pPr>
+              <w:spacing w:before="20" w:after="20"/>
+            </w:pPr>
+            <w:r>
+              <w:rPr>
+                <w:rFonts w:ascii="Arial" w:hAnsi="Arial" w:eastAsia="Arial"/>
+                <w:color w:val="172033"/>
+                <w:sz w:val="13"/>
+              </w:rPr>
+              <w:t>T05</w:t>
+            </w:r>
+          </w:p>
+        </w:tc>
+        <w:tc>
+          <w:tcPr>
+            <w:tcW w:type="dxa" w:w="2098"/>
+            <w:tcBorders>
+              <w:top w:val="single" w:sz="4" w:space="0" w:color="CBD5E1"/>
+              <w:left w:val="single" w:sz="4" w:space="0" w:color="CBD5E1"/>
+              <w:bottom w:val="single" w:sz="4" w:space="0" w:color="CBD5E1"/>
+              <w:right w:val="single" w:sz="4" w:space="0" w:color="CBD5E1"/>
+              <w:insideH w:val="single" w:sz="4" w:space="0" w:color="CBD5E1"/>
+              <w:insideV w:val="single" w:sz="4" w:space="0" w:color="CBD5E1"/>
+            </w:tcBorders>
+            <w:vAlign w:val="center"/>
+          </w:tcPr>
+          <w:p>
+            <w:pPr>
+              <w:spacing w:before="20" w:after="20"/>
+            </w:pPr>
+            <w:r>
+              <w:rPr>
+                <w:rFonts w:ascii="Arial" w:hAnsi="Arial" w:eastAsia="Arial"/>
+                <w:color w:val="172033"/>
+                <w:sz w:val="13"/>
+              </w:rPr>
+              <w:t>Diseño de interfaz para smartwatch</w:t>
+            </w:r>
+          </w:p>
+        </w:tc>
+        <w:tc>
+          <w:tcPr>
+            <w:tcW w:type="dxa" w:w="2098"/>
+            <w:tcBorders>
+              <w:top w:val="single" w:sz="4" w:space="0" w:color="CBD5E1"/>
+              <w:left w:val="single" w:sz="4" w:space="0" w:color="CBD5E1"/>
+              <w:bottom w:val="single" w:sz="4" w:space="0" w:color="CBD5E1"/>
+              <w:right w:val="single" w:sz="4" w:space="0" w:color="CBD5E1"/>
+              <w:insideH w:val="single" w:sz="4" w:space="0" w:color="CBD5E1"/>
+              <w:insideV w:val="single" w:sz="4" w:space="0" w:color="CBD5E1"/>
+            </w:tcBorders>
+            <w:vAlign w:val="center"/>
+          </w:tcPr>
+          <w:p>
+            <w:pPr>
+              <w:spacing w:before="20" w:after="20"/>
+            </w:pPr>
+            <w:r>
+              <w:rPr>
+                <w:rFonts w:ascii="Arial" w:hAnsi="Arial" w:eastAsia="Arial"/>
+                <w:color w:val="172033"/>
+                <w:sz w:val="13"/>
+              </w:rPr>
+              <w:t>Yazmin Gutierrez Hernandez</w:t>
+            </w:r>
+          </w:p>
+        </w:tc>
+        <w:tc>
+          <w:tcPr>
+            <w:tcW w:type="dxa" w:w="1077"/>
+            <w:tcBorders>
+              <w:top w:val="single" w:sz="4" w:space="0" w:color="CBD5E1"/>
+              <w:left w:val="single" w:sz="4" w:space="0" w:color="CBD5E1"/>
+              <w:bottom w:val="single" w:sz="4" w:space="0" w:color="CBD5E1"/>
+              <w:right w:val="single" w:sz="4" w:space="0" w:color="CBD5E1"/>
+              <w:insideH w:val="single" w:sz="4" w:space="0" w:color="CBD5E1"/>
+              <w:insideV w:val="single" w:sz="4" w:space="0" w:color="CBD5E1"/>
+            </w:tcBorders>
+            <w:vAlign w:val="center"/>
+          </w:tcPr>
+          <w:p>
+            <w:pPr>
+              <w:spacing w:before="20" w:after="20"/>
+            </w:pPr>
+            <w:r>
+              <w:rPr>
+                <w:rFonts w:ascii="Arial" w:hAnsi="Arial" w:eastAsia="Arial"/>
+                <w:color w:val="172033"/>
+                <w:sz w:val="13"/>
+              </w:rPr>
+              <w:t>15/06/2026</w:t>
+            </w:r>
+          </w:p>
+        </w:tc>
+        <w:tc>
+          <w:tcPr>
+            <w:tcW w:type="dxa" w:w="1077"/>
+            <w:tcBorders>
+              <w:top w:val="single" w:sz="4" w:space="0" w:color="CBD5E1"/>
+              <w:left w:val="single" w:sz="4" w:space="0" w:color="CBD5E1"/>
+              <w:bottom w:val="single" w:sz="4" w:space="0" w:color="CBD5E1"/>
+              <w:right w:val="single" w:sz="4" w:space="0" w:color="CBD5E1"/>
+              <w:insideH w:val="single" w:sz="4" w:space="0" w:color="CBD5E1"/>
+              <w:insideV w:val="single" w:sz="4" w:space="0" w:color="CBD5E1"/>
+            </w:tcBorders>
+            <w:vAlign w:val="center"/>
+          </w:tcPr>
+          <w:p>
+            <w:pPr>
+              <w:spacing w:before="20" w:after="20"/>
+            </w:pPr>
+            <w:r>
+              <w:rPr>
+                <w:rFonts w:ascii="Arial" w:hAnsi="Arial" w:eastAsia="Arial"/>
+                <w:color w:val="172033"/>
+                <w:sz w:val="13"/>
+              </w:rPr>
+              <w:t>26/06/2026</w:t>
+            </w:r>
+          </w:p>
+        </w:tc>
+        <w:tc>
+          <w:tcPr>
+            <w:tcW w:type="dxa" w:w="567"/>
+            <w:tcBorders>
+              <w:top w:val="single" w:sz="4" w:space="0" w:color="CBD5E1"/>
+              <w:left w:val="single" w:sz="4" w:space="0" w:color="CBD5E1"/>
+              <w:bottom w:val="single" w:sz="4" w:space="0" w:color="CBD5E1"/>
+              <w:right w:val="single" w:sz="4" w:space="0" w:color="CBD5E1"/>
+              <w:insideH w:val="single" w:sz="4" w:space="0" w:color="CBD5E1"/>
+              <w:insideV w:val="single" w:sz="4" w:space="0" w:color="CBD5E1"/>
+            </w:tcBorders>
+            <w:vAlign w:val="center"/>
+          </w:tcPr>
+          <w:p>
+            <w:pPr>
+              <w:spacing w:before="20" w:after="20"/>
+            </w:pPr>
+            <w:r>
+              <w:rPr>
+                <w:rFonts w:ascii="Arial" w:hAnsi="Arial" w:eastAsia="Arial"/>
+                <w:color w:val="172033"/>
+                <w:sz w:val="13"/>
+              </w:rPr>
+              <w:t>12</w:t>
+            </w:r>
+          </w:p>
+        </w:tc>
+        <w:tc>
+          <w:tcPr>
+            <w:tcW w:type="dxa" w:w="1361"/>
+            <w:tcBorders>
+              <w:top w:val="single" w:sz="4" w:space="0" w:color="CBD5E1"/>
+              <w:left w:val="single" w:sz="4" w:space="0" w:color="CBD5E1"/>
+              <w:bottom w:val="single" w:sz="4" w:space="0" w:color="CBD5E1"/>
+              <w:right w:val="single" w:sz="4" w:space="0" w:color="CBD5E1"/>
+              <w:insideH w:val="single" w:sz="4" w:space="0" w:color="CBD5E1"/>
+              <w:insideV w:val="single" w:sz="4" w:space="0" w:color="CBD5E1"/>
+            </w:tcBorders>
+            <w:vAlign w:val="center"/>
+          </w:tcPr>
+          <w:p>
+            <w:pPr>
+              <w:spacing w:before="20" w:after="20"/>
+            </w:pPr>
+            <w:r>
+              <w:rPr>
+                <w:rFonts w:ascii="Arial" w:hAnsi="Arial" w:eastAsia="Arial"/>
+                <w:color w:val="172033"/>
+                <w:sz w:val="13"/>
+              </w:rPr>
+              <w:t>Diseño aplicación</w:t>
+            </w:r>
+          </w:p>
+        </w:tc>
+        <w:tc>
+          <w:tcPr>
+            <w:tcW w:type="dxa" w:w="1644"/>
+            <w:tcBorders>
+              <w:top w:val="single" w:sz="4" w:space="0" w:color="CBD5E1"/>
+              <w:left w:val="single" w:sz="4" w:space="0" w:color="CBD5E1"/>
+              <w:bottom w:val="single" w:sz="4" w:space="0" w:color="CBD5E1"/>
+              <w:right w:val="single" w:sz="4" w:space="0" w:color="CBD5E1"/>
+              <w:insideH w:val="single" w:sz="4" w:space="0" w:color="CBD5E1"/>
+              <w:insideV w:val="single" w:sz="4" w:space="0" w:color="CBD5E1"/>
+            </w:tcBorders>
+            <w:vAlign w:val="center"/>
+          </w:tcPr>
+          <w:p>
+            <w:pPr>
+              <w:spacing w:before="20" w:after="20"/>
+            </w:pPr>
+            <w:r>
+              <w:rPr>
+                <w:rFonts w:ascii="Arial" w:hAnsi="Arial" w:eastAsia="Arial"/>
+                <w:color w:val="172033"/>
+                <w:sz w:val="13"/>
+              </w:rPr>
+              <w:t>Planificación académica</w:t>
+            </w:r>
+          </w:p>
+        </w:tc>
+      </w:tr>
+      <w:tr>
+        <w:trPr>
+          <w:cantSplit/>
+        </w:trPr>
+        <w:tc>
+          <w:tcPr>
+            <w:tcW w:type="dxa" w:w="567"/>
+            <w:tcBorders>
+              <w:top w:val="single" w:sz="4" w:space="0" w:color="CBD5E1"/>
+              <w:left w:val="single" w:sz="4" w:space="0" w:color="CBD5E1"/>
+              <w:bottom w:val="single" w:sz="4" w:space="0" w:color="CBD5E1"/>
+              <w:right w:val="single" w:sz="4" w:space="0" w:color="CBD5E1"/>
+              <w:insideH w:val="single" w:sz="4" w:space="0" w:color="CBD5E1"/>
+              <w:insideV w:val="single" w:sz="4" w:space="0" w:color="CBD5E1"/>
+            </w:tcBorders>
+            <w:vAlign w:val="center"/>
+            <w:shd w:fill="F8FAFC"/>
+          </w:tcPr>
+          <w:p>
+            <w:pPr>
+              <w:spacing w:before="20" w:after="20"/>
+            </w:pPr>
+            <w:r>
+              <w:rPr>
+                <w:rFonts w:ascii="Arial" w:hAnsi="Arial" w:eastAsia="Arial"/>
+                <w:color w:val="172033"/>
+                <w:sz w:val="13"/>
+              </w:rPr>
+              <w:t>T06</w:t>
+            </w:r>
+          </w:p>
+        </w:tc>
+        <w:tc>
+          <w:tcPr>
+            <w:tcW w:type="dxa" w:w="2098"/>
+            <w:tcBorders>
+              <w:top w:val="single" w:sz="4" w:space="0" w:color="CBD5E1"/>
+              <w:left w:val="single" w:sz="4" w:space="0" w:color="CBD5E1"/>
+              <w:bottom w:val="single" w:sz="4" w:space="0" w:color="CBD5E1"/>
+              <w:right w:val="single" w:sz="4" w:space="0" w:color="CBD5E1"/>
+              <w:insideH w:val="single" w:sz="4" w:space="0" w:color="CBD5E1"/>
+              <w:insideV w:val="single" w:sz="4" w:space="0" w:color="CBD5E1"/>
+            </w:tcBorders>
+            <w:vAlign w:val="center"/>
+            <w:shd w:fill="F8FAFC"/>
+          </w:tcPr>
+          <w:p>
+            <w:pPr>
+              <w:spacing w:before="20" w:after="20"/>
+            </w:pPr>
+            <w:r>
+              <w:rPr>
+                <w:rFonts w:ascii="Arial" w:hAnsi="Arial" w:eastAsia="Arial"/>
+                <w:color w:val="172033"/>
+                <w:sz w:val="13"/>
+              </w:rPr>
+              <w:t>Modelo de datos</w:t>
+            </w:r>
+          </w:p>
+        </w:tc>
+        <w:tc>
+          <w:tcPr>
+            <w:tcW w:type="dxa" w:w="2098"/>
+            <w:tcBorders>
+              <w:top w:val="single" w:sz="4" w:space="0" w:color="CBD5E1"/>
+              <w:left w:val="single" w:sz="4" w:space="0" w:color="CBD5E1"/>
+              <w:bottom w:val="single" w:sz="4" w:space="0" w:color="CBD5E1"/>
+              <w:right w:val="single" w:sz="4" w:space="0" w:color="CBD5E1"/>
+              <w:insideH w:val="single" w:sz="4" w:space="0" w:color="CBD5E1"/>
+              <w:insideV w:val="single" w:sz="4" w:space="0" w:color="CBD5E1"/>
+            </w:tcBorders>
+            <w:vAlign w:val="center"/>
+            <w:shd w:fill="F8FAFC"/>
+          </w:tcPr>
+          <w:p>
+            <w:pPr>
+              <w:spacing w:before="20" w:after="20"/>
+            </w:pPr>
+            <w:r>
+              <w:rPr>
+                <w:rFonts w:ascii="Arial" w:hAnsi="Arial" w:eastAsia="Arial"/>
+                <w:color w:val="172033"/>
+                <w:sz w:val="13"/>
+              </w:rPr>
+              <w:t>Michelle Castro Otero</w:t>
+            </w:r>
+          </w:p>
+        </w:tc>
+        <w:tc>
+          <w:tcPr>
+            <w:tcW w:type="dxa" w:w="1077"/>
+            <w:tcBorders>
+              <w:top w:val="single" w:sz="4" w:space="0" w:color="CBD5E1"/>
+              <w:left w:val="single" w:sz="4" w:space="0" w:color="CBD5E1"/>
+              <w:bottom w:val="single" w:sz="4" w:space="0" w:color="CBD5E1"/>
+              <w:right w:val="single" w:sz="4" w:space="0" w:color="CBD5E1"/>
+              <w:insideH w:val="single" w:sz="4" w:space="0" w:color="CBD5E1"/>
+              <w:insideV w:val="single" w:sz="4" w:space="0" w:color="CBD5E1"/>
+            </w:tcBorders>
+            <w:vAlign w:val="center"/>
+            <w:shd w:fill="F8FAFC"/>
+          </w:tcPr>
+          <w:p>
+            <w:pPr>
+              <w:spacing w:before="20" w:after="20"/>
+            </w:pPr>
+            <w:r>
+              <w:rPr>
+                <w:rFonts w:ascii="Arial" w:hAnsi="Arial" w:eastAsia="Arial"/>
+                <w:color w:val="172033"/>
+                <w:sz w:val="13"/>
+              </w:rPr>
+              <w:t>22/06/2026</w:t>
+            </w:r>
+          </w:p>
+        </w:tc>
+        <w:tc>
+          <w:tcPr>
+            <w:tcW w:type="dxa" w:w="1077"/>
+            <w:tcBorders>
+              <w:top w:val="single" w:sz="4" w:space="0" w:color="CBD5E1"/>
+              <w:left w:val="single" w:sz="4" w:space="0" w:color="CBD5E1"/>
+              <w:bottom w:val="single" w:sz="4" w:space="0" w:color="CBD5E1"/>
+              <w:right w:val="single" w:sz="4" w:space="0" w:color="CBD5E1"/>
+              <w:insideH w:val="single" w:sz="4" w:space="0" w:color="CBD5E1"/>
+              <w:insideV w:val="single" w:sz="4" w:space="0" w:color="CBD5E1"/>
+            </w:tcBorders>
+            <w:vAlign w:val="center"/>
+            <w:shd w:fill="F8FAFC"/>
+          </w:tcPr>
+          <w:p>
+            <w:pPr>
+              <w:spacing w:before="20" w:after="20"/>
+            </w:pPr>
+            <w:r>
+              <w:rPr>
+                <w:rFonts w:ascii="Arial" w:hAnsi="Arial" w:eastAsia="Arial"/>
+                <w:color w:val="172033"/>
+                <w:sz w:val="13"/>
+              </w:rPr>
+              <w:t>03/07/2026</w:t>
+            </w:r>
+          </w:p>
+        </w:tc>
+        <w:tc>
+          <w:tcPr>
+            <w:tcW w:type="dxa" w:w="567"/>
+            <w:tcBorders>
+              <w:top w:val="single" w:sz="4" w:space="0" w:color="CBD5E1"/>
+              <w:left w:val="single" w:sz="4" w:space="0" w:color="CBD5E1"/>
+              <w:bottom w:val="single" w:sz="4" w:space="0" w:color="CBD5E1"/>
+              <w:right w:val="single" w:sz="4" w:space="0" w:color="CBD5E1"/>
+              <w:insideH w:val="single" w:sz="4" w:space="0" w:color="CBD5E1"/>
+              <w:insideV w:val="single" w:sz="4" w:space="0" w:color="CBD5E1"/>
+            </w:tcBorders>
+            <w:vAlign w:val="center"/>
+            <w:shd w:fill="F8FAFC"/>
+          </w:tcPr>
+          <w:p>
+            <w:pPr>
+              <w:spacing w:before="20" w:after="20"/>
+            </w:pPr>
+            <w:r>
+              <w:rPr>
+                <w:rFonts w:ascii="Arial" w:hAnsi="Arial" w:eastAsia="Arial"/>
+                <w:color w:val="172033"/>
+                <w:sz w:val="13"/>
+              </w:rPr>
+              <w:t>12</w:t>
+            </w:r>
+          </w:p>
+        </w:tc>
+        <w:tc>
+          <w:tcPr>
+            <w:tcW w:type="dxa" w:w="1361"/>
+            <w:tcBorders>
+              <w:top w:val="single" w:sz="4" w:space="0" w:color="CBD5E1"/>
+              <w:left w:val="single" w:sz="4" w:space="0" w:color="CBD5E1"/>
+              <w:bottom w:val="single" w:sz="4" w:space="0" w:color="CBD5E1"/>
+              <w:right w:val="single" w:sz="4" w:space="0" w:color="CBD5E1"/>
+              <w:insideH w:val="single" w:sz="4" w:space="0" w:color="CBD5E1"/>
+              <w:insideV w:val="single" w:sz="4" w:space="0" w:color="CBD5E1"/>
+            </w:tcBorders>
+            <w:vAlign w:val="center"/>
+            <w:shd w:fill="F8FAFC"/>
+          </w:tcPr>
+          <w:p>
+            <w:pPr>
+              <w:spacing w:before="20" w:after="20"/>
+            </w:pPr>
+            <w:r>
+              <w:rPr>
+                <w:rFonts w:ascii="Arial" w:hAnsi="Arial" w:eastAsia="Arial"/>
+                <w:color w:val="172033"/>
+                <w:sz w:val="13"/>
+              </w:rPr>
+              <w:t>Requerimientos</w:t>
+            </w:r>
+          </w:p>
+        </w:tc>
+        <w:tc>
+          <w:tcPr>
+            <w:tcW w:type="dxa" w:w="1644"/>
+            <w:tcBorders>
+              <w:top w:val="single" w:sz="4" w:space="0" w:color="CBD5E1"/>
+              <w:left w:val="single" w:sz="4" w:space="0" w:color="CBD5E1"/>
+              <w:bottom w:val="single" w:sz="4" w:space="0" w:color="CBD5E1"/>
+              <w:right w:val="single" w:sz="4" w:space="0" w:color="CBD5E1"/>
+              <w:insideH w:val="single" w:sz="4" w:space="0" w:color="CBD5E1"/>
+              <w:insideV w:val="single" w:sz="4" w:space="0" w:color="CBD5E1"/>
+            </w:tcBorders>
+            <w:vAlign w:val="center"/>
+            <w:shd w:fill="F8FAFC"/>
+          </w:tcPr>
+          <w:p>
+            <w:pPr>
+              <w:spacing w:before="20" w:after="20"/>
+            </w:pPr>
+            <w:r>
+              <w:rPr>
+                <w:rFonts w:ascii="Arial" w:hAnsi="Arial" w:eastAsia="Arial"/>
+                <w:color w:val="172033"/>
+                <w:sz w:val="13"/>
+              </w:rPr>
+              <w:t>Planificación académica</w:t>
+            </w:r>
+          </w:p>
+        </w:tc>
+      </w:tr>
+      <w:tr>
+        <w:trPr>
+          <w:cantSplit/>
+        </w:trPr>
+        <w:tc>
+          <w:tcPr>
+            <w:tcW w:type="dxa" w:w="567"/>
+            <w:tcBorders>
+              <w:top w:val="single" w:sz="4" w:space="0" w:color="CBD5E1"/>
+              <w:left w:val="single" w:sz="4" w:space="0" w:color="CBD5E1"/>
+              <w:bottom w:val="single" w:sz="4" w:space="0" w:color="CBD5E1"/>
+              <w:right w:val="single" w:sz="4" w:space="0" w:color="CBD5E1"/>
+              <w:insideH w:val="single" w:sz="4" w:space="0" w:color="CBD5E1"/>
+              <w:insideV w:val="single" w:sz="4" w:space="0" w:color="CBD5E1"/>
+            </w:tcBorders>
+            <w:vAlign w:val="center"/>
+          </w:tcPr>
+          <w:p>
+            <w:pPr>
+              <w:spacing w:before="20" w:after="20"/>
+            </w:pPr>
+            <w:r>
+              <w:rPr>
+                <w:rFonts w:ascii="Arial" w:hAnsi="Arial" w:eastAsia="Arial"/>
+                <w:color w:val="172033"/>
+                <w:sz w:val="13"/>
+              </w:rPr>
+              <w:t>T07</w:t>
+            </w:r>
+          </w:p>
+        </w:tc>
+        <w:tc>
+          <w:tcPr>
+            <w:tcW w:type="dxa" w:w="2098"/>
+            <w:tcBorders>
+              <w:top w:val="single" w:sz="4" w:space="0" w:color="CBD5E1"/>
+              <w:left w:val="single" w:sz="4" w:space="0" w:color="CBD5E1"/>
+              <w:bottom w:val="single" w:sz="4" w:space="0" w:color="CBD5E1"/>
+              <w:right w:val="single" w:sz="4" w:space="0" w:color="CBD5E1"/>
+              <w:insideH w:val="single" w:sz="4" w:space="0" w:color="CBD5E1"/>
+              <w:insideV w:val="single" w:sz="4" w:space="0" w:color="CBD5E1"/>
+            </w:tcBorders>
+            <w:vAlign w:val="center"/>
+          </w:tcPr>
+          <w:p>
+            <w:pPr>
+              <w:spacing w:before="20" w:after="20"/>
+            </w:pPr>
+            <w:r>
+              <w:rPr>
+                <w:rFonts w:ascii="Arial" w:hAnsi="Arial" w:eastAsia="Arial"/>
+                <w:color w:val="172033"/>
+                <w:sz w:val="13"/>
+              </w:rPr>
+              <w:t>Servicios backend</w:t>
+            </w:r>
+          </w:p>
+        </w:tc>
+        <w:tc>
+          <w:tcPr>
+            <w:tcW w:type="dxa" w:w="2098"/>
+            <w:tcBorders>
+              <w:top w:val="single" w:sz="4" w:space="0" w:color="CBD5E1"/>
+              <w:left w:val="single" w:sz="4" w:space="0" w:color="CBD5E1"/>
+              <w:bottom w:val="single" w:sz="4" w:space="0" w:color="CBD5E1"/>
+              <w:right w:val="single" w:sz="4" w:space="0" w:color="CBD5E1"/>
+              <w:insideH w:val="single" w:sz="4" w:space="0" w:color="CBD5E1"/>
+              <w:insideV w:val="single" w:sz="4" w:space="0" w:color="CBD5E1"/>
+            </w:tcBorders>
+            <w:vAlign w:val="center"/>
+          </w:tcPr>
+          <w:p>
+            <w:pPr>
+              <w:spacing w:before="20" w:after="20"/>
+            </w:pPr>
+            <w:r>
+              <w:rPr>
+                <w:rFonts w:ascii="Arial" w:hAnsi="Arial" w:eastAsia="Arial"/>
+                <w:color w:val="172033"/>
+                <w:sz w:val="13"/>
+              </w:rPr>
+              <w:t>Carlos Daniel Garcia Pluma / Jennifer Bautista Barrios</w:t>
+            </w:r>
+          </w:p>
+        </w:tc>
+        <w:tc>
+          <w:tcPr>
+            <w:tcW w:type="dxa" w:w="1077"/>
+            <w:tcBorders>
+              <w:top w:val="single" w:sz="4" w:space="0" w:color="CBD5E1"/>
+              <w:left w:val="single" w:sz="4" w:space="0" w:color="CBD5E1"/>
+              <w:bottom w:val="single" w:sz="4" w:space="0" w:color="CBD5E1"/>
+              <w:right w:val="single" w:sz="4" w:space="0" w:color="CBD5E1"/>
+              <w:insideH w:val="single" w:sz="4" w:space="0" w:color="CBD5E1"/>
+              <w:insideV w:val="single" w:sz="4" w:space="0" w:color="CBD5E1"/>
+            </w:tcBorders>
+            <w:vAlign w:val="center"/>
+          </w:tcPr>
+          <w:p>
+            <w:pPr>
+              <w:spacing w:before="20" w:after="20"/>
+            </w:pPr>
+            <w:r>
+              <w:rPr>
+                <w:rFonts w:ascii="Arial" w:hAnsi="Arial" w:eastAsia="Arial"/>
+                <w:color w:val="172033"/>
+                <w:sz w:val="13"/>
+              </w:rPr>
+              <w:t>29/06/2026</w:t>
+            </w:r>
+          </w:p>
+        </w:tc>
+        <w:tc>
+          <w:tcPr>
+            <w:tcW w:type="dxa" w:w="1077"/>
+            <w:tcBorders>
+              <w:top w:val="single" w:sz="4" w:space="0" w:color="CBD5E1"/>
+              <w:left w:val="single" w:sz="4" w:space="0" w:color="CBD5E1"/>
+              <w:bottom w:val="single" w:sz="4" w:space="0" w:color="CBD5E1"/>
+              <w:right w:val="single" w:sz="4" w:space="0" w:color="CBD5E1"/>
+              <w:insideH w:val="single" w:sz="4" w:space="0" w:color="CBD5E1"/>
+              <w:insideV w:val="single" w:sz="4" w:space="0" w:color="CBD5E1"/>
+            </w:tcBorders>
+            <w:vAlign w:val="center"/>
+          </w:tcPr>
+          <w:p>
+            <w:pPr>
+              <w:spacing w:before="20" w:after="20"/>
+            </w:pPr>
+            <w:r>
+              <w:rPr>
+                <w:rFonts w:ascii="Arial" w:hAnsi="Arial" w:eastAsia="Arial"/>
+                <w:color w:val="172033"/>
+                <w:sz w:val="13"/>
+              </w:rPr>
+              <w:t>17/07/2026</w:t>
+            </w:r>
+          </w:p>
+        </w:tc>
+        <w:tc>
+          <w:tcPr>
+            <w:tcW w:type="dxa" w:w="567"/>
+            <w:tcBorders>
+              <w:top w:val="single" w:sz="4" w:space="0" w:color="CBD5E1"/>
+              <w:left w:val="single" w:sz="4" w:space="0" w:color="CBD5E1"/>
+              <w:bottom w:val="single" w:sz="4" w:space="0" w:color="CBD5E1"/>
+              <w:right w:val="single" w:sz="4" w:space="0" w:color="CBD5E1"/>
+              <w:insideH w:val="single" w:sz="4" w:space="0" w:color="CBD5E1"/>
+              <w:insideV w:val="single" w:sz="4" w:space="0" w:color="CBD5E1"/>
+            </w:tcBorders>
+            <w:vAlign w:val="center"/>
+          </w:tcPr>
+          <w:p>
+            <w:pPr>
+              <w:spacing w:before="20" w:after="20"/>
+            </w:pPr>
+            <w:r>
+              <w:rPr>
+                <w:rFonts w:ascii="Arial" w:hAnsi="Arial" w:eastAsia="Arial"/>
+                <w:color w:val="172033"/>
+                <w:sz w:val="13"/>
+              </w:rPr>
+              <w:t>19</w:t>
+            </w:r>
+          </w:p>
+        </w:tc>
+        <w:tc>
+          <w:tcPr>
+            <w:tcW w:type="dxa" w:w="1361"/>
+            <w:tcBorders>
+              <w:top w:val="single" w:sz="4" w:space="0" w:color="CBD5E1"/>
+              <w:left w:val="single" w:sz="4" w:space="0" w:color="CBD5E1"/>
+              <w:bottom w:val="single" w:sz="4" w:space="0" w:color="CBD5E1"/>
+              <w:right w:val="single" w:sz="4" w:space="0" w:color="CBD5E1"/>
+              <w:insideH w:val="single" w:sz="4" w:space="0" w:color="CBD5E1"/>
+              <w:insideV w:val="single" w:sz="4" w:space="0" w:color="CBD5E1"/>
+            </w:tcBorders>
+            <w:vAlign w:val="center"/>
+          </w:tcPr>
+          <w:p>
+            <w:pPr>
+              <w:spacing w:before="20" w:after="20"/>
+            </w:pPr>
+            <w:r>
+              <w:rPr>
+                <w:rFonts w:ascii="Arial" w:hAnsi="Arial" w:eastAsia="Arial"/>
+                <w:color w:val="172033"/>
+                <w:sz w:val="13"/>
+              </w:rPr>
+              <w:t>Modelo de datos</w:t>
+            </w:r>
+          </w:p>
+        </w:tc>
+        <w:tc>
+          <w:tcPr>
+            <w:tcW w:type="dxa" w:w="1644"/>
+            <w:tcBorders>
+              <w:top w:val="single" w:sz="4" w:space="0" w:color="CBD5E1"/>
+              <w:left w:val="single" w:sz="4" w:space="0" w:color="CBD5E1"/>
+              <w:bottom w:val="single" w:sz="4" w:space="0" w:color="CBD5E1"/>
+              <w:right w:val="single" w:sz="4" w:space="0" w:color="CBD5E1"/>
+              <w:insideH w:val="single" w:sz="4" w:space="0" w:color="CBD5E1"/>
+              <w:insideV w:val="single" w:sz="4" w:space="0" w:color="CBD5E1"/>
+            </w:tcBorders>
+            <w:vAlign w:val="center"/>
+          </w:tcPr>
+          <w:p>
+            <w:pPr>
+              <w:spacing w:before="20" w:after="20"/>
+            </w:pPr>
+            <w:r>
+              <w:rPr>
+                <w:rFonts w:ascii="Arial" w:hAnsi="Arial" w:eastAsia="Arial"/>
+                <w:color w:val="172033"/>
+                <w:sz w:val="13"/>
+              </w:rPr>
+              <w:t>Planificación académica</w:t>
+            </w:r>
+          </w:p>
+        </w:tc>
+      </w:tr>
+      <w:tr>
+        <w:trPr>
+          <w:cantSplit/>
+        </w:trPr>
+        <w:tc>
+          <w:tcPr>
+            <w:tcW w:type="dxa" w:w="567"/>
+            <w:tcBorders>
+              <w:top w:val="single" w:sz="4" w:space="0" w:color="CBD5E1"/>
+              <w:left w:val="single" w:sz="4" w:space="0" w:color="CBD5E1"/>
+              <w:bottom w:val="single" w:sz="4" w:space="0" w:color="CBD5E1"/>
+              <w:right w:val="single" w:sz="4" w:space="0" w:color="CBD5E1"/>
+              <w:insideH w:val="single" w:sz="4" w:space="0" w:color="CBD5E1"/>
+              <w:insideV w:val="single" w:sz="4" w:space="0" w:color="CBD5E1"/>
+            </w:tcBorders>
+            <w:vAlign w:val="center"/>
+            <w:shd w:fill="F8FAFC"/>
+          </w:tcPr>
+          <w:p>
+            <w:pPr>
+              <w:spacing w:before="20" w:after="20"/>
+            </w:pPr>
+            <w:r>
+              <w:rPr>
+                <w:rFonts w:ascii="Arial" w:hAnsi="Arial" w:eastAsia="Arial"/>
+                <w:color w:val="172033"/>
+                <w:sz w:val="13"/>
+              </w:rPr>
+              <w:t>T08</w:t>
+            </w:r>
+          </w:p>
+        </w:tc>
+        <w:tc>
+          <w:tcPr>
+            <w:tcW w:type="dxa" w:w="2098"/>
+            <w:tcBorders>
+              <w:top w:val="single" w:sz="4" w:space="0" w:color="CBD5E1"/>
+              <w:left w:val="single" w:sz="4" w:space="0" w:color="CBD5E1"/>
+              <w:bottom w:val="single" w:sz="4" w:space="0" w:color="CBD5E1"/>
+              <w:right w:val="single" w:sz="4" w:space="0" w:color="CBD5E1"/>
+              <w:insideH w:val="single" w:sz="4" w:space="0" w:color="CBD5E1"/>
+              <w:insideV w:val="single" w:sz="4" w:space="0" w:color="CBD5E1"/>
+            </w:tcBorders>
+            <w:vAlign w:val="center"/>
+            <w:shd w:fill="F8FAFC"/>
+          </w:tcPr>
+          <w:p>
+            <w:pPr>
+              <w:spacing w:before="20" w:after="20"/>
+            </w:pPr>
+            <w:r>
+              <w:rPr>
+                <w:rFonts w:ascii="Arial" w:hAnsi="Arial" w:eastAsia="Arial"/>
+                <w:color w:val="172033"/>
+                <w:sz w:val="13"/>
+              </w:rPr>
+              <w:t>Sincronización con smartwatch</w:t>
+            </w:r>
+          </w:p>
+        </w:tc>
+        <w:tc>
+          <w:tcPr>
+            <w:tcW w:type="dxa" w:w="2098"/>
+            <w:tcBorders>
+              <w:top w:val="single" w:sz="4" w:space="0" w:color="CBD5E1"/>
+              <w:left w:val="single" w:sz="4" w:space="0" w:color="CBD5E1"/>
+              <w:bottom w:val="single" w:sz="4" w:space="0" w:color="CBD5E1"/>
+              <w:right w:val="single" w:sz="4" w:space="0" w:color="CBD5E1"/>
+              <w:insideH w:val="single" w:sz="4" w:space="0" w:color="CBD5E1"/>
+              <w:insideV w:val="single" w:sz="4" w:space="0" w:color="CBD5E1"/>
+            </w:tcBorders>
+            <w:vAlign w:val="center"/>
+            <w:shd w:fill="F8FAFC"/>
+          </w:tcPr>
+          <w:p>
+            <w:pPr>
+              <w:spacing w:before="20" w:after="20"/>
+            </w:pPr>
+            <w:r>
+              <w:rPr>
+                <w:rFonts w:ascii="Arial" w:hAnsi="Arial" w:eastAsia="Arial"/>
+                <w:color w:val="172033"/>
+                <w:sz w:val="13"/>
+              </w:rPr>
+              <w:t>Carlos Daniel Garcia Pluma / Jennifer Bautista Barrios</w:t>
+            </w:r>
+          </w:p>
+        </w:tc>
+        <w:tc>
+          <w:tcPr>
+            <w:tcW w:type="dxa" w:w="1077"/>
+            <w:tcBorders>
+              <w:top w:val="single" w:sz="4" w:space="0" w:color="CBD5E1"/>
+              <w:left w:val="single" w:sz="4" w:space="0" w:color="CBD5E1"/>
+              <w:bottom w:val="single" w:sz="4" w:space="0" w:color="CBD5E1"/>
+              <w:right w:val="single" w:sz="4" w:space="0" w:color="CBD5E1"/>
+              <w:insideH w:val="single" w:sz="4" w:space="0" w:color="CBD5E1"/>
+              <w:insideV w:val="single" w:sz="4" w:space="0" w:color="CBD5E1"/>
+            </w:tcBorders>
+            <w:vAlign w:val="center"/>
+            <w:shd w:fill="F8FAFC"/>
+          </w:tcPr>
+          <w:p>
+            <w:pPr>
+              <w:spacing w:before="20" w:after="20"/>
+            </w:pPr>
+            <w:r>
+              <w:rPr>
+                <w:rFonts w:ascii="Arial" w:hAnsi="Arial" w:eastAsia="Arial"/>
+                <w:color w:val="172033"/>
+                <w:sz w:val="13"/>
+              </w:rPr>
+              <w:t>06/07/2026</w:t>
+            </w:r>
+          </w:p>
+        </w:tc>
+        <w:tc>
+          <w:tcPr>
+            <w:tcW w:type="dxa" w:w="1077"/>
+            <w:tcBorders>
+              <w:top w:val="single" w:sz="4" w:space="0" w:color="CBD5E1"/>
+              <w:left w:val="single" w:sz="4" w:space="0" w:color="CBD5E1"/>
+              <w:bottom w:val="single" w:sz="4" w:space="0" w:color="CBD5E1"/>
+              <w:right w:val="single" w:sz="4" w:space="0" w:color="CBD5E1"/>
+              <w:insideH w:val="single" w:sz="4" w:space="0" w:color="CBD5E1"/>
+              <w:insideV w:val="single" w:sz="4" w:space="0" w:color="CBD5E1"/>
+            </w:tcBorders>
+            <w:vAlign w:val="center"/>
+            <w:shd w:fill="F8FAFC"/>
+          </w:tcPr>
+          <w:p>
+            <w:pPr>
+              <w:spacing w:before="20" w:after="20"/>
+            </w:pPr>
+            <w:r>
+              <w:rPr>
+                <w:rFonts w:ascii="Arial" w:hAnsi="Arial" w:eastAsia="Arial"/>
+                <w:color w:val="172033"/>
+                <w:sz w:val="13"/>
+              </w:rPr>
+              <w:t>24/07/2026</w:t>
+            </w:r>
+          </w:p>
+        </w:tc>
+        <w:tc>
+          <w:tcPr>
+            <w:tcW w:type="dxa" w:w="567"/>
+            <w:tcBorders>
+              <w:top w:val="single" w:sz="4" w:space="0" w:color="CBD5E1"/>
+              <w:left w:val="single" w:sz="4" w:space="0" w:color="CBD5E1"/>
+              <w:bottom w:val="single" w:sz="4" w:space="0" w:color="CBD5E1"/>
+              <w:right w:val="single" w:sz="4" w:space="0" w:color="CBD5E1"/>
+              <w:insideH w:val="single" w:sz="4" w:space="0" w:color="CBD5E1"/>
+              <w:insideV w:val="single" w:sz="4" w:space="0" w:color="CBD5E1"/>
+            </w:tcBorders>
+            <w:vAlign w:val="center"/>
+            <w:shd w:fill="F8FAFC"/>
+          </w:tcPr>
+          <w:p>
+            <w:pPr>
+              <w:spacing w:before="20" w:after="20"/>
+            </w:pPr>
+            <w:r>
+              <w:rPr>
+                <w:rFonts w:ascii="Arial" w:hAnsi="Arial" w:eastAsia="Arial"/>
+                <w:color w:val="172033"/>
+                <w:sz w:val="13"/>
+              </w:rPr>
+              <w:t>19</w:t>
+            </w:r>
+          </w:p>
+        </w:tc>
+        <w:tc>
+          <w:tcPr>
+            <w:tcW w:type="dxa" w:w="1361"/>
+            <w:tcBorders>
+              <w:top w:val="single" w:sz="4" w:space="0" w:color="CBD5E1"/>
+              <w:left w:val="single" w:sz="4" w:space="0" w:color="CBD5E1"/>
+              <w:bottom w:val="single" w:sz="4" w:space="0" w:color="CBD5E1"/>
+              <w:right w:val="single" w:sz="4" w:space="0" w:color="CBD5E1"/>
+              <w:insideH w:val="single" w:sz="4" w:space="0" w:color="CBD5E1"/>
+              <w:insideV w:val="single" w:sz="4" w:space="0" w:color="CBD5E1"/>
+            </w:tcBorders>
+            <w:vAlign w:val="center"/>
+            <w:shd w:fill="F8FAFC"/>
+          </w:tcPr>
+          <w:p>
+            <w:pPr>
+              <w:spacing w:before="20" w:after="20"/>
+            </w:pPr>
+            <w:r>
+              <w:rPr>
+                <w:rFonts w:ascii="Arial" w:hAnsi="Arial" w:eastAsia="Arial"/>
+                <w:color w:val="172033"/>
+                <w:sz w:val="13"/>
+              </w:rPr>
+              <w:t>Backend / selección wearable</w:t>
+            </w:r>
+          </w:p>
+        </w:tc>
+        <w:tc>
+          <w:tcPr>
+            <w:tcW w:type="dxa" w:w="1644"/>
+            <w:tcBorders>
+              <w:top w:val="single" w:sz="4" w:space="0" w:color="CBD5E1"/>
+              <w:left w:val="single" w:sz="4" w:space="0" w:color="CBD5E1"/>
+              <w:bottom w:val="single" w:sz="4" w:space="0" w:color="CBD5E1"/>
+              <w:right w:val="single" w:sz="4" w:space="0" w:color="CBD5E1"/>
+              <w:insideH w:val="single" w:sz="4" w:space="0" w:color="CBD5E1"/>
+              <w:insideV w:val="single" w:sz="4" w:space="0" w:color="CBD5E1"/>
+            </w:tcBorders>
+            <w:vAlign w:val="center"/>
+            <w:shd w:fill="F8FAFC"/>
+          </w:tcPr>
+          <w:p>
+            <w:pPr>
+              <w:spacing w:before="20" w:after="20"/>
+            </w:pPr>
+            <w:r>
+              <w:rPr>
+                <w:rFonts w:ascii="Arial" w:hAnsi="Arial" w:eastAsia="Arial"/>
+                <w:color w:val="172033"/>
+                <w:sz w:val="13"/>
+              </w:rPr>
+              <w:t>Planificación académica</w:t>
+            </w:r>
+          </w:p>
+        </w:tc>
+      </w:tr>
+      <w:tr>
+        <w:trPr>
+          <w:cantSplit/>
+        </w:trPr>
+        <w:tc>
+          <w:tcPr>
+            <w:tcW w:type="dxa" w:w="567"/>
+            <w:tcBorders>
+              <w:top w:val="single" w:sz="4" w:space="0" w:color="CBD5E1"/>
+              <w:left w:val="single" w:sz="4" w:space="0" w:color="CBD5E1"/>
+              <w:bottom w:val="single" w:sz="4" w:space="0" w:color="CBD5E1"/>
+              <w:right w:val="single" w:sz="4" w:space="0" w:color="CBD5E1"/>
+              <w:insideH w:val="single" w:sz="4" w:space="0" w:color="CBD5E1"/>
+              <w:insideV w:val="single" w:sz="4" w:space="0" w:color="CBD5E1"/>
+            </w:tcBorders>
+            <w:vAlign w:val="center"/>
+          </w:tcPr>
+          <w:p>
+            <w:pPr>
+              <w:spacing w:before="20" w:after="20"/>
+            </w:pPr>
+            <w:r>
+              <w:rPr>
+                <w:rFonts w:ascii="Arial" w:hAnsi="Arial" w:eastAsia="Arial"/>
+                <w:color w:val="172033"/>
+                <w:sz w:val="13"/>
+              </w:rPr>
+              <w:t>T09</w:t>
+            </w:r>
+          </w:p>
+        </w:tc>
+        <w:tc>
+          <w:tcPr>
+            <w:tcW w:type="dxa" w:w="2098"/>
+            <w:tcBorders>
+              <w:top w:val="single" w:sz="4" w:space="0" w:color="CBD5E1"/>
+              <w:left w:val="single" w:sz="4" w:space="0" w:color="CBD5E1"/>
+              <w:bottom w:val="single" w:sz="4" w:space="0" w:color="CBD5E1"/>
+              <w:right w:val="single" w:sz="4" w:space="0" w:color="CBD5E1"/>
+              <w:insideH w:val="single" w:sz="4" w:space="0" w:color="CBD5E1"/>
+              <w:insideV w:val="single" w:sz="4" w:space="0" w:color="CBD5E1"/>
+            </w:tcBorders>
+            <w:vAlign w:val="center"/>
+          </w:tcPr>
+          <w:p>
+            <w:pPr>
+              <w:spacing w:before="20" w:after="20"/>
+            </w:pPr>
+            <w:r>
+              <w:rPr>
+                <w:rFonts w:ascii="Arial" w:hAnsi="Arial" w:eastAsia="Arial"/>
+                <w:color w:val="172033"/>
+                <w:sz w:val="13"/>
+              </w:rPr>
+              <w:t>Visualización de mediciones</w:t>
+            </w:r>
+          </w:p>
+        </w:tc>
+        <w:tc>
+          <w:tcPr>
+            <w:tcW w:type="dxa" w:w="2098"/>
+            <w:tcBorders>
+              <w:top w:val="single" w:sz="4" w:space="0" w:color="CBD5E1"/>
+              <w:left w:val="single" w:sz="4" w:space="0" w:color="CBD5E1"/>
+              <w:bottom w:val="single" w:sz="4" w:space="0" w:color="CBD5E1"/>
+              <w:right w:val="single" w:sz="4" w:space="0" w:color="CBD5E1"/>
+              <w:insideH w:val="single" w:sz="4" w:space="0" w:color="CBD5E1"/>
+              <w:insideV w:val="single" w:sz="4" w:space="0" w:color="CBD5E1"/>
+            </w:tcBorders>
+            <w:vAlign w:val="center"/>
+          </w:tcPr>
+          <w:p>
+            <w:pPr>
+              <w:spacing w:before="20" w:after="20"/>
+            </w:pPr>
+            <w:r>
+              <w:rPr>
+                <w:rFonts w:ascii="Arial" w:hAnsi="Arial" w:eastAsia="Arial"/>
+                <w:color w:val="172033"/>
+                <w:sz w:val="13"/>
+              </w:rPr>
+              <w:t>Yazmin Gutierrez Hernandez</w:t>
+            </w:r>
+          </w:p>
+        </w:tc>
+        <w:tc>
+          <w:tcPr>
+            <w:tcW w:type="dxa" w:w="1077"/>
+            <w:tcBorders>
+              <w:top w:val="single" w:sz="4" w:space="0" w:color="CBD5E1"/>
+              <w:left w:val="single" w:sz="4" w:space="0" w:color="CBD5E1"/>
+              <w:bottom w:val="single" w:sz="4" w:space="0" w:color="CBD5E1"/>
+              <w:right w:val="single" w:sz="4" w:space="0" w:color="CBD5E1"/>
+              <w:insideH w:val="single" w:sz="4" w:space="0" w:color="CBD5E1"/>
+              <w:insideV w:val="single" w:sz="4" w:space="0" w:color="CBD5E1"/>
+            </w:tcBorders>
+            <w:vAlign w:val="center"/>
+          </w:tcPr>
+          <w:p>
+            <w:pPr>
+              <w:spacing w:before="20" w:after="20"/>
+            </w:pPr>
+            <w:r>
+              <w:rPr>
+                <w:rFonts w:ascii="Arial" w:hAnsi="Arial" w:eastAsia="Arial"/>
+                <w:color w:val="172033"/>
+                <w:sz w:val="13"/>
+              </w:rPr>
+              <w:t>13/07/2026</w:t>
+            </w:r>
+          </w:p>
+        </w:tc>
+        <w:tc>
+          <w:tcPr>
+            <w:tcW w:type="dxa" w:w="1077"/>
+            <w:tcBorders>
+              <w:top w:val="single" w:sz="4" w:space="0" w:color="CBD5E1"/>
+              <w:left w:val="single" w:sz="4" w:space="0" w:color="CBD5E1"/>
+              <w:bottom w:val="single" w:sz="4" w:space="0" w:color="CBD5E1"/>
+              <w:right w:val="single" w:sz="4" w:space="0" w:color="CBD5E1"/>
+              <w:insideH w:val="single" w:sz="4" w:space="0" w:color="CBD5E1"/>
+              <w:insideV w:val="single" w:sz="4" w:space="0" w:color="CBD5E1"/>
+            </w:tcBorders>
+            <w:vAlign w:val="center"/>
+          </w:tcPr>
+          <w:p>
+            <w:pPr>
+              <w:spacing w:before="20" w:after="20"/>
+            </w:pPr>
+            <w:r>
+              <w:rPr>
+                <w:rFonts w:ascii="Arial" w:hAnsi="Arial" w:eastAsia="Arial"/>
+                <w:color w:val="172033"/>
+                <w:sz w:val="13"/>
+              </w:rPr>
+              <w:t>31/07/2026</w:t>
+            </w:r>
+          </w:p>
+        </w:tc>
+        <w:tc>
+          <w:tcPr>
+            <w:tcW w:type="dxa" w:w="567"/>
+            <w:tcBorders>
+              <w:top w:val="single" w:sz="4" w:space="0" w:color="CBD5E1"/>
+              <w:left w:val="single" w:sz="4" w:space="0" w:color="CBD5E1"/>
+              <w:bottom w:val="single" w:sz="4" w:space="0" w:color="CBD5E1"/>
+              <w:right w:val="single" w:sz="4" w:space="0" w:color="CBD5E1"/>
+              <w:insideH w:val="single" w:sz="4" w:space="0" w:color="CBD5E1"/>
+              <w:insideV w:val="single" w:sz="4" w:space="0" w:color="CBD5E1"/>
+            </w:tcBorders>
+            <w:vAlign w:val="center"/>
+          </w:tcPr>
+          <w:p>
+            <w:pPr>
+              <w:spacing w:before="20" w:after="20"/>
+            </w:pPr>
+            <w:r>
+              <w:rPr>
+                <w:rFonts w:ascii="Arial" w:hAnsi="Arial" w:eastAsia="Arial"/>
+                <w:color w:val="172033"/>
+                <w:sz w:val="13"/>
+              </w:rPr>
+              <w:t>19</w:t>
+            </w:r>
+          </w:p>
+        </w:tc>
+        <w:tc>
+          <w:tcPr>
+            <w:tcW w:type="dxa" w:w="1361"/>
+            <w:tcBorders>
+              <w:top w:val="single" w:sz="4" w:space="0" w:color="CBD5E1"/>
+              <w:left w:val="single" w:sz="4" w:space="0" w:color="CBD5E1"/>
+              <w:bottom w:val="single" w:sz="4" w:space="0" w:color="CBD5E1"/>
+              <w:right w:val="single" w:sz="4" w:space="0" w:color="CBD5E1"/>
+              <w:insideH w:val="single" w:sz="4" w:space="0" w:color="CBD5E1"/>
+              <w:insideV w:val="single" w:sz="4" w:space="0" w:color="CBD5E1"/>
+            </w:tcBorders>
+            <w:vAlign w:val="center"/>
+          </w:tcPr>
+          <w:p>
+            <w:pPr>
+              <w:spacing w:before="20" w:after="20"/>
+            </w:pPr>
+            <w:r>
+              <w:rPr>
+                <w:rFonts w:ascii="Arial" w:hAnsi="Arial" w:eastAsia="Arial"/>
+                <w:color w:val="172033"/>
+                <w:sz w:val="13"/>
+              </w:rPr>
+              <w:t>Datos / diseño</w:t>
+            </w:r>
+          </w:p>
+        </w:tc>
+        <w:tc>
+          <w:tcPr>
+            <w:tcW w:type="dxa" w:w="1644"/>
+            <w:tcBorders>
+              <w:top w:val="single" w:sz="4" w:space="0" w:color="CBD5E1"/>
+              <w:left w:val="single" w:sz="4" w:space="0" w:color="CBD5E1"/>
+              <w:bottom w:val="single" w:sz="4" w:space="0" w:color="CBD5E1"/>
+              <w:right w:val="single" w:sz="4" w:space="0" w:color="CBD5E1"/>
+              <w:insideH w:val="single" w:sz="4" w:space="0" w:color="CBD5E1"/>
+              <w:insideV w:val="single" w:sz="4" w:space="0" w:color="CBD5E1"/>
+            </w:tcBorders>
+            <w:vAlign w:val="center"/>
+          </w:tcPr>
+          <w:p>
+            <w:pPr>
+              <w:spacing w:before="20" w:after="20"/>
+            </w:pPr>
+            <w:r>
+              <w:rPr>
+                <w:rFonts w:ascii="Arial" w:hAnsi="Arial" w:eastAsia="Arial"/>
+                <w:color w:val="172033"/>
+                <w:sz w:val="13"/>
+              </w:rPr>
+              <w:t>Planificación académica</w:t>
+            </w:r>
+          </w:p>
+        </w:tc>
+      </w:tr>
+      <w:tr>
+        <w:trPr>
+          <w:cantSplit/>
+        </w:trPr>
+        <w:tc>
+          <w:tcPr>
+            <w:tcW w:type="dxa" w:w="567"/>
+            <w:tcBorders>
+              <w:top w:val="single" w:sz="4" w:space="0" w:color="CBD5E1"/>
+              <w:left w:val="single" w:sz="4" w:space="0" w:color="CBD5E1"/>
+              <w:bottom w:val="single" w:sz="4" w:space="0" w:color="CBD5E1"/>
+              <w:right w:val="single" w:sz="4" w:space="0" w:color="CBD5E1"/>
+              <w:insideH w:val="single" w:sz="4" w:space="0" w:color="CBD5E1"/>
+              <w:insideV w:val="single" w:sz="4" w:space="0" w:color="CBD5E1"/>
+            </w:tcBorders>
+            <w:vAlign w:val="center"/>
+            <w:shd w:fill="F8FAFC"/>
+          </w:tcPr>
+          <w:p>
+            <w:pPr>
+              <w:spacing w:before="20" w:after="20"/>
+            </w:pPr>
+            <w:r>
+              <w:rPr>
+                <w:rFonts w:ascii="Arial" w:hAnsi="Arial" w:eastAsia="Arial"/>
+                <w:color w:val="172033"/>
+                <w:sz w:val="13"/>
+              </w:rPr>
+              <w:t>T10</w:t>
+            </w:r>
+          </w:p>
+        </w:tc>
+        <w:tc>
+          <w:tcPr>
+            <w:tcW w:type="dxa" w:w="2098"/>
+            <w:tcBorders>
+              <w:top w:val="single" w:sz="4" w:space="0" w:color="CBD5E1"/>
+              <w:left w:val="single" w:sz="4" w:space="0" w:color="CBD5E1"/>
+              <w:bottom w:val="single" w:sz="4" w:space="0" w:color="CBD5E1"/>
+              <w:right w:val="single" w:sz="4" w:space="0" w:color="CBD5E1"/>
+              <w:insideH w:val="single" w:sz="4" w:space="0" w:color="CBD5E1"/>
+              <w:insideV w:val="single" w:sz="4" w:space="0" w:color="CBD5E1"/>
+            </w:tcBorders>
+            <w:vAlign w:val="center"/>
+            <w:shd w:fill="F8FAFC"/>
+          </w:tcPr>
+          <w:p>
+            <w:pPr>
+              <w:spacing w:before="20" w:after="20"/>
+            </w:pPr>
+            <w:r>
+              <w:rPr>
+                <w:rFonts w:ascii="Arial" w:hAnsi="Arial" w:eastAsia="Arial"/>
+                <w:color w:val="172033"/>
+                <w:sz w:val="13"/>
+              </w:rPr>
+              <w:t>Registro digital de medicamentos</w:t>
+            </w:r>
+          </w:p>
+        </w:tc>
+        <w:tc>
+          <w:tcPr>
+            <w:tcW w:type="dxa" w:w="2098"/>
+            <w:tcBorders>
+              <w:top w:val="single" w:sz="4" w:space="0" w:color="CBD5E1"/>
+              <w:left w:val="single" w:sz="4" w:space="0" w:color="CBD5E1"/>
+              <w:bottom w:val="single" w:sz="4" w:space="0" w:color="CBD5E1"/>
+              <w:right w:val="single" w:sz="4" w:space="0" w:color="CBD5E1"/>
+              <w:insideH w:val="single" w:sz="4" w:space="0" w:color="CBD5E1"/>
+              <w:insideV w:val="single" w:sz="4" w:space="0" w:color="CBD5E1"/>
+            </w:tcBorders>
+            <w:vAlign w:val="center"/>
+            <w:shd w:fill="F8FAFC"/>
+          </w:tcPr>
+          <w:p>
+            <w:pPr>
+              <w:spacing w:before="20" w:after="20"/>
+            </w:pPr>
+            <w:r>
+              <w:rPr>
+                <w:rFonts w:ascii="Arial" w:hAnsi="Arial" w:eastAsia="Arial"/>
+                <w:color w:val="172033"/>
+                <w:sz w:val="13"/>
+              </w:rPr>
+              <w:t>Jennifer Bautista Barrios</w:t>
+            </w:r>
+          </w:p>
+        </w:tc>
+        <w:tc>
+          <w:tcPr>
+            <w:tcW w:type="dxa" w:w="1077"/>
+            <w:tcBorders>
+              <w:top w:val="single" w:sz="4" w:space="0" w:color="CBD5E1"/>
+              <w:left w:val="single" w:sz="4" w:space="0" w:color="CBD5E1"/>
+              <w:bottom w:val="single" w:sz="4" w:space="0" w:color="CBD5E1"/>
+              <w:right w:val="single" w:sz="4" w:space="0" w:color="CBD5E1"/>
+              <w:insideH w:val="single" w:sz="4" w:space="0" w:color="CBD5E1"/>
+              <w:insideV w:val="single" w:sz="4" w:space="0" w:color="CBD5E1"/>
+            </w:tcBorders>
+            <w:vAlign w:val="center"/>
+            <w:shd w:fill="F8FAFC"/>
+          </w:tcPr>
+          <w:p>
+            <w:pPr>
+              <w:spacing w:before="20" w:after="20"/>
+            </w:pPr>
+            <w:r>
+              <w:rPr>
+                <w:rFonts w:ascii="Arial" w:hAnsi="Arial" w:eastAsia="Arial"/>
+                <w:color w:val="172033"/>
+                <w:sz w:val="13"/>
+              </w:rPr>
+              <w:t>13/07/2026</w:t>
+            </w:r>
+          </w:p>
+        </w:tc>
+        <w:tc>
+          <w:tcPr>
+            <w:tcW w:type="dxa" w:w="1077"/>
+            <w:tcBorders>
+              <w:top w:val="single" w:sz="4" w:space="0" w:color="CBD5E1"/>
+              <w:left w:val="single" w:sz="4" w:space="0" w:color="CBD5E1"/>
+              <w:bottom w:val="single" w:sz="4" w:space="0" w:color="CBD5E1"/>
+              <w:right w:val="single" w:sz="4" w:space="0" w:color="CBD5E1"/>
+              <w:insideH w:val="single" w:sz="4" w:space="0" w:color="CBD5E1"/>
+              <w:insideV w:val="single" w:sz="4" w:space="0" w:color="CBD5E1"/>
+            </w:tcBorders>
+            <w:vAlign w:val="center"/>
+            <w:shd w:fill="F8FAFC"/>
+          </w:tcPr>
+          <w:p>
+            <w:pPr>
+              <w:spacing w:before="20" w:after="20"/>
+            </w:pPr>
+            <w:r>
+              <w:rPr>
+                <w:rFonts w:ascii="Arial" w:hAnsi="Arial" w:eastAsia="Arial"/>
+                <w:color w:val="172033"/>
+                <w:sz w:val="13"/>
+              </w:rPr>
+              <w:t>24/07/2026</w:t>
+            </w:r>
+          </w:p>
+        </w:tc>
+        <w:tc>
+          <w:tcPr>
+            <w:tcW w:type="dxa" w:w="567"/>
+            <w:tcBorders>
+              <w:top w:val="single" w:sz="4" w:space="0" w:color="CBD5E1"/>
+              <w:left w:val="single" w:sz="4" w:space="0" w:color="CBD5E1"/>
+              <w:bottom w:val="single" w:sz="4" w:space="0" w:color="CBD5E1"/>
+              <w:right w:val="single" w:sz="4" w:space="0" w:color="CBD5E1"/>
+              <w:insideH w:val="single" w:sz="4" w:space="0" w:color="CBD5E1"/>
+              <w:insideV w:val="single" w:sz="4" w:space="0" w:color="CBD5E1"/>
+            </w:tcBorders>
+            <w:vAlign w:val="center"/>
+            <w:shd w:fill="F8FAFC"/>
+          </w:tcPr>
+          <w:p>
+            <w:pPr>
+              <w:spacing w:before="20" w:after="20"/>
+            </w:pPr>
+            <w:r>
+              <w:rPr>
+                <w:rFonts w:ascii="Arial" w:hAnsi="Arial" w:eastAsia="Arial"/>
+                <w:color w:val="172033"/>
+                <w:sz w:val="13"/>
+              </w:rPr>
+              <w:t>12</w:t>
+            </w:r>
+          </w:p>
+        </w:tc>
+        <w:tc>
+          <w:tcPr>
+            <w:tcW w:type="dxa" w:w="1361"/>
+            <w:tcBorders>
+              <w:top w:val="single" w:sz="4" w:space="0" w:color="CBD5E1"/>
+              <w:left w:val="single" w:sz="4" w:space="0" w:color="CBD5E1"/>
+              <w:bottom w:val="single" w:sz="4" w:space="0" w:color="CBD5E1"/>
+              <w:right w:val="single" w:sz="4" w:space="0" w:color="CBD5E1"/>
+              <w:insideH w:val="single" w:sz="4" w:space="0" w:color="CBD5E1"/>
+              <w:insideV w:val="single" w:sz="4" w:space="0" w:color="CBD5E1"/>
+            </w:tcBorders>
+            <w:vAlign w:val="center"/>
+            <w:shd w:fill="F8FAFC"/>
+          </w:tcPr>
+          <w:p>
+            <w:pPr>
+              <w:spacing w:before="20" w:after="20"/>
+            </w:pPr>
+            <w:r>
+              <w:rPr>
+                <w:rFonts w:ascii="Arial" w:hAnsi="Arial" w:eastAsia="Arial"/>
+                <w:color w:val="172033"/>
+                <w:sz w:val="13"/>
+              </w:rPr>
+              <w:t>Backend</w:t>
+            </w:r>
+          </w:p>
+        </w:tc>
+        <w:tc>
+          <w:tcPr>
+            <w:tcW w:type="dxa" w:w="1644"/>
+            <w:tcBorders>
+              <w:top w:val="single" w:sz="4" w:space="0" w:color="CBD5E1"/>
+              <w:left w:val="single" w:sz="4" w:space="0" w:color="CBD5E1"/>
+              <w:bottom w:val="single" w:sz="4" w:space="0" w:color="CBD5E1"/>
+              <w:right w:val="single" w:sz="4" w:space="0" w:color="CBD5E1"/>
+              <w:insideH w:val="single" w:sz="4" w:space="0" w:color="CBD5E1"/>
+              <w:insideV w:val="single" w:sz="4" w:space="0" w:color="CBD5E1"/>
+            </w:tcBorders>
+            <w:vAlign w:val="center"/>
+            <w:shd w:fill="F8FAFC"/>
+          </w:tcPr>
+          <w:p>
+            <w:pPr>
+              <w:spacing w:before="20" w:after="20"/>
+            </w:pPr>
+            <w:r>
+              <w:rPr>
+                <w:rFonts w:ascii="Arial" w:hAnsi="Arial" w:eastAsia="Arial"/>
+                <w:color w:val="172033"/>
+                <w:sz w:val="13"/>
+              </w:rPr>
+              <w:t>Planificación académica</w:t>
+            </w:r>
+          </w:p>
+        </w:tc>
+      </w:tr>
+      <w:tr>
+        <w:trPr>
+          <w:cantSplit/>
+        </w:trPr>
+        <w:tc>
+          <w:tcPr>
+            <w:tcW w:type="dxa" w:w="567"/>
+            <w:tcBorders>
+              <w:top w:val="single" w:sz="4" w:space="0" w:color="CBD5E1"/>
+              <w:left w:val="single" w:sz="4" w:space="0" w:color="CBD5E1"/>
+              <w:bottom w:val="single" w:sz="4" w:space="0" w:color="CBD5E1"/>
+              <w:right w:val="single" w:sz="4" w:space="0" w:color="CBD5E1"/>
+              <w:insideH w:val="single" w:sz="4" w:space="0" w:color="CBD5E1"/>
+              <w:insideV w:val="single" w:sz="4" w:space="0" w:color="CBD5E1"/>
+            </w:tcBorders>
+            <w:vAlign w:val="center"/>
+          </w:tcPr>
+          <w:p>
+            <w:pPr>
+              <w:spacing w:before="20" w:after="20"/>
+            </w:pPr>
+            <w:r>
+              <w:rPr>
+                <w:rFonts w:ascii="Arial" w:hAnsi="Arial" w:eastAsia="Arial"/>
+                <w:color w:val="172033"/>
+                <w:sz w:val="13"/>
+              </w:rPr>
+              <w:t>T11</w:t>
+            </w:r>
+          </w:p>
+        </w:tc>
+        <w:tc>
+          <w:tcPr>
+            <w:tcW w:type="dxa" w:w="2098"/>
+            <w:tcBorders>
+              <w:top w:val="single" w:sz="4" w:space="0" w:color="CBD5E1"/>
+              <w:left w:val="single" w:sz="4" w:space="0" w:color="CBD5E1"/>
+              <w:bottom w:val="single" w:sz="4" w:space="0" w:color="CBD5E1"/>
+              <w:right w:val="single" w:sz="4" w:space="0" w:color="CBD5E1"/>
+              <w:insideH w:val="single" w:sz="4" w:space="0" w:color="CBD5E1"/>
+              <w:insideV w:val="single" w:sz="4" w:space="0" w:color="CBD5E1"/>
+            </w:tcBorders>
+            <w:vAlign w:val="center"/>
+          </w:tcPr>
+          <w:p>
+            <w:pPr>
+              <w:spacing w:before="20" w:after="20"/>
+            </w:pPr>
+            <w:r>
+              <w:rPr>
+                <w:rFonts w:ascii="Arial" w:hAnsi="Arial" w:eastAsia="Arial"/>
+                <w:color w:val="172033"/>
+                <w:sz w:val="13"/>
+              </w:rPr>
+              <w:t>Recordatorios y confirmación manual</w:t>
+            </w:r>
+          </w:p>
+        </w:tc>
+        <w:tc>
+          <w:tcPr>
+            <w:tcW w:type="dxa" w:w="2098"/>
+            <w:tcBorders>
+              <w:top w:val="single" w:sz="4" w:space="0" w:color="CBD5E1"/>
+              <w:left w:val="single" w:sz="4" w:space="0" w:color="CBD5E1"/>
+              <w:bottom w:val="single" w:sz="4" w:space="0" w:color="CBD5E1"/>
+              <w:right w:val="single" w:sz="4" w:space="0" w:color="CBD5E1"/>
+              <w:insideH w:val="single" w:sz="4" w:space="0" w:color="CBD5E1"/>
+              <w:insideV w:val="single" w:sz="4" w:space="0" w:color="CBD5E1"/>
+            </w:tcBorders>
+            <w:vAlign w:val="center"/>
+          </w:tcPr>
+          <w:p>
+            <w:pPr>
+              <w:spacing w:before="20" w:after="20"/>
+            </w:pPr>
+            <w:r>
+              <w:rPr>
+                <w:rFonts w:ascii="Arial" w:hAnsi="Arial" w:eastAsia="Arial"/>
+                <w:color w:val="172033"/>
+                <w:sz w:val="13"/>
+              </w:rPr>
+              <w:t>Carlos Daniel Garcia Pluma</w:t>
+            </w:r>
+          </w:p>
+        </w:tc>
+        <w:tc>
+          <w:tcPr>
+            <w:tcW w:type="dxa" w:w="1077"/>
+            <w:tcBorders>
+              <w:top w:val="single" w:sz="4" w:space="0" w:color="CBD5E1"/>
+              <w:left w:val="single" w:sz="4" w:space="0" w:color="CBD5E1"/>
+              <w:bottom w:val="single" w:sz="4" w:space="0" w:color="CBD5E1"/>
+              <w:right w:val="single" w:sz="4" w:space="0" w:color="CBD5E1"/>
+              <w:insideH w:val="single" w:sz="4" w:space="0" w:color="CBD5E1"/>
+              <w:insideV w:val="single" w:sz="4" w:space="0" w:color="CBD5E1"/>
+            </w:tcBorders>
+            <w:vAlign w:val="center"/>
+          </w:tcPr>
+          <w:p>
+            <w:pPr>
+              <w:spacing w:before="20" w:after="20"/>
+            </w:pPr>
+            <w:r>
+              <w:rPr>
+                <w:rFonts w:ascii="Arial" w:hAnsi="Arial" w:eastAsia="Arial"/>
+                <w:color w:val="172033"/>
+                <w:sz w:val="13"/>
+              </w:rPr>
+              <w:t>20/07/2026</w:t>
+            </w:r>
+          </w:p>
+        </w:tc>
+        <w:tc>
+          <w:tcPr>
+            <w:tcW w:type="dxa" w:w="1077"/>
+            <w:tcBorders>
+              <w:top w:val="single" w:sz="4" w:space="0" w:color="CBD5E1"/>
+              <w:left w:val="single" w:sz="4" w:space="0" w:color="CBD5E1"/>
+              <w:bottom w:val="single" w:sz="4" w:space="0" w:color="CBD5E1"/>
+              <w:right w:val="single" w:sz="4" w:space="0" w:color="CBD5E1"/>
+              <w:insideH w:val="single" w:sz="4" w:space="0" w:color="CBD5E1"/>
+              <w:insideV w:val="single" w:sz="4" w:space="0" w:color="CBD5E1"/>
+            </w:tcBorders>
+            <w:vAlign w:val="center"/>
+          </w:tcPr>
+          <w:p>
+            <w:pPr>
+              <w:spacing w:before="20" w:after="20"/>
+            </w:pPr>
+            <w:r>
+              <w:rPr>
+                <w:rFonts w:ascii="Arial" w:hAnsi="Arial" w:eastAsia="Arial"/>
+                <w:color w:val="172033"/>
+                <w:sz w:val="13"/>
+              </w:rPr>
+              <w:t>31/07/2026</w:t>
+            </w:r>
+          </w:p>
+        </w:tc>
+        <w:tc>
+          <w:tcPr>
+            <w:tcW w:type="dxa" w:w="567"/>
+            <w:tcBorders>
+              <w:top w:val="single" w:sz="4" w:space="0" w:color="CBD5E1"/>
+              <w:left w:val="single" w:sz="4" w:space="0" w:color="CBD5E1"/>
+              <w:bottom w:val="single" w:sz="4" w:space="0" w:color="CBD5E1"/>
+              <w:right w:val="single" w:sz="4" w:space="0" w:color="CBD5E1"/>
+              <w:insideH w:val="single" w:sz="4" w:space="0" w:color="CBD5E1"/>
+              <w:insideV w:val="single" w:sz="4" w:space="0" w:color="CBD5E1"/>
+            </w:tcBorders>
+            <w:vAlign w:val="center"/>
+          </w:tcPr>
+          <w:p>
+            <w:pPr>
+              <w:spacing w:before="20" w:after="20"/>
+            </w:pPr>
+            <w:r>
+              <w:rPr>
+                <w:rFonts w:ascii="Arial" w:hAnsi="Arial" w:eastAsia="Arial"/>
+                <w:color w:val="172033"/>
+                <w:sz w:val="13"/>
+              </w:rPr>
+              <w:t>12</w:t>
+            </w:r>
+          </w:p>
+        </w:tc>
+        <w:tc>
+          <w:tcPr>
+            <w:tcW w:type="dxa" w:w="1361"/>
+            <w:tcBorders>
+              <w:top w:val="single" w:sz="4" w:space="0" w:color="CBD5E1"/>
+              <w:left w:val="single" w:sz="4" w:space="0" w:color="CBD5E1"/>
+              <w:bottom w:val="single" w:sz="4" w:space="0" w:color="CBD5E1"/>
+              <w:right w:val="single" w:sz="4" w:space="0" w:color="CBD5E1"/>
+              <w:insideH w:val="single" w:sz="4" w:space="0" w:color="CBD5E1"/>
+              <w:insideV w:val="single" w:sz="4" w:space="0" w:color="CBD5E1"/>
+            </w:tcBorders>
+            <w:vAlign w:val="center"/>
+          </w:tcPr>
+          <w:p>
+            <w:pPr>
+              <w:spacing w:before="20" w:after="20"/>
+            </w:pPr>
+            <w:r>
+              <w:rPr>
+                <w:rFonts w:ascii="Arial" w:hAnsi="Arial" w:eastAsia="Arial"/>
+                <w:color w:val="172033"/>
+                <w:sz w:val="13"/>
+              </w:rPr>
+              <w:t>Registro medicamentos</w:t>
+            </w:r>
+          </w:p>
+        </w:tc>
+        <w:tc>
+          <w:tcPr>
+            <w:tcW w:type="dxa" w:w="1644"/>
+            <w:tcBorders>
+              <w:top w:val="single" w:sz="4" w:space="0" w:color="CBD5E1"/>
+              <w:left w:val="single" w:sz="4" w:space="0" w:color="CBD5E1"/>
+              <w:bottom w:val="single" w:sz="4" w:space="0" w:color="CBD5E1"/>
+              <w:right w:val="single" w:sz="4" w:space="0" w:color="CBD5E1"/>
+              <w:insideH w:val="single" w:sz="4" w:space="0" w:color="CBD5E1"/>
+              <w:insideV w:val="single" w:sz="4" w:space="0" w:color="CBD5E1"/>
+            </w:tcBorders>
+            <w:vAlign w:val="center"/>
+          </w:tcPr>
+          <w:p>
+            <w:pPr>
+              <w:spacing w:before="20" w:after="20"/>
+            </w:pPr>
+            <w:r>
+              <w:rPr>
+                <w:rFonts w:ascii="Arial" w:hAnsi="Arial" w:eastAsia="Arial"/>
+                <w:color w:val="172033"/>
+                <w:sz w:val="13"/>
+              </w:rPr>
+              <w:t>Planificación académica</w:t>
+            </w:r>
+          </w:p>
+        </w:tc>
+      </w:tr>
+      <w:tr>
+        <w:trPr>
+          <w:cantSplit/>
+        </w:trPr>
+        <w:tc>
+          <w:tcPr>
+            <w:tcW w:type="dxa" w:w="567"/>
+            <w:tcBorders>
+              <w:top w:val="single" w:sz="4" w:space="0" w:color="CBD5E1"/>
+              <w:left w:val="single" w:sz="4" w:space="0" w:color="CBD5E1"/>
+              <w:bottom w:val="single" w:sz="4" w:space="0" w:color="CBD5E1"/>
+              <w:right w:val="single" w:sz="4" w:space="0" w:color="CBD5E1"/>
+              <w:insideH w:val="single" w:sz="4" w:space="0" w:color="CBD5E1"/>
+              <w:insideV w:val="single" w:sz="4" w:space="0" w:color="CBD5E1"/>
+            </w:tcBorders>
+            <w:vAlign w:val="center"/>
+            <w:shd w:fill="F8FAFC"/>
+          </w:tcPr>
+          <w:p>
+            <w:pPr>
+              <w:spacing w:before="20" w:after="20"/>
+            </w:pPr>
+            <w:r>
+              <w:rPr>
+                <w:rFonts w:ascii="Arial" w:hAnsi="Arial" w:eastAsia="Arial"/>
+                <w:color w:val="172033"/>
+                <w:sz w:val="13"/>
+              </w:rPr>
+              <w:t>T12</w:t>
+            </w:r>
+          </w:p>
+        </w:tc>
+        <w:tc>
+          <w:tcPr>
+            <w:tcW w:type="dxa" w:w="2098"/>
+            <w:tcBorders>
+              <w:top w:val="single" w:sz="4" w:space="0" w:color="CBD5E1"/>
+              <w:left w:val="single" w:sz="4" w:space="0" w:color="CBD5E1"/>
+              <w:bottom w:val="single" w:sz="4" w:space="0" w:color="CBD5E1"/>
+              <w:right w:val="single" w:sz="4" w:space="0" w:color="CBD5E1"/>
+              <w:insideH w:val="single" w:sz="4" w:space="0" w:color="CBD5E1"/>
+              <w:insideV w:val="single" w:sz="4" w:space="0" w:color="CBD5E1"/>
+            </w:tcBorders>
+            <w:vAlign w:val="center"/>
+            <w:shd w:fill="F8FAFC"/>
+          </w:tcPr>
+          <w:p>
+            <w:pPr>
+              <w:spacing w:before="20" w:after="20"/>
+            </w:pPr>
+            <w:r>
+              <w:rPr>
+                <w:rFonts w:ascii="Arial" w:hAnsi="Arial" w:eastAsia="Arial"/>
+                <w:color w:val="172033"/>
+                <w:sz w:val="13"/>
+              </w:rPr>
+              <w:t>Módulos de análisis e IA</w:t>
+            </w:r>
+          </w:p>
+        </w:tc>
+        <w:tc>
+          <w:tcPr>
+            <w:tcW w:type="dxa" w:w="2098"/>
+            <w:tcBorders>
+              <w:top w:val="single" w:sz="4" w:space="0" w:color="CBD5E1"/>
+              <w:left w:val="single" w:sz="4" w:space="0" w:color="CBD5E1"/>
+              <w:bottom w:val="single" w:sz="4" w:space="0" w:color="CBD5E1"/>
+              <w:right w:val="single" w:sz="4" w:space="0" w:color="CBD5E1"/>
+              <w:insideH w:val="single" w:sz="4" w:space="0" w:color="CBD5E1"/>
+              <w:insideV w:val="single" w:sz="4" w:space="0" w:color="CBD5E1"/>
+            </w:tcBorders>
+            <w:vAlign w:val="center"/>
+            <w:shd w:fill="F8FAFC"/>
+          </w:tcPr>
+          <w:p>
+            <w:pPr>
+              <w:spacing w:before="20" w:after="20"/>
+            </w:pPr>
+            <w:r>
+              <w:rPr>
+                <w:rFonts w:ascii="Arial" w:hAnsi="Arial" w:eastAsia="Arial"/>
+                <w:color w:val="172033"/>
+                <w:sz w:val="13"/>
+              </w:rPr>
+              <w:t>Michelle Castro Otero</w:t>
+            </w:r>
+          </w:p>
+        </w:tc>
+        <w:tc>
+          <w:tcPr>
+            <w:tcW w:type="dxa" w:w="1077"/>
+            <w:tcBorders>
+              <w:top w:val="single" w:sz="4" w:space="0" w:color="CBD5E1"/>
+              <w:left w:val="single" w:sz="4" w:space="0" w:color="CBD5E1"/>
+              <w:bottom w:val="single" w:sz="4" w:space="0" w:color="CBD5E1"/>
+              <w:right w:val="single" w:sz="4" w:space="0" w:color="CBD5E1"/>
+              <w:insideH w:val="single" w:sz="4" w:space="0" w:color="CBD5E1"/>
+              <w:insideV w:val="single" w:sz="4" w:space="0" w:color="CBD5E1"/>
+            </w:tcBorders>
+            <w:vAlign w:val="center"/>
+            <w:shd w:fill="F8FAFC"/>
+          </w:tcPr>
+          <w:p>
+            <w:pPr>
+              <w:spacing w:before="20" w:after="20"/>
+            </w:pPr>
+            <w:r>
+              <w:rPr>
+                <w:rFonts w:ascii="Arial" w:hAnsi="Arial" w:eastAsia="Arial"/>
+                <w:color w:val="172033"/>
+                <w:sz w:val="13"/>
+              </w:rPr>
+              <w:t>27/07/2026</w:t>
+            </w:r>
+          </w:p>
+        </w:tc>
+        <w:tc>
+          <w:tcPr>
+            <w:tcW w:type="dxa" w:w="1077"/>
+            <w:tcBorders>
+              <w:top w:val="single" w:sz="4" w:space="0" w:color="CBD5E1"/>
+              <w:left w:val="single" w:sz="4" w:space="0" w:color="CBD5E1"/>
+              <w:bottom w:val="single" w:sz="4" w:space="0" w:color="CBD5E1"/>
+              <w:right w:val="single" w:sz="4" w:space="0" w:color="CBD5E1"/>
+              <w:insideH w:val="single" w:sz="4" w:space="0" w:color="CBD5E1"/>
+              <w:insideV w:val="single" w:sz="4" w:space="0" w:color="CBD5E1"/>
+            </w:tcBorders>
+            <w:vAlign w:val="center"/>
+            <w:shd w:fill="F8FAFC"/>
+          </w:tcPr>
+          <w:p>
+            <w:pPr>
+              <w:spacing w:before="20" w:after="20"/>
+            </w:pPr>
+            <w:r>
+              <w:rPr>
+                <w:rFonts w:ascii="Arial" w:hAnsi="Arial" w:eastAsia="Arial"/>
+                <w:color w:val="172033"/>
+                <w:sz w:val="13"/>
+              </w:rPr>
+              <w:t>07/08/2026</w:t>
+            </w:r>
+          </w:p>
+        </w:tc>
+        <w:tc>
+          <w:tcPr>
+            <w:tcW w:type="dxa" w:w="567"/>
+            <w:tcBorders>
+              <w:top w:val="single" w:sz="4" w:space="0" w:color="CBD5E1"/>
+              <w:left w:val="single" w:sz="4" w:space="0" w:color="CBD5E1"/>
+              <w:bottom w:val="single" w:sz="4" w:space="0" w:color="CBD5E1"/>
+              <w:right w:val="single" w:sz="4" w:space="0" w:color="CBD5E1"/>
+              <w:insideH w:val="single" w:sz="4" w:space="0" w:color="CBD5E1"/>
+              <w:insideV w:val="single" w:sz="4" w:space="0" w:color="CBD5E1"/>
+            </w:tcBorders>
+            <w:vAlign w:val="center"/>
+            <w:shd w:fill="F8FAFC"/>
+          </w:tcPr>
+          <w:p>
+            <w:pPr>
+              <w:spacing w:before="20" w:after="20"/>
+            </w:pPr>
+            <w:r>
+              <w:rPr>
+                <w:rFonts w:ascii="Arial" w:hAnsi="Arial" w:eastAsia="Arial"/>
+                <w:color w:val="172033"/>
+                <w:sz w:val="13"/>
+              </w:rPr>
+              <w:t>12</w:t>
+            </w:r>
+          </w:p>
+        </w:tc>
+        <w:tc>
+          <w:tcPr>
+            <w:tcW w:type="dxa" w:w="1361"/>
+            <w:tcBorders>
+              <w:top w:val="single" w:sz="4" w:space="0" w:color="CBD5E1"/>
+              <w:left w:val="single" w:sz="4" w:space="0" w:color="CBD5E1"/>
+              <w:bottom w:val="single" w:sz="4" w:space="0" w:color="CBD5E1"/>
+              <w:right w:val="single" w:sz="4" w:space="0" w:color="CBD5E1"/>
+              <w:insideH w:val="single" w:sz="4" w:space="0" w:color="CBD5E1"/>
+              <w:insideV w:val="single" w:sz="4" w:space="0" w:color="CBD5E1"/>
+            </w:tcBorders>
+            <w:vAlign w:val="center"/>
+            <w:shd w:fill="F8FAFC"/>
+          </w:tcPr>
+          <w:p>
+            <w:pPr>
+              <w:spacing w:before="20" w:after="20"/>
+            </w:pPr>
+            <w:r>
+              <w:rPr>
+                <w:rFonts w:ascii="Arial" w:hAnsi="Arial" w:eastAsia="Arial"/>
+                <w:color w:val="172033"/>
+                <w:sz w:val="13"/>
+              </w:rPr>
+              <w:t>Datos disponibles</w:t>
+            </w:r>
+          </w:p>
+        </w:tc>
+        <w:tc>
+          <w:tcPr>
+            <w:tcW w:type="dxa" w:w="1644"/>
+            <w:tcBorders>
+              <w:top w:val="single" w:sz="4" w:space="0" w:color="CBD5E1"/>
+              <w:left w:val="single" w:sz="4" w:space="0" w:color="CBD5E1"/>
+              <w:bottom w:val="single" w:sz="4" w:space="0" w:color="CBD5E1"/>
+              <w:right w:val="single" w:sz="4" w:space="0" w:color="CBD5E1"/>
+              <w:insideH w:val="single" w:sz="4" w:space="0" w:color="CBD5E1"/>
+              <w:insideV w:val="single" w:sz="4" w:space="0" w:color="CBD5E1"/>
+            </w:tcBorders>
+            <w:vAlign w:val="center"/>
+            <w:shd w:fill="F8FAFC"/>
+          </w:tcPr>
+          <w:p>
+            <w:pPr>
+              <w:spacing w:before="20" w:after="20"/>
+            </w:pPr>
+            <w:r>
+              <w:rPr>
+                <w:rFonts w:ascii="Arial" w:hAnsi="Arial" w:eastAsia="Arial"/>
+                <w:color w:val="172033"/>
+                <w:sz w:val="13"/>
+              </w:rPr>
+              <w:t>Planificación académica</w:t>
+            </w:r>
+          </w:p>
+        </w:tc>
+      </w:tr>
+      <w:tr>
+        <w:trPr>
+          <w:cantSplit/>
+        </w:trPr>
+        <w:tc>
+          <w:tcPr>
+            <w:tcW w:type="dxa" w:w="567"/>
+            <w:tcBorders>
+              <w:top w:val="single" w:sz="4" w:space="0" w:color="CBD5E1"/>
+              <w:left w:val="single" w:sz="4" w:space="0" w:color="CBD5E1"/>
+              <w:bottom w:val="single" w:sz="4" w:space="0" w:color="CBD5E1"/>
+              <w:right w:val="single" w:sz="4" w:space="0" w:color="CBD5E1"/>
+              <w:insideH w:val="single" w:sz="4" w:space="0" w:color="CBD5E1"/>
+              <w:insideV w:val="single" w:sz="4" w:space="0" w:color="CBD5E1"/>
+            </w:tcBorders>
+            <w:vAlign w:val="center"/>
+          </w:tcPr>
+          <w:p>
+            <w:pPr>
+              <w:spacing w:before="20" w:after="20"/>
+            </w:pPr>
+            <w:r>
+              <w:rPr>
+                <w:rFonts w:ascii="Arial" w:hAnsi="Arial" w:eastAsia="Arial"/>
+                <w:color w:val="172033"/>
+                <w:sz w:val="13"/>
+              </w:rPr>
+              <w:t>T13</w:t>
+            </w:r>
+          </w:p>
+        </w:tc>
+        <w:tc>
+          <w:tcPr>
+            <w:tcW w:type="dxa" w:w="2098"/>
+            <w:tcBorders>
+              <w:top w:val="single" w:sz="4" w:space="0" w:color="CBD5E1"/>
+              <w:left w:val="single" w:sz="4" w:space="0" w:color="CBD5E1"/>
+              <w:bottom w:val="single" w:sz="4" w:space="0" w:color="CBD5E1"/>
+              <w:right w:val="single" w:sz="4" w:space="0" w:color="CBD5E1"/>
+              <w:insideH w:val="single" w:sz="4" w:space="0" w:color="CBD5E1"/>
+              <w:insideV w:val="single" w:sz="4" w:space="0" w:color="CBD5E1"/>
+            </w:tcBorders>
+            <w:vAlign w:val="center"/>
+          </w:tcPr>
+          <w:p>
+            <w:pPr>
+              <w:spacing w:before="20" w:after="20"/>
+            </w:pPr>
+            <w:r>
+              <w:rPr>
+                <w:rFonts w:ascii="Arial" w:hAnsi="Arial" w:eastAsia="Arial"/>
+                <w:color w:val="172033"/>
+                <w:sz w:val="13"/>
+              </w:rPr>
+              <w:t>Seguridad y privacidad</w:t>
+            </w:r>
+          </w:p>
+        </w:tc>
+        <w:tc>
+          <w:tcPr>
+            <w:tcW w:type="dxa" w:w="2098"/>
+            <w:tcBorders>
+              <w:top w:val="single" w:sz="4" w:space="0" w:color="CBD5E1"/>
+              <w:left w:val="single" w:sz="4" w:space="0" w:color="CBD5E1"/>
+              <w:bottom w:val="single" w:sz="4" w:space="0" w:color="CBD5E1"/>
+              <w:right w:val="single" w:sz="4" w:space="0" w:color="CBD5E1"/>
+              <w:insideH w:val="single" w:sz="4" w:space="0" w:color="CBD5E1"/>
+              <w:insideV w:val="single" w:sz="4" w:space="0" w:color="CBD5E1"/>
+            </w:tcBorders>
+            <w:vAlign w:val="center"/>
+          </w:tcPr>
+          <w:p>
+            <w:pPr>
+              <w:spacing w:before="20" w:after="20"/>
+            </w:pPr>
+            <w:r>
+              <w:rPr>
+                <w:rFonts w:ascii="Arial" w:hAnsi="Arial" w:eastAsia="Arial"/>
+                <w:color w:val="172033"/>
+                <w:sz w:val="13"/>
+              </w:rPr>
+              <w:t>Carlos Daniel Garcia Pluma</w:t>
+            </w:r>
+          </w:p>
+        </w:tc>
+        <w:tc>
+          <w:tcPr>
+            <w:tcW w:type="dxa" w:w="1077"/>
+            <w:tcBorders>
+              <w:top w:val="single" w:sz="4" w:space="0" w:color="CBD5E1"/>
+              <w:left w:val="single" w:sz="4" w:space="0" w:color="CBD5E1"/>
+              <w:bottom w:val="single" w:sz="4" w:space="0" w:color="CBD5E1"/>
+              <w:right w:val="single" w:sz="4" w:space="0" w:color="CBD5E1"/>
+              <w:insideH w:val="single" w:sz="4" w:space="0" w:color="CBD5E1"/>
+              <w:insideV w:val="single" w:sz="4" w:space="0" w:color="CBD5E1"/>
+            </w:tcBorders>
+            <w:vAlign w:val="center"/>
+          </w:tcPr>
+          <w:p>
+            <w:pPr>
+              <w:spacing w:before="20" w:after="20"/>
+            </w:pPr>
+            <w:r>
+              <w:rPr>
+                <w:rFonts w:ascii="Arial" w:hAnsi="Arial" w:eastAsia="Arial"/>
+                <w:color w:val="172033"/>
+                <w:sz w:val="13"/>
+              </w:rPr>
+              <w:t>03/08/2026</w:t>
+            </w:r>
+          </w:p>
+        </w:tc>
+        <w:tc>
+          <w:tcPr>
+            <w:tcW w:type="dxa" w:w="1077"/>
+            <w:tcBorders>
+              <w:top w:val="single" w:sz="4" w:space="0" w:color="CBD5E1"/>
+              <w:left w:val="single" w:sz="4" w:space="0" w:color="CBD5E1"/>
+              <w:bottom w:val="single" w:sz="4" w:space="0" w:color="CBD5E1"/>
+              <w:right w:val="single" w:sz="4" w:space="0" w:color="CBD5E1"/>
+              <w:insideH w:val="single" w:sz="4" w:space="0" w:color="CBD5E1"/>
+              <w:insideV w:val="single" w:sz="4" w:space="0" w:color="CBD5E1"/>
+            </w:tcBorders>
+            <w:vAlign w:val="center"/>
+          </w:tcPr>
+          <w:p>
+            <w:pPr>
+              <w:spacing w:before="20" w:after="20"/>
+            </w:pPr>
+            <w:r>
+              <w:rPr>
+                <w:rFonts w:ascii="Arial" w:hAnsi="Arial" w:eastAsia="Arial"/>
+                <w:color w:val="172033"/>
+                <w:sz w:val="13"/>
+              </w:rPr>
+              <w:t>10/08/2026</w:t>
+            </w:r>
+          </w:p>
+        </w:tc>
+        <w:tc>
+          <w:tcPr>
+            <w:tcW w:type="dxa" w:w="567"/>
+            <w:tcBorders>
+              <w:top w:val="single" w:sz="4" w:space="0" w:color="CBD5E1"/>
+              <w:left w:val="single" w:sz="4" w:space="0" w:color="CBD5E1"/>
+              <w:bottom w:val="single" w:sz="4" w:space="0" w:color="CBD5E1"/>
+              <w:right w:val="single" w:sz="4" w:space="0" w:color="CBD5E1"/>
+              <w:insideH w:val="single" w:sz="4" w:space="0" w:color="CBD5E1"/>
+              <w:insideV w:val="single" w:sz="4" w:space="0" w:color="CBD5E1"/>
+            </w:tcBorders>
+            <w:vAlign w:val="center"/>
+          </w:tcPr>
+          <w:p>
+            <w:pPr>
+              <w:spacing w:before="20" w:after="20"/>
+            </w:pPr>
+            <w:r>
+              <w:rPr>
+                <w:rFonts w:ascii="Arial" w:hAnsi="Arial" w:eastAsia="Arial"/>
+                <w:color w:val="172033"/>
+                <w:sz w:val="13"/>
+              </w:rPr>
+              <w:t>8</w:t>
+            </w:r>
+          </w:p>
+        </w:tc>
+        <w:tc>
+          <w:tcPr>
+            <w:tcW w:type="dxa" w:w="1361"/>
+            <w:tcBorders>
+              <w:top w:val="single" w:sz="4" w:space="0" w:color="CBD5E1"/>
+              <w:left w:val="single" w:sz="4" w:space="0" w:color="CBD5E1"/>
+              <w:bottom w:val="single" w:sz="4" w:space="0" w:color="CBD5E1"/>
+              <w:right w:val="single" w:sz="4" w:space="0" w:color="CBD5E1"/>
+              <w:insideH w:val="single" w:sz="4" w:space="0" w:color="CBD5E1"/>
+              <w:insideV w:val="single" w:sz="4" w:space="0" w:color="CBD5E1"/>
+            </w:tcBorders>
+            <w:vAlign w:val="center"/>
+          </w:tcPr>
+          <w:p>
+            <w:pPr>
+              <w:spacing w:before="20" w:after="20"/>
+            </w:pPr>
+            <w:r>
+              <w:rPr>
+                <w:rFonts w:ascii="Arial" w:hAnsi="Arial" w:eastAsia="Arial"/>
+                <w:color w:val="172033"/>
+                <w:sz w:val="13"/>
+              </w:rPr>
+              <w:t>Backend</w:t>
+            </w:r>
+          </w:p>
+        </w:tc>
+        <w:tc>
+          <w:tcPr>
+            <w:tcW w:type="dxa" w:w="1644"/>
+            <w:tcBorders>
+              <w:top w:val="single" w:sz="4" w:space="0" w:color="CBD5E1"/>
+              <w:left w:val="single" w:sz="4" w:space="0" w:color="CBD5E1"/>
+              <w:bottom w:val="single" w:sz="4" w:space="0" w:color="CBD5E1"/>
+              <w:right w:val="single" w:sz="4" w:space="0" w:color="CBD5E1"/>
+              <w:insideH w:val="single" w:sz="4" w:space="0" w:color="CBD5E1"/>
+              <w:insideV w:val="single" w:sz="4" w:space="0" w:color="CBD5E1"/>
+            </w:tcBorders>
+            <w:vAlign w:val="center"/>
+          </w:tcPr>
+          <w:p>
+            <w:pPr>
+              <w:spacing w:before="20" w:after="20"/>
+            </w:pPr>
+            <w:r>
+              <w:rPr>
+                <w:rFonts w:ascii="Arial" w:hAnsi="Arial" w:eastAsia="Arial"/>
+                <w:color w:val="172033"/>
+                <w:sz w:val="13"/>
+              </w:rPr>
+              <w:t>Planificación académica</w:t>
+            </w:r>
+          </w:p>
+        </w:tc>
+      </w:tr>
+      <w:tr>
+        <w:trPr>
+          <w:cantSplit/>
+        </w:trPr>
+        <w:tc>
+          <w:tcPr>
+            <w:tcW w:type="dxa" w:w="567"/>
+            <w:tcBorders>
+              <w:top w:val="single" w:sz="4" w:space="0" w:color="CBD5E1"/>
+              <w:left w:val="single" w:sz="4" w:space="0" w:color="CBD5E1"/>
+              <w:bottom w:val="single" w:sz="4" w:space="0" w:color="CBD5E1"/>
+              <w:right w:val="single" w:sz="4" w:space="0" w:color="CBD5E1"/>
+              <w:insideH w:val="single" w:sz="4" w:space="0" w:color="CBD5E1"/>
+              <w:insideV w:val="single" w:sz="4" w:space="0" w:color="CBD5E1"/>
+            </w:tcBorders>
+            <w:vAlign w:val="center"/>
+            <w:shd w:fill="F8FAFC"/>
+          </w:tcPr>
+          <w:p>
+            <w:pPr>
+              <w:spacing w:before="20" w:after="20"/>
+            </w:pPr>
+            <w:r>
+              <w:rPr>
+                <w:rFonts w:ascii="Arial" w:hAnsi="Arial" w:eastAsia="Arial"/>
+                <w:color w:val="172033"/>
+                <w:sz w:val="13"/>
+              </w:rPr>
+              <w:t>T14</w:t>
+            </w:r>
+          </w:p>
+        </w:tc>
+        <w:tc>
+          <w:tcPr>
+            <w:tcW w:type="dxa" w:w="2098"/>
+            <w:tcBorders>
+              <w:top w:val="single" w:sz="4" w:space="0" w:color="CBD5E1"/>
+              <w:left w:val="single" w:sz="4" w:space="0" w:color="CBD5E1"/>
+              <w:bottom w:val="single" w:sz="4" w:space="0" w:color="CBD5E1"/>
+              <w:right w:val="single" w:sz="4" w:space="0" w:color="CBD5E1"/>
+              <w:insideH w:val="single" w:sz="4" w:space="0" w:color="CBD5E1"/>
+              <w:insideV w:val="single" w:sz="4" w:space="0" w:color="CBD5E1"/>
+            </w:tcBorders>
+            <w:vAlign w:val="center"/>
+            <w:shd w:fill="F8FAFC"/>
+          </w:tcPr>
+          <w:p>
+            <w:pPr>
+              <w:spacing w:before="20" w:after="20"/>
+            </w:pPr>
+            <w:r>
+              <w:rPr>
+                <w:rFonts w:ascii="Arial" w:hAnsi="Arial" w:eastAsia="Arial"/>
+                <w:color w:val="172033"/>
+                <w:sz w:val="13"/>
+              </w:rPr>
+              <w:t>Preparación y pruebas planificadas</w:t>
+            </w:r>
+          </w:p>
+        </w:tc>
+        <w:tc>
+          <w:tcPr>
+            <w:tcW w:type="dxa" w:w="2098"/>
+            <w:tcBorders>
+              <w:top w:val="single" w:sz="4" w:space="0" w:color="CBD5E1"/>
+              <w:left w:val="single" w:sz="4" w:space="0" w:color="CBD5E1"/>
+              <w:bottom w:val="single" w:sz="4" w:space="0" w:color="CBD5E1"/>
+              <w:right w:val="single" w:sz="4" w:space="0" w:color="CBD5E1"/>
+              <w:insideH w:val="single" w:sz="4" w:space="0" w:color="CBD5E1"/>
+              <w:insideV w:val="single" w:sz="4" w:space="0" w:color="CBD5E1"/>
+            </w:tcBorders>
+            <w:vAlign w:val="center"/>
+            <w:shd w:fill="F8FAFC"/>
+          </w:tcPr>
+          <w:p>
+            <w:pPr>
+              <w:spacing w:before="20" w:after="20"/>
+            </w:pPr>
+            <w:r>
+              <w:rPr>
+                <w:rFonts w:ascii="Arial" w:hAnsi="Arial" w:eastAsia="Arial"/>
+                <w:color w:val="172033"/>
+                <w:sz w:val="13"/>
+              </w:rPr>
+              <w:t>Citlalli Perez Dionicio</w:t>
+            </w:r>
+          </w:p>
+        </w:tc>
+        <w:tc>
+          <w:tcPr>
+            <w:tcW w:type="dxa" w:w="1077"/>
+            <w:tcBorders>
+              <w:top w:val="single" w:sz="4" w:space="0" w:color="CBD5E1"/>
+              <w:left w:val="single" w:sz="4" w:space="0" w:color="CBD5E1"/>
+              <w:bottom w:val="single" w:sz="4" w:space="0" w:color="CBD5E1"/>
+              <w:right w:val="single" w:sz="4" w:space="0" w:color="CBD5E1"/>
+              <w:insideH w:val="single" w:sz="4" w:space="0" w:color="CBD5E1"/>
+              <w:insideV w:val="single" w:sz="4" w:space="0" w:color="CBD5E1"/>
+            </w:tcBorders>
+            <w:vAlign w:val="center"/>
+            <w:shd w:fill="F8FAFC"/>
+          </w:tcPr>
+          <w:p>
+            <w:pPr>
+              <w:spacing w:before="20" w:after="20"/>
+            </w:pPr>
+            <w:r>
+              <w:rPr>
+                <w:rFonts w:ascii="Arial" w:hAnsi="Arial" w:eastAsia="Arial"/>
+                <w:color w:val="172033"/>
+                <w:sz w:val="13"/>
+              </w:rPr>
+              <w:t>05/08/2026</w:t>
+            </w:r>
+          </w:p>
+        </w:tc>
+        <w:tc>
+          <w:tcPr>
+            <w:tcW w:type="dxa" w:w="1077"/>
+            <w:tcBorders>
+              <w:top w:val="single" w:sz="4" w:space="0" w:color="CBD5E1"/>
+              <w:left w:val="single" w:sz="4" w:space="0" w:color="CBD5E1"/>
+              <w:bottom w:val="single" w:sz="4" w:space="0" w:color="CBD5E1"/>
+              <w:right w:val="single" w:sz="4" w:space="0" w:color="CBD5E1"/>
+              <w:insideH w:val="single" w:sz="4" w:space="0" w:color="CBD5E1"/>
+              <w:insideV w:val="single" w:sz="4" w:space="0" w:color="CBD5E1"/>
+            </w:tcBorders>
+            <w:vAlign w:val="center"/>
+            <w:shd w:fill="F8FAFC"/>
+          </w:tcPr>
+          <w:p>
+            <w:pPr>
+              <w:spacing w:before="20" w:after="20"/>
+            </w:pPr>
+            <w:r>
+              <w:rPr>
+                <w:rFonts w:ascii="Arial" w:hAnsi="Arial" w:eastAsia="Arial"/>
+                <w:color w:val="172033"/>
+                <w:sz w:val="13"/>
+              </w:rPr>
+              <w:t>12/08/2026</w:t>
+            </w:r>
+          </w:p>
+        </w:tc>
+        <w:tc>
+          <w:tcPr>
+            <w:tcW w:type="dxa" w:w="567"/>
+            <w:tcBorders>
+              <w:top w:val="single" w:sz="4" w:space="0" w:color="CBD5E1"/>
+              <w:left w:val="single" w:sz="4" w:space="0" w:color="CBD5E1"/>
+              <w:bottom w:val="single" w:sz="4" w:space="0" w:color="CBD5E1"/>
+              <w:right w:val="single" w:sz="4" w:space="0" w:color="CBD5E1"/>
+              <w:insideH w:val="single" w:sz="4" w:space="0" w:color="CBD5E1"/>
+              <w:insideV w:val="single" w:sz="4" w:space="0" w:color="CBD5E1"/>
+            </w:tcBorders>
+            <w:vAlign w:val="center"/>
+            <w:shd w:fill="F8FAFC"/>
+          </w:tcPr>
+          <w:p>
+            <w:pPr>
+              <w:spacing w:before="20" w:after="20"/>
+            </w:pPr>
+            <w:r>
+              <w:rPr>
+                <w:rFonts w:ascii="Arial" w:hAnsi="Arial" w:eastAsia="Arial"/>
+                <w:color w:val="172033"/>
+                <w:sz w:val="13"/>
+              </w:rPr>
+              <w:t>8</w:t>
+            </w:r>
+          </w:p>
+        </w:tc>
+        <w:tc>
+          <w:tcPr>
+            <w:tcW w:type="dxa" w:w="1361"/>
+            <w:tcBorders>
+              <w:top w:val="single" w:sz="4" w:space="0" w:color="CBD5E1"/>
+              <w:left w:val="single" w:sz="4" w:space="0" w:color="CBD5E1"/>
+              <w:bottom w:val="single" w:sz="4" w:space="0" w:color="CBD5E1"/>
+              <w:right w:val="single" w:sz="4" w:space="0" w:color="CBD5E1"/>
+              <w:insideH w:val="single" w:sz="4" w:space="0" w:color="CBD5E1"/>
+              <w:insideV w:val="single" w:sz="4" w:space="0" w:color="CBD5E1"/>
+            </w:tcBorders>
+            <w:vAlign w:val="center"/>
+            <w:shd w:fill="F8FAFC"/>
+          </w:tcPr>
+          <w:p>
+            <w:pPr>
+              <w:spacing w:before="20" w:after="20"/>
+            </w:pPr>
+            <w:r>
+              <w:rPr>
+                <w:rFonts w:ascii="Arial" w:hAnsi="Arial" w:eastAsia="Arial"/>
+                <w:color w:val="172033"/>
+                <w:sz w:val="13"/>
+              </w:rPr>
+              <w:t>Módulos integrables</w:t>
+            </w:r>
+          </w:p>
+        </w:tc>
+        <w:tc>
+          <w:tcPr>
+            <w:tcW w:type="dxa" w:w="1644"/>
+            <w:tcBorders>
+              <w:top w:val="single" w:sz="4" w:space="0" w:color="CBD5E1"/>
+              <w:left w:val="single" w:sz="4" w:space="0" w:color="CBD5E1"/>
+              <w:bottom w:val="single" w:sz="4" w:space="0" w:color="CBD5E1"/>
+              <w:right w:val="single" w:sz="4" w:space="0" w:color="CBD5E1"/>
+              <w:insideH w:val="single" w:sz="4" w:space="0" w:color="CBD5E1"/>
+              <w:insideV w:val="single" w:sz="4" w:space="0" w:color="CBD5E1"/>
+            </w:tcBorders>
+            <w:vAlign w:val="center"/>
+            <w:shd w:fill="F8FAFC"/>
+          </w:tcPr>
+          <w:p>
+            <w:pPr>
+              <w:spacing w:before="20" w:after="20"/>
+            </w:pPr>
+            <w:r>
+              <w:rPr>
+                <w:rFonts w:ascii="Arial" w:hAnsi="Arial" w:eastAsia="Arial"/>
+                <w:color w:val="172033"/>
+                <w:sz w:val="13"/>
+              </w:rPr>
+              <w:t>Planificación académica</w:t>
+            </w:r>
+          </w:p>
+        </w:tc>
+      </w:tr>
+      <w:tr>
+        <w:trPr>
+          <w:cantSplit/>
+        </w:trPr>
+        <w:tc>
+          <w:tcPr>
+            <w:tcW w:type="dxa" w:w="567"/>
+            <w:tcBorders>
+              <w:top w:val="single" w:sz="4" w:space="0" w:color="CBD5E1"/>
+              <w:left w:val="single" w:sz="4" w:space="0" w:color="CBD5E1"/>
+              <w:bottom w:val="single" w:sz="4" w:space="0" w:color="CBD5E1"/>
+              <w:right w:val="single" w:sz="4" w:space="0" w:color="CBD5E1"/>
+              <w:insideH w:val="single" w:sz="4" w:space="0" w:color="CBD5E1"/>
+              <w:insideV w:val="single" w:sz="4" w:space="0" w:color="CBD5E1"/>
+            </w:tcBorders>
+            <w:vAlign w:val="center"/>
+          </w:tcPr>
+          <w:p>
+            <w:pPr>
+              <w:spacing w:before="20" w:after="20"/>
+            </w:pPr>
+            <w:r>
+              <w:rPr>
+                <w:rFonts w:ascii="Arial" w:hAnsi="Arial" w:eastAsia="Arial"/>
+                <w:color w:val="172033"/>
+                <w:sz w:val="13"/>
+              </w:rPr>
+              <w:t>T15</w:t>
+            </w:r>
+          </w:p>
+        </w:tc>
+        <w:tc>
+          <w:tcPr>
+            <w:tcW w:type="dxa" w:w="2098"/>
+            <w:tcBorders>
+              <w:top w:val="single" w:sz="4" w:space="0" w:color="CBD5E1"/>
+              <w:left w:val="single" w:sz="4" w:space="0" w:color="CBD5E1"/>
+              <w:bottom w:val="single" w:sz="4" w:space="0" w:color="CBD5E1"/>
+              <w:right w:val="single" w:sz="4" w:space="0" w:color="CBD5E1"/>
+              <w:insideH w:val="single" w:sz="4" w:space="0" w:color="CBD5E1"/>
+              <w:insideV w:val="single" w:sz="4" w:space="0" w:color="CBD5E1"/>
+            </w:tcBorders>
+            <w:vAlign w:val="center"/>
+          </w:tcPr>
+          <w:p>
+            <w:pPr>
+              <w:spacing w:before="20" w:after="20"/>
+            </w:pPr>
+            <w:r>
+              <w:rPr>
+                <w:rFonts w:ascii="Arial" w:hAnsi="Arial" w:eastAsia="Arial"/>
+                <w:color w:val="172033"/>
+                <w:sz w:val="13"/>
+              </w:rPr>
+              <w:t>Documentación continua</w:t>
+            </w:r>
+          </w:p>
+        </w:tc>
+        <w:tc>
+          <w:tcPr>
+            <w:tcW w:type="dxa" w:w="2098"/>
+            <w:tcBorders>
+              <w:top w:val="single" w:sz="4" w:space="0" w:color="CBD5E1"/>
+              <w:left w:val="single" w:sz="4" w:space="0" w:color="CBD5E1"/>
+              <w:bottom w:val="single" w:sz="4" w:space="0" w:color="CBD5E1"/>
+              <w:right w:val="single" w:sz="4" w:space="0" w:color="CBD5E1"/>
+              <w:insideH w:val="single" w:sz="4" w:space="0" w:color="CBD5E1"/>
+              <w:insideV w:val="single" w:sz="4" w:space="0" w:color="CBD5E1"/>
+            </w:tcBorders>
+            <w:vAlign w:val="center"/>
+          </w:tcPr>
+          <w:p>
+            <w:pPr>
+              <w:spacing w:before="20" w:after="20"/>
+            </w:pPr>
+            <w:r>
+              <w:rPr>
+                <w:rFonts w:ascii="Arial" w:hAnsi="Arial" w:eastAsia="Arial"/>
+                <w:color w:val="172033"/>
+                <w:sz w:val="13"/>
+              </w:rPr>
+              <w:t>Obed Guzmán Flores</w:t>
+            </w:r>
+          </w:p>
+        </w:tc>
+        <w:tc>
+          <w:tcPr>
+            <w:tcW w:type="dxa" w:w="1077"/>
+            <w:tcBorders>
+              <w:top w:val="single" w:sz="4" w:space="0" w:color="CBD5E1"/>
+              <w:left w:val="single" w:sz="4" w:space="0" w:color="CBD5E1"/>
+              <w:bottom w:val="single" w:sz="4" w:space="0" w:color="CBD5E1"/>
+              <w:right w:val="single" w:sz="4" w:space="0" w:color="CBD5E1"/>
+              <w:insideH w:val="single" w:sz="4" w:space="0" w:color="CBD5E1"/>
+              <w:insideV w:val="single" w:sz="4" w:space="0" w:color="CBD5E1"/>
+            </w:tcBorders>
+            <w:vAlign w:val="center"/>
+          </w:tcPr>
+          <w:p>
+            <w:pPr>
+              <w:spacing w:before="20" w:after="20"/>
+            </w:pPr>
+            <w:r>
+              <w:rPr>
+                <w:rFonts w:ascii="Arial" w:hAnsi="Arial" w:eastAsia="Arial"/>
+                <w:color w:val="172033"/>
+                <w:sz w:val="13"/>
+              </w:rPr>
+              <w:t>20/05/2026</w:t>
+            </w:r>
+          </w:p>
+        </w:tc>
+        <w:tc>
+          <w:tcPr>
+            <w:tcW w:type="dxa" w:w="1077"/>
+            <w:tcBorders>
+              <w:top w:val="single" w:sz="4" w:space="0" w:color="CBD5E1"/>
+              <w:left w:val="single" w:sz="4" w:space="0" w:color="CBD5E1"/>
+              <w:bottom w:val="single" w:sz="4" w:space="0" w:color="CBD5E1"/>
+              <w:right w:val="single" w:sz="4" w:space="0" w:color="CBD5E1"/>
+              <w:insideH w:val="single" w:sz="4" w:space="0" w:color="CBD5E1"/>
+              <w:insideV w:val="single" w:sz="4" w:space="0" w:color="CBD5E1"/>
+            </w:tcBorders>
+            <w:vAlign w:val="center"/>
+          </w:tcPr>
+          <w:p>
+            <w:pPr>
+              <w:spacing w:before="20" w:after="20"/>
+            </w:pPr>
+            <w:r>
+              <w:rPr>
+                <w:rFonts w:ascii="Arial" w:hAnsi="Arial" w:eastAsia="Arial"/>
+                <w:color w:val="172033"/>
+                <w:sz w:val="13"/>
+              </w:rPr>
+              <w:t>13/08/2026</w:t>
+            </w:r>
+          </w:p>
+        </w:tc>
+        <w:tc>
+          <w:tcPr>
+            <w:tcW w:type="dxa" w:w="567"/>
+            <w:tcBorders>
+              <w:top w:val="single" w:sz="4" w:space="0" w:color="CBD5E1"/>
+              <w:left w:val="single" w:sz="4" w:space="0" w:color="CBD5E1"/>
+              <w:bottom w:val="single" w:sz="4" w:space="0" w:color="CBD5E1"/>
+              <w:right w:val="single" w:sz="4" w:space="0" w:color="CBD5E1"/>
+              <w:insideH w:val="single" w:sz="4" w:space="0" w:color="CBD5E1"/>
+              <w:insideV w:val="single" w:sz="4" w:space="0" w:color="CBD5E1"/>
+            </w:tcBorders>
+            <w:vAlign w:val="center"/>
+          </w:tcPr>
+          <w:p>
+            <w:pPr>
+              <w:spacing w:before="20" w:after="20"/>
+            </w:pPr>
+            <w:r>
+              <w:rPr>
+                <w:rFonts w:ascii="Arial" w:hAnsi="Arial" w:eastAsia="Arial"/>
+                <w:color w:val="172033"/>
+                <w:sz w:val="13"/>
+              </w:rPr>
+              <w:t>86</w:t>
+            </w:r>
+          </w:p>
+        </w:tc>
+        <w:tc>
+          <w:tcPr>
+            <w:tcW w:type="dxa" w:w="1361"/>
+            <w:tcBorders>
+              <w:top w:val="single" w:sz="4" w:space="0" w:color="CBD5E1"/>
+              <w:left w:val="single" w:sz="4" w:space="0" w:color="CBD5E1"/>
+              <w:bottom w:val="single" w:sz="4" w:space="0" w:color="CBD5E1"/>
+              <w:right w:val="single" w:sz="4" w:space="0" w:color="CBD5E1"/>
+              <w:insideH w:val="single" w:sz="4" w:space="0" w:color="CBD5E1"/>
+              <w:insideV w:val="single" w:sz="4" w:space="0" w:color="CBD5E1"/>
+            </w:tcBorders>
+            <w:vAlign w:val="center"/>
+          </w:tcPr>
+          <w:p>
+            <w:pPr>
+              <w:spacing w:before="20" w:after="20"/>
+            </w:pPr>
+            <w:r>
+              <w:rPr>
+                <w:rFonts w:ascii="Arial" w:hAnsi="Arial" w:eastAsia="Arial"/>
+                <w:color w:val="172033"/>
+                <w:sz w:val="13"/>
+              </w:rPr>
+              <w:t>Inicio</w:t>
+            </w:r>
+          </w:p>
+        </w:tc>
+        <w:tc>
+          <w:tcPr>
+            <w:tcW w:type="dxa" w:w="1644"/>
+            <w:tcBorders>
+              <w:top w:val="single" w:sz="4" w:space="0" w:color="CBD5E1"/>
+              <w:left w:val="single" w:sz="4" w:space="0" w:color="CBD5E1"/>
+              <w:bottom w:val="single" w:sz="4" w:space="0" w:color="CBD5E1"/>
+              <w:right w:val="single" w:sz="4" w:space="0" w:color="CBD5E1"/>
+              <w:insideH w:val="single" w:sz="4" w:space="0" w:color="CBD5E1"/>
+              <w:insideV w:val="single" w:sz="4" w:space="0" w:color="CBD5E1"/>
+            </w:tcBorders>
+            <w:vAlign w:val="center"/>
+          </w:tcPr>
+          <w:p>
+            <w:pPr>
+              <w:spacing w:before="20" w:after="20"/>
+            </w:pPr>
+            <w:r>
+              <w:rPr>
+                <w:rFonts w:ascii="Arial" w:hAnsi="Arial" w:eastAsia="Arial"/>
+                <w:color w:val="172033"/>
+                <w:sz w:val="13"/>
+              </w:rPr>
+              <w:t>En elaboración académica</w:t>
+            </w:r>
+          </w:p>
+        </w:tc>
+      </w:tr>
+      <w:tr>
+        <w:trPr>
+          <w:cantSplit/>
+        </w:trPr>
+        <w:tc>
+          <w:tcPr>
+            <w:tcW w:type="dxa" w:w="567"/>
+            <w:tcBorders>
+              <w:top w:val="single" w:sz="4" w:space="0" w:color="CBD5E1"/>
+              <w:left w:val="single" w:sz="4" w:space="0" w:color="CBD5E1"/>
+              <w:bottom w:val="single" w:sz="4" w:space="0" w:color="CBD5E1"/>
+              <w:right w:val="single" w:sz="4" w:space="0" w:color="CBD5E1"/>
+              <w:insideH w:val="single" w:sz="4" w:space="0" w:color="CBD5E1"/>
+              <w:insideV w:val="single" w:sz="4" w:space="0" w:color="CBD5E1"/>
+            </w:tcBorders>
+            <w:vAlign w:val="center"/>
+            <w:shd w:fill="F8FAFC"/>
+          </w:tcPr>
+          <w:p>
+            <w:pPr>
+              <w:spacing w:before="20" w:after="20"/>
+            </w:pPr>
+            <w:r>
+              <w:rPr>
+                <w:rFonts w:ascii="Arial" w:hAnsi="Arial" w:eastAsia="Arial"/>
+                <w:color w:val="172033"/>
+                <w:sz w:val="13"/>
+              </w:rPr>
+              <w:t>T16</w:t>
+            </w:r>
+          </w:p>
+        </w:tc>
+        <w:tc>
+          <w:tcPr>
+            <w:tcW w:type="dxa" w:w="2098"/>
+            <w:tcBorders>
+              <w:top w:val="single" w:sz="4" w:space="0" w:color="CBD5E1"/>
+              <w:left w:val="single" w:sz="4" w:space="0" w:color="CBD5E1"/>
+              <w:bottom w:val="single" w:sz="4" w:space="0" w:color="CBD5E1"/>
+              <w:right w:val="single" w:sz="4" w:space="0" w:color="CBD5E1"/>
+              <w:insideH w:val="single" w:sz="4" w:space="0" w:color="CBD5E1"/>
+              <w:insideV w:val="single" w:sz="4" w:space="0" w:color="CBD5E1"/>
+            </w:tcBorders>
+            <w:vAlign w:val="center"/>
+            <w:shd w:fill="F8FAFC"/>
+          </w:tcPr>
+          <w:p>
+            <w:pPr>
+              <w:spacing w:before="20" w:after="20"/>
+            </w:pPr>
+            <w:r>
+              <w:rPr>
+                <w:rFonts w:ascii="Arial" w:hAnsi="Arial" w:eastAsia="Arial"/>
+                <w:color w:val="172033"/>
+                <w:sz w:val="13"/>
+              </w:rPr>
+              <w:t>Integración final</w:t>
+            </w:r>
+          </w:p>
+        </w:tc>
+        <w:tc>
+          <w:tcPr>
+            <w:tcW w:type="dxa" w:w="2098"/>
+            <w:tcBorders>
+              <w:top w:val="single" w:sz="4" w:space="0" w:color="CBD5E1"/>
+              <w:left w:val="single" w:sz="4" w:space="0" w:color="CBD5E1"/>
+              <w:bottom w:val="single" w:sz="4" w:space="0" w:color="CBD5E1"/>
+              <w:right w:val="single" w:sz="4" w:space="0" w:color="CBD5E1"/>
+              <w:insideH w:val="single" w:sz="4" w:space="0" w:color="CBD5E1"/>
+              <w:insideV w:val="single" w:sz="4" w:space="0" w:color="CBD5E1"/>
+            </w:tcBorders>
+            <w:vAlign w:val="center"/>
+            <w:shd w:fill="F8FAFC"/>
+          </w:tcPr>
+          <w:p>
+            <w:pPr>
+              <w:spacing w:before="20" w:after="20"/>
+            </w:pPr>
+            <w:r>
+              <w:rPr>
+                <w:rFonts w:ascii="Arial" w:hAnsi="Arial" w:eastAsia="Arial"/>
+                <w:color w:val="172033"/>
+                <w:sz w:val="13"/>
+              </w:rPr>
+              <w:t>Equipo completo</w:t>
+            </w:r>
+          </w:p>
+        </w:tc>
+        <w:tc>
+          <w:tcPr>
+            <w:tcW w:type="dxa" w:w="1077"/>
+            <w:tcBorders>
+              <w:top w:val="single" w:sz="4" w:space="0" w:color="CBD5E1"/>
+              <w:left w:val="single" w:sz="4" w:space="0" w:color="CBD5E1"/>
+              <w:bottom w:val="single" w:sz="4" w:space="0" w:color="CBD5E1"/>
+              <w:right w:val="single" w:sz="4" w:space="0" w:color="CBD5E1"/>
+              <w:insideH w:val="single" w:sz="4" w:space="0" w:color="CBD5E1"/>
+              <w:insideV w:val="single" w:sz="4" w:space="0" w:color="CBD5E1"/>
+            </w:tcBorders>
+            <w:vAlign w:val="center"/>
+            <w:shd w:fill="F8FAFC"/>
+          </w:tcPr>
+          <w:p>
+            <w:pPr>
+              <w:spacing w:before="20" w:after="20"/>
+            </w:pPr>
+            <w:r>
+              <w:rPr>
+                <w:rFonts w:ascii="Arial" w:hAnsi="Arial" w:eastAsia="Arial"/>
+                <w:color w:val="172033"/>
+                <w:sz w:val="13"/>
+              </w:rPr>
+              <w:t>10/08/2026</w:t>
+            </w:r>
+          </w:p>
+        </w:tc>
+        <w:tc>
+          <w:tcPr>
+            <w:tcW w:type="dxa" w:w="1077"/>
+            <w:tcBorders>
+              <w:top w:val="single" w:sz="4" w:space="0" w:color="CBD5E1"/>
+              <w:left w:val="single" w:sz="4" w:space="0" w:color="CBD5E1"/>
+              <w:bottom w:val="single" w:sz="4" w:space="0" w:color="CBD5E1"/>
+              <w:right w:val="single" w:sz="4" w:space="0" w:color="CBD5E1"/>
+              <w:insideH w:val="single" w:sz="4" w:space="0" w:color="CBD5E1"/>
+              <w:insideV w:val="single" w:sz="4" w:space="0" w:color="CBD5E1"/>
+            </w:tcBorders>
+            <w:vAlign w:val="center"/>
+            <w:shd w:fill="F8FAFC"/>
+          </w:tcPr>
+          <w:p>
+            <w:pPr>
+              <w:spacing w:before="20" w:after="20"/>
+            </w:pPr>
+            <w:r>
+              <w:rPr>
+                <w:rFonts w:ascii="Arial" w:hAnsi="Arial" w:eastAsia="Arial"/>
+                <w:color w:val="172033"/>
+                <w:sz w:val="13"/>
+              </w:rPr>
+              <w:t>13/08/2026</w:t>
+            </w:r>
+          </w:p>
+        </w:tc>
+        <w:tc>
+          <w:tcPr>
+            <w:tcW w:type="dxa" w:w="567"/>
+            <w:tcBorders>
+              <w:top w:val="single" w:sz="4" w:space="0" w:color="CBD5E1"/>
+              <w:left w:val="single" w:sz="4" w:space="0" w:color="CBD5E1"/>
+              <w:bottom w:val="single" w:sz="4" w:space="0" w:color="CBD5E1"/>
+              <w:right w:val="single" w:sz="4" w:space="0" w:color="CBD5E1"/>
+              <w:insideH w:val="single" w:sz="4" w:space="0" w:color="CBD5E1"/>
+              <w:insideV w:val="single" w:sz="4" w:space="0" w:color="CBD5E1"/>
+            </w:tcBorders>
+            <w:vAlign w:val="center"/>
+            <w:shd w:fill="F8FAFC"/>
+          </w:tcPr>
+          <w:p>
+            <w:pPr>
+              <w:spacing w:before="20" w:after="20"/>
+            </w:pPr>
+            <w:r>
+              <w:rPr>
+                <w:rFonts w:ascii="Arial" w:hAnsi="Arial" w:eastAsia="Arial"/>
+                <w:color w:val="172033"/>
+                <w:sz w:val="13"/>
+              </w:rPr>
+              <w:t>4</w:t>
+            </w:r>
+          </w:p>
+        </w:tc>
+        <w:tc>
+          <w:tcPr>
+            <w:tcW w:type="dxa" w:w="1361"/>
+            <w:tcBorders>
+              <w:top w:val="single" w:sz="4" w:space="0" w:color="CBD5E1"/>
+              <w:left w:val="single" w:sz="4" w:space="0" w:color="CBD5E1"/>
+              <w:bottom w:val="single" w:sz="4" w:space="0" w:color="CBD5E1"/>
+              <w:right w:val="single" w:sz="4" w:space="0" w:color="CBD5E1"/>
+              <w:insideH w:val="single" w:sz="4" w:space="0" w:color="CBD5E1"/>
+              <w:insideV w:val="single" w:sz="4" w:space="0" w:color="CBD5E1"/>
+            </w:tcBorders>
+            <w:vAlign w:val="center"/>
+            <w:shd w:fill="F8FAFC"/>
+          </w:tcPr>
+          <w:p>
+            <w:pPr>
+              <w:spacing w:before="20" w:after="20"/>
+            </w:pPr>
+            <w:r>
+              <w:rPr>
+                <w:rFonts w:ascii="Arial" w:hAnsi="Arial" w:eastAsia="Arial"/>
+                <w:color w:val="172033"/>
+                <w:sz w:val="13"/>
+              </w:rPr>
+              <w:t>Módulos priorizados</w:t>
+            </w:r>
+          </w:p>
+        </w:tc>
+        <w:tc>
+          <w:tcPr>
+            <w:tcW w:type="dxa" w:w="1644"/>
+            <w:tcBorders>
+              <w:top w:val="single" w:sz="4" w:space="0" w:color="CBD5E1"/>
+              <w:left w:val="single" w:sz="4" w:space="0" w:color="CBD5E1"/>
+              <w:bottom w:val="single" w:sz="4" w:space="0" w:color="CBD5E1"/>
+              <w:right w:val="single" w:sz="4" w:space="0" w:color="CBD5E1"/>
+              <w:insideH w:val="single" w:sz="4" w:space="0" w:color="CBD5E1"/>
+              <w:insideV w:val="single" w:sz="4" w:space="0" w:color="CBD5E1"/>
+            </w:tcBorders>
+            <w:vAlign w:val="center"/>
+            <w:shd w:fill="F8FAFC"/>
+          </w:tcPr>
+          <w:p>
+            <w:pPr>
+              <w:spacing w:before="20" w:after="20"/>
+            </w:pPr>
+            <w:r>
+              <w:rPr>
+                <w:rFonts w:ascii="Arial" w:hAnsi="Arial" w:eastAsia="Arial"/>
+                <w:color w:val="172033"/>
+                <w:sz w:val="13"/>
+              </w:rPr>
+              <w:t>Planificación académica</w:t>
+            </w:r>
+          </w:p>
+        </w:tc>
+      </w:tr>
+      <w:tr>
+        <w:trPr>
+          <w:cantSplit/>
+        </w:trPr>
+        <w:tc>
+          <w:tcPr>
+            <w:tcW w:type="dxa" w:w="567"/>
+            <w:tcBorders>
+              <w:top w:val="single" w:sz="4" w:space="0" w:color="CBD5E1"/>
+              <w:left w:val="single" w:sz="4" w:space="0" w:color="CBD5E1"/>
+              <w:bottom w:val="single" w:sz="4" w:space="0" w:color="CBD5E1"/>
+              <w:right w:val="single" w:sz="4" w:space="0" w:color="CBD5E1"/>
+              <w:insideH w:val="single" w:sz="4" w:space="0" w:color="CBD5E1"/>
+              <w:insideV w:val="single" w:sz="4" w:space="0" w:color="CBD5E1"/>
+            </w:tcBorders>
+            <w:vAlign w:val="center"/>
+          </w:tcPr>
+          <w:p>
+            <w:pPr>
+              <w:spacing w:before="20" w:after="20"/>
+            </w:pPr>
+            <w:r>
+              <w:rPr>
+                <w:rFonts w:ascii="Arial" w:hAnsi="Arial" w:eastAsia="Arial"/>
+                <w:color w:val="172033"/>
+                <w:sz w:val="13"/>
+              </w:rPr>
+              <w:t>T17</w:t>
+            </w:r>
+          </w:p>
+        </w:tc>
+        <w:tc>
+          <w:tcPr>
+            <w:tcW w:type="dxa" w:w="2098"/>
+            <w:tcBorders>
+              <w:top w:val="single" w:sz="4" w:space="0" w:color="CBD5E1"/>
+              <w:left w:val="single" w:sz="4" w:space="0" w:color="CBD5E1"/>
+              <w:bottom w:val="single" w:sz="4" w:space="0" w:color="CBD5E1"/>
+              <w:right w:val="single" w:sz="4" w:space="0" w:color="CBD5E1"/>
+              <w:insideH w:val="single" w:sz="4" w:space="0" w:color="CBD5E1"/>
+              <w:insideV w:val="single" w:sz="4" w:space="0" w:color="CBD5E1"/>
+            </w:tcBorders>
+            <w:vAlign w:val="center"/>
+          </w:tcPr>
+          <w:p>
+            <w:pPr>
+              <w:spacing w:before="20" w:after="20"/>
+            </w:pPr>
+            <w:r>
+              <w:rPr>
+                <w:rFonts w:ascii="Arial" w:hAnsi="Arial" w:eastAsia="Arial"/>
+                <w:color w:val="172033"/>
+                <w:sz w:val="13"/>
+              </w:rPr>
+              <w:t>Entrega académica</w:t>
+            </w:r>
+          </w:p>
+        </w:tc>
+        <w:tc>
+          <w:tcPr>
+            <w:tcW w:type="dxa" w:w="2098"/>
+            <w:tcBorders>
+              <w:top w:val="single" w:sz="4" w:space="0" w:color="CBD5E1"/>
+              <w:left w:val="single" w:sz="4" w:space="0" w:color="CBD5E1"/>
+              <w:bottom w:val="single" w:sz="4" w:space="0" w:color="CBD5E1"/>
+              <w:right w:val="single" w:sz="4" w:space="0" w:color="CBD5E1"/>
+              <w:insideH w:val="single" w:sz="4" w:space="0" w:color="CBD5E1"/>
+              <w:insideV w:val="single" w:sz="4" w:space="0" w:color="CBD5E1"/>
+            </w:tcBorders>
+            <w:vAlign w:val="center"/>
+          </w:tcPr>
+          <w:p>
+            <w:pPr>
+              <w:spacing w:before="20" w:after="20"/>
+            </w:pPr>
+            <w:r>
+              <w:rPr>
+                <w:rFonts w:ascii="Arial" w:hAnsi="Arial" w:eastAsia="Arial"/>
+                <w:color w:val="172033"/>
+                <w:sz w:val="13"/>
+              </w:rPr>
+              <w:t>Equipo completo</w:t>
+            </w:r>
+          </w:p>
+        </w:tc>
+        <w:tc>
+          <w:tcPr>
+            <w:tcW w:type="dxa" w:w="1077"/>
+            <w:tcBorders>
+              <w:top w:val="single" w:sz="4" w:space="0" w:color="CBD5E1"/>
+              <w:left w:val="single" w:sz="4" w:space="0" w:color="CBD5E1"/>
+              <w:bottom w:val="single" w:sz="4" w:space="0" w:color="CBD5E1"/>
+              <w:right w:val="single" w:sz="4" w:space="0" w:color="CBD5E1"/>
+              <w:insideH w:val="single" w:sz="4" w:space="0" w:color="CBD5E1"/>
+              <w:insideV w:val="single" w:sz="4" w:space="0" w:color="CBD5E1"/>
+            </w:tcBorders>
+            <w:vAlign w:val="center"/>
+          </w:tcPr>
+          <w:p>
+            <w:pPr>
+              <w:spacing w:before="20" w:after="20"/>
+            </w:pPr>
+            <w:r>
+              <w:rPr>
+                <w:rFonts w:ascii="Arial" w:hAnsi="Arial" w:eastAsia="Arial"/>
+                <w:color w:val="172033"/>
+                <w:sz w:val="13"/>
+              </w:rPr>
+              <w:t>13/08/2026</w:t>
+            </w:r>
+          </w:p>
+        </w:tc>
+        <w:tc>
+          <w:tcPr>
+            <w:tcW w:type="dxa" w:w="1077"/>
+            <w:tcBorders>
+              <w:top w:val="single" w:sz="4" w:space="0" w:color="CBD5E1"/>
+              <w:left w:val="single" w:sz="4" w:space="0" w:color="CBD5E1"/>
+              <w:bottom w:val="single" w:sz="4" w:space="0" w:color="CBD5E1"/>
+              <w:right w:val="single" w:sz="4" w:space="0" w:color="CBD5E1"/>
+              <w:insideH w:val="single" w:sz="4" w:space="0" w:color="CBD5E1"/>
+              <w:insideV w:val="single" w:sz="4" w:space="0" w:color="CBD5E1"/>
+            </w:tcBorders>
+            <w:vAlign w:val="center"/>
+          </w:tcPr>
+          <w:p>
+            <w:pPr>
+              <w:spacing w:before="20" w:after="20"/>
+            </w:pPr>
+            <w:r>
+              <w:rPr>
+                <w:rFonts w:ascii="Arial" w:hAnsi="Arial" w:eastAsia="Arial"/>
+                <w:color w:val="172033"/>
+                <w:sz w:val="13"/>
+              </w:rPr>
+              <w:t>13/08/2026</w:t>
+            </w:r>
+          </w:p>
+        </w:tc>
+        <w:tc>
+          <w:tcPr>
+            <w:tcW w:type="dxa" w:w="567"/>
+            <w:tcBorders>
+              <w:top w:val="single" w:sz="4" w:space="0" w:color="CBD5E1"/>
+              <w:left w:val="single" w:sz="4" w:space="0" w:color="CBD5E1"/>
+              <w:bottom w:val="single" w:sz="4" w:space="0" w:color="CBD5E1"/>
+              <w:right w:val="single" w:sz="4" w:space="0" w:color="CBD5E1"/>
+              <w:insideH w:val="single" w:sz="4" w:space="0" w:color="CBD5E1"/>
+              <w:insideV w:val="single" w:sz="4" w:space="0" w:color="CBD5E1"/>
+            </w:tcBorders>
+            <w:vAlign w:val="center"/>
+          </w:tcPr>
+          <w:p>
+            <w:pPr>
+              <w:spacing w:before="20" w:after="20"/>
+            </w:pPr>
+            <w:r>
+              <w:rPr>
+                <w:rFonts w:ascii="Arial" w:hAnsi="Arial" w:eastAsia="Arial"/>
+                <w:color w:val="172033"/>
+                <w:sz w:val="13"/>
+              </w:rPr>
+              <w:t>1</w:t>
+            </w:r>
+          </w:p>
+        </w:tc>
+        <w:tc>
+          <w:tcPr>
+            <w:tcW w:type="dxa" w:w="1361"/>
+            <w:tcBorders>
+              <w:top w:val="single" w:sz="4" w:space="0" w:color="CBD5E1"/>
+              <w:left w:val="single" w:sz="4" w:space="0" w:color="CBD5E1"/>
+              <w:bottom w:val="single" w:sz="4" w:space="0" w:color="CBD5E1"/>
+              <w:right w:val="single" w:sz="4" w:space="0" w:color="CBD5E1"/>
+              <w:insideH w:val="single" w:sz="4" w:space="0" w:color="CBD5E1"/>
+              <w:insideV w:val="single" w:sz="4" w:space="0" w:color="CBD5E1"/>
+            </w:tcBorders>
+            <w:vAlign w:val="center"/>
+          </w:tcPr>
+          <w:p>
+            <w:pPr>
+              <w:spacing w:before="20" w:after="20"/>
+            </w:pPr>
+            <w:r>
+              <w:rPr>
+                <w:rFonts w:ascii="Arial" w:hAnsi="Arial" w:eastAsia="Arial"/>
+                <w:color w:val="172033"/>
+                <w:sz w:val="13"/>
+              </w:rPr>
+              <w:t>Integración y documentos</w:t>
+            </w:r>
+          </w:p>
+        </w:tc>
+        <w:tc>
+          <w:tcPr>
+            <w:tcW w:type="dxa" w:w="1644"/>
+            <w:tcBorders>
+              <w:top w:val="single" w:sz="4" w:space="0" w:color="CBD5E1"/>
+              <w:left w:val="single" w:sz="4" w:space="0" w:color="CBD5E1"/>
+              <w:bottom w:val="single" w:sz="4" w:space="0" w:color="CBD5E1"/>
+              <w:right w:val="single" w:sz="4" w:space="0" w:color="CBD5E1"/>
+              <w:insideH w:val="single" w:sz="4" w:space="0" w:color="CBD5E1"/>
+              <w:insideV w:val="single" w:sz="4" w:space="0" w:color="CBD5E1"/>
+            </w:tcBorders>
+            <w:vAlign w:val="center"/>
+          </w:tcPr>
+          <w:p>
+            <w:pPr>
+              <w:spacing w:before="20" w:after="20"/>
+            </w:pPr>
+            <w:r>
+              <w:rPr>
+                <w:rFonts w:ascii="Arial" w:hAnsi="Arial" w:eastAsia="Arial"/>
+                <w:color w:val="172033"/>
+                <w:sz w:val="13"/>
+              </w:rPr>
+              <w:t>Hito programado</w:t>
             </w:r>
           </w:p>
         </w:tc>
@@ -213,39 +4497,21 @@
         <w:pStyle w:val="Heading1"/>
       </w:pPr>
       <w:r>
-        <w:t>Organización por sprints</w:t>
+        <w:t>2. Dependencias principales</w:t>
       </w:r>
     </w:p>
     <w:p>
       <w:pPr>
-        <w:pStyle w:val="ListBullet"/>
+        <w:jc w:val="both"/>
       </w:pPr>
       <w:r>
-        <w:t>Sprint 1: definición del proyecto y documentación base.</w:t>
-      </w:r>
-    </w:p>
-    <w:p>
-      <w:pPr>
-        <w:pStyle w:val="ListBullet"/>
-      </w:pPr>
-      <w:r>
-        <w:t>Sprint 2: diseño UX/UI y estructura técnica.</w:t>
-      </w:r>
-    </w:p>
-    <w:p>
-      <w:pPr>
-        <w:pStyle w:val="ListBullet"/>
-      </w:pPr>
-      <w:r>
-        <w:t>Sprint 3: desarrollo de módulos principales.</w:t>
-      </w:r>
-    </w:p>
-    <w:p>
-      <w:pPr>
-        <w:pStyle w:val="ListBullet"/>
-      </w:pPr>
-      <w:r>
-        <w:t>Sprint 4: integración, pruebas y cierre.</w:t>
+        <w:rPr>
+          <w:rFonts w:ascii="Arial" w:hAnsi="Arial" w:eastAsia="Arial"/>
+          <w:i w:val="0"/>
+          <w:color w:val="172033"/>
+          <w:sz w:val="20"/>
+        </w:rPr>
+        <w:t>El diseño depende de la definición de requerimientos; la sincronización requiere una plataforma wearable compatible y servicios backend; los módulos de análisis requieren datos estructurados; y las pruebas dependen de que exista una versión ejecutable de los componentes que se pretenden evaluar. La documentación se mantiene como actividad transversal durante todo el periodo.</w:t>
       </w:r>
     </w:p>
     <w:p>
@@ -253,19 +4519,74 @@
         <w:pStyle w:val="Heading1"/>
       </w:pPr>
       <w:r>
-        <w:t>Cierre</w:t>
+        <w:t>3. Archivos del cronograma</w:t>
       </w:r>
     </w:p>
     <w:p>
+      <w:pPr>
+        <w:pStyle w:val="ListBullet"/>
+        <w:spacing w:after="50"/>
+        <w:ind w:left="312"/>
+      </w:pPr>
       <w:r>
-        <w:t>El cronograma permite controlar avances, priorizar entregables y reducir riesgos de retraso.</w:t>
+        <w:rPr>
+          <w:rFonts w:ascii="Arial" w:hAnsi="Arial" w:eastAsia="Arial"/>
+          <w:color w:val="172033"/>
+          <w:sz w:val="20"/>
+        </w:rPr>
+        <w:t>Cronograma_Gantt_VitalMindAI.xlsx: versión editable con detalle y vista Gantt.</w:t>
+      </w:r>
+    </w:p>
+    <w:p>
+      <w:pPr>
+        <w:pStyle w:val="ListBullet"/>
+        <w:spacing w:after="50"/>
+        <w:ind w:left="312"/>
+      </w:pPr>
+      <w:r>
+        <w:rPr>
+          <w:rFonts w:ascii="Arial" w:hAnsi="Arial" w:eastAsia="Arial"/>
+          <w:color w:val="172033"/>
+          <w:sz w:val="20"/>
+        </w:rPr>
+        <w:t>Diagrama_Gantt_VitalMindAI.png: vista visual del periodo.</w:t>
+      </w:r>
+    </w:p>
+    <w:p>
+      <w:pPr>
+        <w:pStyle w:val="ListBullet"/>
+        <w:spacing w:after="50"/>
+        <w:ind w:left="312"/>
+      </w:pPr>
+      <w:r>
+        <w:rPr>
+          <w:rFonts w:ascii="Arial" w:hAnsi="Arial" w:eastAsia="Arial"/>
+          <w:color w:val="172033"/>
+          <w:sz w:val="20"/>
+        </w:rPr>
+        <w:t>Diagrama_Gantt_VitalMindAI.pdf: versión para impresión.</w:t>
+      </w:r>
+    </w:p>
+    <w:p>
+      <w:pPr>
+        <w:pStyle w:val="ListBullet"/>
+        <w:spacing w:after="50"/>
+        <w:ind w:left="312"/>
+      </w:pPr>
+      <w:r>
+        <w:rPr>
+          <w:rFonts w:ascii="Arial" w:hAnsi="Arial" w:eastAsia="Arial"/>
+          <w:color w:val="172033"/>
+          <w:sz w:val="20"/>
+        </w:rPr>
+        <w:t>Diagrama_Gantt_VitalMindAI.md: versión Mermaid.</w:t>
       </w:r>
     </w:p>
     <w:sectPr>
       <w:headerReference w:type="default" r:id="rId9"/>
       <w:footerReference w:type="default" r:id="rId10"/>
-      <w:pgSz w:w="12240" w:h="15840"/>
-      <w:pgMar w:top="864" w:right="1008" w:bottom="864" w:left="1008" w:header="720" w:footer="720" w:gutter="0"/>
+      <w:pgSz w:w="11906" w:h="16838"/>
+      <w:pgMar w:top="1134" w:right="1247" w:bottom="1077" w:left="1247" w:header="720" w:footer="720" w:gutter="0"/>
       <w:cols w:space="720"/>
       <w:docGrid w:linePitch="360"/>
     </w:sectPr>
@@ -278,14 +4599,18 @@
   <w:p>
     <w:pPr>
       <w:pStyle w:val="Footer"/>
-      <w:jc w:val="center"/>
+      <w:jc w:val="right"/>
     </w:pPr>
     <w:r>
       <w:rPr>
-        <w:color w:val="64748B"/>
+        <w:rFonts w:ascii="Arial" w:hAnsi="Arial" w:eastAsia="Arial"/>
+        <w:color w:val="5B6472"/>
         <w:sz w:val="16"/>
       </w:rPr>
-      <w:t>Proyecto académico - Ingeniería en Desarrollo y Gestión de Software</w:t>
+      <w:t xml:space="preserve">Página </w:t>
+      <w:fldChar w:fldCharType="begin"/>
+      <w:instrText xml:space="preserve">PAGE</w:instrText>
+      <w:fldChar w:fldCharType="end"/>
     </w:r>
   </w:p>
 </w:ftr>
@@ -300,10 +4625,12 @@
     </w:pPr>
     <w:r>
       <w:rPr>
-        <w:color w:val="64748B"/>
+        <w:rFonts w:ascii="Arial" w:hAnsi="Arial" w:eastAsia="Arial"/>
+        <w:b/>
+        <w:color w:val="5B6472"/>
         <w:sz w:val="16"/>
       </w:rPr>
-      <w:t>VitalMind AI | Documentación del Proyecto</w:t>
+      <w:t>NeuroviaLabs  |  VitalMind AI</w:t>
     </w:r>
   </w:p>
 </w:hdr>
@@ -672,9 +4999,12 @@
     <w:name w:val="Normal"/>
     <w:qFormat/>
     <w:rsid w:val="00FC693F"/>
+    <w:pPr>
+      <w:spacing w:after="100" w:line="269" w:lineRule="auto"/>
+    </w:pPr>
     <w:rPr>
-      <w:rFonts w:ascii="Aptos" w:hAnsi="Aptos" w:eastAsia="Aptos"/>
-      <w:sz w:val="21"/>
+      <w:rFonts w:ascii="Arial" w:hAnsi="Arial" w:eastAsia="Arial"/>
+      <w:sz w:val="20"/>
     </w:rPr>
   </w:style>
   <w:style w:type="paragraph" w:styleId="Header">
@@ -732,15 +5062,15 @@
     <w:pPr>
       <w:keepNext/>
       <w:keepLines/>
-      <w:spacing w:before="480" w:after="0"/>
+      <w:spacing w:before="160" w:after="80"/>
       <w:outlineLvl w:val="0"/>
     </w:pPr>
     <w:rPr>
-      <w:rFonts w:asciiTheme="majorHAnsi" w:eastAsiaTheme="majorEastAsia" w:hAnsiTheme="majorHAnsi" w:cstheme="majorBidi" w:ascii="Aptos Display" w:hAnsi="Aptos Display" w:eastAsia="Aptos Display"/>
+      <w:rFonts w:asciiTheme="majorHAnsi" w:eastAsiaTheme="majorEastAsia" w:hAnsiTheme="majorHAnsi" w:cstheme="majorBidi" w:ascii="Arial" w:hAnsi="Arial" w:eastAsia="Arial"/>
       <w:b/>
       <w:bCs/>
-      <w:color w:val="0F766E"/>
-      <w:sz w:val="28"/>
+      <w:color w:val="0B1F5E"/>
+      <w:sz w:val="30"/>
       <w:szCs w:val="28"/>
     </w:rPr>
   </w:style>
@@ -756,14 +5086,14 @@
     <w:pPr>
       <w:keepNext/>
       <w:keepLines/>
-      <w:spacing w:before="200" w:after="0"/>
+      <w:spacing w:before="160" w:after="80"/>
       <w:outlineLvl w:val="1"/>
     </w:pPr>
     <w:rPr>
-      <w:rFonts w:asciiTheme="majorHAnsi" w:eastAsiaTheme="majorEastAsia" w:hAnsiTheme="majorHAnsi" w:cstheme="majorBidi" w:ascii="Aptos Display" w:hAnsi="Aptos Display" w:eastAsia="Aptos Display"/>
+      <w:rFonts w:asciiTheme="majorHAnsi" w:eastAsiaTheme="majorEastAsia" w:hAnsiTheme="majorHAnsi" w:cstheme="majorBidi" w:ascii="Arial" w:hAnsi="Arial" w:eastAsia="Arial"/>
       <w:b/>
       <w:bCs/>
-      <w:color w:val="134E4A"/>
+      <w:color w:val="1746A2"/>
       <w:sz w:val="24"/>
       <w:szCs w:val="26"/>
     </w:rPr>
@@ -780,14 +5110,15 @@
     <w:pPr>
       <w:keepNext/>
       <w:keepLines/>
-      <w:spacing w:before="200" w:after="0"/>
+      <w:spacing w:before="160" w:after="80"/>
       <w:outlineLvl w:val="2"/>
     </w:pPr>
     <w:rPr>
-      <w:rFonts w:asciiTheme="majorHAnsi" w:eastAsiaTheme="majorEastAsia" w:hAnsiTheme="majorHAnsi" w:cstheme="majorBidi"/>
+      <w:rFonts w:asciiTheme="majorHAnsi" w:eastAsiaTheme="majorEastAsia" w:hAnsiTheme="majorHAnsi" w:cstheme="majorBidi" w:ascii="Arial" w:hAnsi="Arial" w:eastAsia="Arial"/>
       <w:b/>
       <w:bCs/>
-      <w:color w:val="4F81BD" w:themeColor="accent1"/>
+      <w:color w:val="5A19D6"/>
+      <w:sz w:val="21"/>
     </w:rPr>
   </w:style>
   <w:style w:type="paragraph" w:styleId="Heading4">
@@ -1021,15 +5352,16 @@
       <w:pBdr>
         <w:bottom w:val="single" w:sz="8" w:space="4" w:color="4F81BD" w:themeColor="accent1"/>
       </w:pBdr>
-      <w:spacing w:after="300" w:line="240" w:lineRule="auto"/>
+      <w:spacing w:after="80" w:line="240" w:lineRule="auto" w:before="160"/>
       <w:contextualSpacing/>
     </w:pPr>
     <w:rPr>
-      <w:rFonts w:asciiTheme="majorHAnsi" w:eastAsiaTheme="majorEastAsia" w:hAnsiTheme="majorHAnsi" w:cstheme="majorBidi" w:ascii="Aptos Display" w:hAnsi="Aptos Display" w:eastAsia="Aptos Display"/>
-      <w:color w:val="0F3A5A"/>
+      <w:rFonts w:asciiTheme="majorHAnsi" w:eastAsiaTheme="majorEastAsia" w:hAnsiTheme="majorHAnsi" w:cstheme="majorBidi" w:ascii="Arial" w:hAnsi="Arial" w:eastAsia="Arial"/>
+      <w:b/>
+      <w:color w:val="0B1F5E"/>
       <w:spacing w:val="5"/>
       <w:kern w:val="28"/>
-      <w:sz w:val="36"/>
+      <w:sz w:val="44"/>
       <w:szCs w:val="52"/>
     </w:rPr>
   </w:style>

</xml_diff>